<commit_message>
Re-render RPE_Paper.docx with the full revision
Journal-format DOCX now includes all 14 reviewer-response edits
(previous docx was stale, rendered before the R1.2/R2.2/R2.6/R2.8/R2.9
batch and blocked by a file lock on later attempts).

Co-Authored-By: Claude Opus 4.8 <noreply@anthropic.com>
</commit_message>
<xml_diff>
--- a/RPE_Paper.docx
+++ b/RPE_Paper.docx
@@ -12,14 +12,6 @@
     </w:p>
     <w:p>
       <w:pPr>
-        <w:pStyle w:val="Subtitle"/>
-      </w:pPr>
-      <w:r>
-        <w:t xml:space="preserve">Lessons from Brighton and Hove</w:t>
-      </w:r>
-    </w:p>
-    <w:p>
-      <w:pPr>
         <w:pStyle w:val="Author"/>
       </w:pPr>
       <w:r>
@@ -63,7 +55,7 @@
         <w:pStyle w:val="Abstract"/>
       </w:pPr>
       <w:r>
-        <w:t xml:space="preserve">The UK government’s 2026 White Paper targets halving the disadvantage attainment gap. Achieving this requires local education authorities to understand the drivers of attainment in their areas, but challenges in evidence synthesis and locally relevant data analytics mean the risk of pulling the wrong policy lever is high. Using linear mixed-effects models fitted to 4-years of DfE data, we show school-level Attainment 8 is highly predictable. Focusing on Brighton and Hove, where 2024 secondary admissions changes were premised on the idea that disadvantaged student attainment could be improved through even more social mixing in the school system, our analysis suggests that through omitted variables, non-linearities and counter-intuitive relationships, the policy is unlikely to deliver the targeted gains, while the wider literature on long school commutes points to social and educational costs not adequately considered. The city has the second-worst absence rate in England, and our modelling indicates improving attendance would be the most impactful single policy lever, particularly for disadvantaged pupils. We also introduce a school-level value-added view that lets parents and policy makers assess how a school performs above its inherited intake characteristics, and a policy simulator tool to bridge the gap between open data and accessible, contextualised intelligence.</w:t>
+        <w:t xml:space="preserve">The UK government’s 2026 White Paper targets halving the disadvantage attainment gap. Achieving this requires local education authorities to understand the drivers of attainment in their areas, but challenges in evidence synthesis and locally relevant data analytics mean the risk of pulling the wrong policy lever is high. Using linear mixed-effects models fitted to 4-years of DfE data, we show school-level Attainment 8 is highly predictable. Focusing on Brighton and Hove, where 2024 secondary admissions changes were premised on the idea that disadvantaged student attainment could be improved through even more social mixing in the school system, our analysis suggests that through omitted variables, non-linearities and counter-intuitive relationships, the policy is unlikely to deliver the targeted gains, while the wider literature on long school commutes points to social and educational costs not adequately considered. The city has the second-worst absence rate in England in 2024-25 (and among the worst throughout the period), and our modelling indicates improving attendance would be the most impactful single policy lever, particularly for disadvantaged pupils. We also introduce a school-level value-added view that lets parents and policy makers assess how a school performs above its inherited intake characteristics, and a policy simulator tool to bridge the gap between open data and accessible, contextualised intelligence.</w:t>
       </w:r>
     </w:p>
     <w:bookmarkStart w:id="22" w:name="introduction"/>
@@ -113,7 +105,7 @@
         <w:t xml:space="preserve"> </w:t>
       </w:r>
       <w:r>
-        <w:t xml:space="preserve">sets ambitious targets including halving the disadvantage attainment gap, improving attendance, reforming admissions and tackling place-based disadvantage. These ambitions will require local education authorities (LEAs) to understand the specific drivers of attainment in their areas and choose interventions accordingly.</w:t>
+        <w:t xml:space="preserve">sets ambitious targets including halving the disadvantage attainment gap, improving attendance, reforming admissions and tackling place-based disadvantage. These ambitions will require local education authorities (LEAs) to understand the specific drivers in their areas and choose interventions accordingly.</w:t>
       </w:r>
     </w:p>
     <w:p>
@@ -158,7 +150,20 @@
         <w:pStyle w:val="BodyText"/>
       </w:pPr>
       <w:r>
-        <w:t xml:space="preserve">Raw data on the attainment gap, without context, was presented to the city alongside statements correlating concentrations of disadvantage with lower attainment. The gap was framed as a unique failure requiring urgent action; the second-order impacts of the proposed interventions — longer school journeys, displacement from local communities, effects on well-being — were not scrutinised in depth. Our modelling addresses a critical blind spot in local decision-making: without the ability to account for structural factors like absence and prior attainment, councillors and citizens were unaware that Brighton and Hove was already among the highest-performing LEAs nationally for taking students beyond those factors — ranking 7th out of 152 for disadvantaged pupils and 5th for non-disadvantaged pupils. These insights come from the analysis of open data presented in this paper and carried out after the consultation had closed. However, with more timely analysis and with this knowledge, the approach to improving outcomes for disadvantaged pupils in the city could have been more effective and different questions asked:</w:t>
+        <w:t xml:space="preserve">Raw data on the attainment gap, without context, was presented to the city alongside statements correlating concentrations of disadvantage with lower attainment. The gap was framed as a unique failure requiring urgent action; the second-order impacts of the proposed interventions — longer school journeys, displacement from local communities, effects on well-being — were not scrutinised in depth. Our modelling addresses a critical blind spot in local decision-making: without the ability to account for structural factors like absence and prior attainment, councillors and citizens were unaware that,</w:t>
+      </w:r>
+      <w:r>
+        <w:t xml:space="preserve"> </w:t>
+      </w:r>
+      <w:r>
+        <w:rPr>
+          <w:i/>
+          <w:iCs/>
+        </w:rPr>
+        <w:t xml:space="preserve">after controlling for absence in particular</w:t>
+      </w:r>
+      <w:r>
+        <w:t xml:space="preserve">, Brighton and Hove was already among the highest-performing LEAs nationally for taking students beyond those factors — ranking 7th of 151 for disadvantaged pupils and 5th for non-disadvantaged pupils. As we show later, that conditional ranking is itself a measure of how much the city’s severe absence problem is costing its disadvantaged pupils: set absence aside and the schools look exceptional; leave it in the ledger and the city is ordinary. These insights come from the analysis of open data presented in this paper and carried out after the consultation had closed. However, with more timely analysis and with this knowledge, the approach to improving outcomes for disadvantaged pupils in the city could have been more effective and different questions asked:</w:t>
       </w:r>
       <w:r>
         <w:t xml:space="preserve"> </w:t>
@@ -302,7 +307,34 @@
         <w:t xml:space="preserve"> </w:t>
       </w:r>
       <w:r>
-        <w:t xml:space="preserve">which has remained stubbornly persistent for many years and that the recent government white paper has resolved to try and tackle. The size of the gap and the reasons behind it are complex and vary from place to place, but its existence has spawned large volumes of literature delving into disadvantage and attainment.</w:t>
+        <w:t xml:space="preserve">which has remained stubbornly persistent for many years and that the recent government white paper has resolved to try and tackle. The size of the gap and the reasons behind it are complex and vary from place to place, but its existence has spawned large volumes of literature delving into disadvantage and attainment (for wider reviews and evidence syntheses, see e.g.</w:t>
+      </w:r>
+      <w:r>
+        <w:t xml:space="preserve"> </w:t>
+      </w:r>
+      <w:r>
+        <w:t xml:space="preserve">Stopforth and Gayle (2025)</w:t>
+      </w:r>
+      <w:r>
+        <w:t xml:space="preserve">;</w:t>
+      </w:r>
+      <w:r>
+        <w:t xml:space="preserve"> </w:t>
+      </w:r>
+      <w:r>
+        <w:t xml:space="preserve">Macleod et al. (2015)</w:t>
+      </w:r>
+      <w:r>
+        <w:t xml:space="preserve">;</w:t>
+      </w:r>
+      <w:r>
+        <w:t xml:space="preserve"> </w:t>
+      </w:r>
+      <w:r>
+        <w:t xml:space="preserve">Tuckett et al. (2023)</w:t>
+      </w:r>
+      <w:r>
+        <w:t xml:space="preserve">).</w:t>
       </w:r>
     </w:p>
     <w:p>
@@ -470,6 +502,39 @@
         <w:t xml:space="preserve">. This compounds the challenge of disentangling school-level from pupil-level effects.</w:t>
       </w:r>
     </w:p>
+    <w:p>
+      <w:pPr>
+        <w:pStyle w:val="BodyText"/>
+      </w:pPr>
+      <w:r>
+        <w:t xml:space="preserve">How far attendance is amenable to</w:t>
+      </w:r>
+      <w:r>
+        <w:t xml:space="preserve"> </w:t>
+      </w:r>
+      <w:r>
+        <w:rPr>
+          <w:i/>
+          <w:iCs/>
+        </w:rPr>
+        <w:t xml:space="preserve">school-level</w:t>
+      </w:r>
+      <w:r>
+        <w:t xml:space="preserve"> </w:t>
+      </w:r>
+      <w:r>
+        <w:t xml:space="preserve">action is an important and under-settled question. Some of the variation reflects school practice — pastoral systems, attendance follow-up and ethos — but a substantial share is driven by circumstances beyond the school gate: family poverty, physical and mental ill-health, special educational needs, caring responsibilities, and the broader adversities that depress attainment through multiple channels</w:t>
+      </w:r>
+      <w:r>
+        <w:t xml:space="preserve"> </w:t>
+      </w:r>
+      <w:r>
+        <w:t xml:space="preserve">(Houtepen et al. 2020; Rakesh et al. 2025)</w:t>
+      </w:r>
+      <w:r>
+        <w:t xml:space="preserve">. The steep, largely exogenous rise in absence since the pandemic underlines how much of the recent problem sits outside any individual school’s control. This distinction — between the intake-driven component of absence and the smaller portion a school can itself move — is central to how absence should be interpreted as a policy lever, and we make it explicit in our modelling in §5.5. It also implies that authority-wide improvement is unlikely to come from school-led practice-sharing alone, and more probably requires cross-departmental action spanning health, children’s services and family support alongside schools.</w:t>
+      </w:r>
+    </w:p>
     <w:bookmarkEnd w:id="26"/>
     <w:bookmarkStart w:id="27" w:name="other-factors"/>
     <w:p>
@@ -541,7 +606,7 @@
         <w:t xml:space="preserve"> </w:t>
       </w:r>
       <w:r>
-        <w:t xml:space="preserve">Simon Burgess et al. (2018)</w:t>
+        <w:t xml:space="preserve">Burgess et al. (2018)</w:t>
       </w:r>
       <w:r>
         <w:t xml:space="preserve"> </w:t>
@@ -570,7 +635,7 @@
         <w:t xml:space="preserve"> </w:t>
       </w:r>
       <w:r>
-        <w:t xml:space="preserve">(Simon Burgess et al. 2023; S. Burgess et al. 2022)</w:t>
+        <w:t xml:space="preserve">(Burgess et al. 2023)</w:t>
       </w:r>
       <w:r>
         <w:t xml:space="preserve">, and teacher retention</w:t>
@@ -726,7 +791,23 @@
         <w:t xml:space="preserve"> </w:t>
       </w:r>
       <w:r>
-        <w:t xml:space="preserve">white paper. We have selected Attainment 8 over Progress 8 as we want to assess the influence and interaction variables like prior attainment on other predictor variables, not just as a partial outcome. Because the outcome is on the log scale, coefficients for log-transformed predictors represent elasticities.</w:t>
+        <w:t xml:space="preserve">white paper. We have selected Attainment 8 over Progress 8 as we want to assess the influence and interaction variables like prior attainment on other predictor variables, not just as a partial outcome. Because the outcome is on the log scale, coefficients for log-transformed predictors represent elasticities. We should be clear that the log transformation is</w:t>
+      </w:r>
+      <w:r>
+        <w:t xml:space="preserve"> </w:t>
+      </w:r>
+      <w:r>
+        <w:rPr>
+          <w:i/>
+          <w:iCs/>
+        </w:rPr>
+        <w:t xml:space="preserve">not</w:t>
+      </w:r>
+      <w:r>
+        <w:t xml:space="preserve"> </w:t>
+      </w:r>
+      <w:r>
+        <w:t xml:space="preserve">applied uniformly to every predictor: only the four skewed, strictly-positive count-and-rate variables — the disadvantage, absence and EAL percentages and teacher sickness days — enter in logged form, chosen on the basis of fit and the interpretability of elasticities. The remaining predictors, including the low-prior-attainment percentage, the segregation index and the workforce proportions, enter linearly. This variable-by-variable choice, together with supporting diagnostics (component-plus-residual plots and a comparison of logged, linear and spline treatments), is documented in the supplementary material; the log form is retained where it both improves fit and yields a policy-legible elasticity, and a linear form is used otherwise.</w:t>
       </w:r>
     </w:p>
     <w:p>
@@ -1077,6 +1158,79 @@
         <w:pStyle w:val="BodyText"/>
       </w:pPr>
       <w:r>
+        <w:t xml:space="preserve">The selective-admissions variable is the DfE’s own performance-tables admissions classification, and within our state-funded sample it distinguishes three groups: wholly</w:t>
+      </w:r>
+      <w:r>
+        <w:t xml:space="preserve"> </w:t>
+      </w:r>
+      <w:r>
+        <w:rPr>
+          <w:i/>
+          <w:iCs/>
+        </w:rPr>
+        <w:t xml:space="preserve">selective</w:t>
+      </w:r>
+      <w:r>
+        <w:t xml:space="preserve"> </w:t>
+      </w:r>
+      <w:r>
+        <w:t xml:space="preserve">state grammar schools that admit by an entrance test (166 schools, 4.8% of the sample); non-selective schools located in otherwise selective areas (234 schools, the reference category); and all other non-selective schools (the remaining ~88%). The estimate we report is therefore the effect of</w:t>
+      </w:r>
+      <w:r>
+        <w:t xml:space="preserve"> </w:t>
+      </w:r>
+      <w:r>
+        <w:rPr>
+          <w:i/>
+          <w:iCs/>
+        </w:rPr>
+        <w:t xml:space="preserve">full</w:t>
+      </w:r>
+      <w:r>
+        <w:t xml:space="preserve"> </w:t>
+      </w:r>
+      <w:r>
+        <w:t xml:space="preserve">academic selection, benchmarked against non-selective schools whose intakes are shaped by the same local grammar systems. It does not capture partial selection, banding, aptitude-based selection or faith-based oversubscription criteria, all of which fall within the</w:t>
+      </w:r>
+      <w:r>
+        <w:t xml:space="preserve"> </w:t>
+      </w:r>
+      <w:r>
+        <w:t xml:space="preserve">‘other non-selective’</w:t>
+      </w:r>
+      <w:r>
+        <w:t xml:space="preserve"> </w:t>
+      </w:r>
+      <w:r>
+        <w:t xml:space="preserve">category and are consequently unmeasured here; faith schools in particular are not separately identified in the main model.</w:t>
+      </w:r>
+    </w:p>
+    <w:p>
+      <w:pPr>
+        <w:pStyle w:val="BodyText"/>
+      </w:pPr>
+      <w:r>
+        <w:t xml:space="preserve">Two points on the prior-attainment control deserve emphasis. First, we control for prior attainment using the</w:t>
+      </w:r>
+      <w:r>
+        <w:t xml:space="preserve"> </w:t>
+      </w:r>
+      <w:r>
+        <w:rPr>
+          <w:i/>
+          <w:iCs/>
+        </w:rPr>
+        <w:t xml:space="preserve">percentage of KS4 pupils with low KS2 prior attainment</w:t>
+      </w:r>
+      <w:r>
+        <w:t xml:space="preserve">, rather than the mean KS2 scaled score. This is a data-availability constraint, not a preference: the DfE publishes school-level mean KS2 score (and the middle and high prior-attainment bands) for only three of our four years — it is not released for 2024-25 — so the low-prior-attainment share is the only prior-attainment measure spanning the full panel, and we use it to preserve the most recent and policy-relevant cohort. As a robustness check, we refit the models on the three-year sub-sample where the richer measures exist, adding mean KS2 scaled score; the absence coefficient — the paper’s central quantity — is essentially unchanged (a shift of under 3%), while the FSM coefficient attenuates by around a third, reinforcing rather than weakening our finding that concentration of disadvantage is a comparatively weak lever (supplementary material). Second, because we lack pupil-level data, prior attainment is corrected only at the school level; this is a coarser adjustment than a pupil-and-school-level correction would provide, and some residual confounding of the intake coefficients cannot be ruled out. We return to this limitation in §6.7.</w:t>
+      </w:r>
+    </w:p>
+    <w:p>
+      <w:pPr>
+        <w:pStyle w:val="BodyText"/>
+      </w:pPr>
+      <w:r>
         <w:t xml:space="preserve">We fit separate models for overall Attainment 8, disadvantaged-pupil Attainment 8, and non-disadvantaged-pupil Attainment 8, as both panel models (all four years) and individual year models. Models were estimated using the</w:t>
       </w:r>
       <w:r>
@@ -1141,10 +1295,13 @@
         <w:t xml:space="preserve">Nakagawa et al. (2017)</w:t>
       </w:r>
       <w:r>
-        <w:t xml:space="preserve"> </w:t>
-      </w:r>
-      <w:r>
-        <w:t xml:space="preserve">to general to calculate indicative</w:t>
+        <w:t xml:space="preserve">Nakagawa et al. (2017)</w:t>
+      </w:r>
+      <w:r>
+        <w:t xml:space="preserve"> </w:t>
+      </w:r>
+      <w:r>
+        <w:t xml:space="preserve">to calculate indicative</w:t>
       </w:r>
       <w:r>
         <w:t xml:space="preserve"> </w:t>
@@ -3926,6 +4083,78 @@
         <w:pStyle w:val="BodyText"/>
       </w:pPr>
       <w:r>
+        <w:t xml:space="preserve">Ofsted rating has only four ordered categories, fewer than would ordinarily be modelled as a random effect. We include it as a grouping factor for partial pooling and consistency with the other contextual groupings, but we have verified that treating it instead as a categorical fixed effect leaves every other coefficient unchanged to three or four significant figures and does not move Brighton and Hove’s rank (supplementary material). The fixed-effect form is also informative in its own right: relative to an</w:t>
+      </w:r>
+      <w:r>
+        <w:t xml:space="preserve"> </w:t>
+      </w:r>
+      <w:r>
+        <w:t xml:space="preserve">‘Outstanding’</w:t>
+      </w:r>
+      <w:r>
+        <w:t xml:space="preserve"> </w:t>
+      </w:r>
+      <w:r>
+        <w:t xml:space="preserve">school, and holding intake constant, a</w:t>
+      </w:r>
+      <w:r>
+        <w:t xml:space="preserve"> </w:t>
+      </w:r>
+      <w:r>
+        <w:t xml:space="preserve">‘Good’</w:t>
+      </w:r>
+      <w:r>
+        <w:t xml:space="preserve"> </w:t>
+      </w:r>
+      <w:r>
+        <w:t xml:space="preserve">rating is associated with roughly 2.2 fewer Attainment 8 points,</w:t>
+      </w:r>
+      <w:r>
+        <w:t xml:space="preserve"> </w:t>
+      </w:r>
+      <w:r>
+        <w:t xml:space="preserve">‘Requires Improvement’</w:t>
+      </w:r>
+      <w:r>
+        <w:t xml:space="preserve"> </w:t>
+      </w:r>
+      <w:r>
+        <w:t xml:space="preserve">with 4.2 fewer, and</w:t>
+      </w:r>
+      <w:r>
+        <w:t xml:space="preserve"> </w:t>
+      </w:r>
+      <w:r>
+        <w:t xml:space="preserve">‘Inadequate’</w:t>
+      </w:r>
+      <w:r>
+        <w:t xml:space="preserve"> </w:t>
+      </w:r>
+      <w:r>
+        <w:t xml:space="preserve">with 4.7 fewer — a scale that flattens markedly at the bottom, so that the gap between the two lowest ratings is small. We treat Ofsted as a contextual control rather than a causal factor throughout, since inspection judgements are formed with sight of a school’s results and are therefore partly an expression of attainment rather than an independent driver of it; consistent with this, omitting Ofsted entirely</w:t>
+      </w:r>
+      <w:r>
+        <w:t xml:space="preserve"> </w:t>
+      </w:r>
+      <w:r>
+        <w:rPr>
+          <w:i/>
+          <w:iCs/>
+        </w:rPr>
+        <w:t xml:space="preserve">increases</w:t>
+      </w:r>
+      <w:r>
+        <w:t xml:space="preserve"> </w:t>
+      </w:r>
+      <w:r>
+        <w:t xml:space="preserve">the estimated absence effect by 13–16%, so its inclusion makes our headline absence figure, if anything, conservative.</w:t>
+      </w:r>
+    </w:p>
+    <w:p>
+      <w:pPr>
+        <w:pStyle w:val="BodyText"/>
+      </w:pPr>
+      <w:r>
         <w:t xml:space="preserve">The Gorard Segregation Index is not statistically significant in Models 4 or 5. Once a school’s own FSM levels, attendance, prior attainment and geographic location are accounted for, the distribution of disadvantaged students across schools within an LEA adds no predictive power. Any harm that segregation causes is fully mediated by the variables already in the model. We include it because segregation arguments formed much of the justification for the Brighton and Hove admissions proposals.</w:t>
       </w:r>
     </w:p>
@@ -3934,7 +4163,18 @@
         <w:pStyle w:val="BodyText"/>
       </w:pPr>
       <w:r>
-        <w:t xml:space="preserve">A crucial feature of these models is that the log-transformed variables encode non-linear relationships. The same percentage-point change produces different effects depending on where a school starts. For concentrations of disadvantage, the relationship between FSM and attainment flattens above about 20% FSM — further increases in disadvantage do not correlate with noticeable further declines. Most of the strong effect appears below 15%, where further reductions are correlated with much steeper attainment increases. This non-linearity has direct policy consequences: individual LEAs need to consider carefully where each school sits on the distribution to appreciate what changes might realistically achieve.</w:t>
+        <w:t xml:space="preserve">A crucial feature of these models is that the log-transformed variables encode non-linear relationships. The same percentage-point change produces different effects depending on where a school starts. For concentrations of disadvantage, the relationship between FSM and attainment flattens above about 20% FSM — further increases in disadvantage do not correlate with noticeable further declines. Most of the strong effect appears below 15%, where further reductions are correlated with much steeper attainment increases. This non-linearity has direct policy consequences: individual LEAs need to consider carefully where each school sits on the distribution to appreciate what changes might realistically achieve. We make the practical magnitude concrete in §5.3 (</w:t>
+      </w:r>
+      <w:hyperlink w:anchor="fig-accelerating-returns">
+        <w:r>
+          <w:rPr>
+            <w:rStyle w:val="Hyperlink"/>
+          </w:rPr>
+          <w:t xml:space="preserve">Figure 4</w:t>
+        </w:r>
+      </w:hyperlink>
+      <w:r>
+        <w:t xml:space="preserve">), which translates the coefficients into the expected Attainment 8 gain from a one-percentage-point change at each point along the absence and disadvantage distributions.</w:t>
       </w:r>
     </w:p>
     <w:bookmarkEnd w:id="40"/>
@@ -4086,6 +4326,25 @@
       <w:pPr>
         <w:pStyle w:val="BodyText"/>
       </w:pPr>
+      <w:hyperlink w:anchor="fig-standardised-coefficients">
+        <w:r>
+          <w:rPr>
+            <w:rStyle w:val="Hyperlink"/>
+          </w:rPr>
+          <w:t xml:space="preserve">Figure 1</w:t>
+        </w:r>
+      </w:hyperlink>
+      <w:r>
+        <w:t xml:space="preserve"> </w:t>
+      </w:r>
+      <w:r>
+        <w:t xml:space="preserve">makes the relative importance of the predictors explicit, and the ordering is the central empirical message of the paper. School absence is the dominant lever by a clear margin; low prior attainment at KS2 is second; and the concentration of disadvantage — the variable around which the Brighton and Hove policy was built — is a distant contributor whose sign, as we discuss next, actually depends on the pupil group. Recognising this ordering matters, because a policy debate anchored on disadvantage concentration is, on this evidence, anchored on one of the weakest of the levers available.</w:t>
+      </w:r>
+    </w:p>
+    <w:p>
+      <w:pPr>
+        <w:pStyle w:val="BodyText"/>
+      </w:pPr>
       <w:r>
         <w:t xml:space="preserve">The most contentious finding in our analysis concerns concentrations of disadvantage (contentious in Brighton and Hove - although the findings echo the analysis of</w:t>
       </w:r>
@@ -4144,6 +4403,58 @@
       </w:r>
       <w:r>
         <w:t xml:space="preserve">— schools with higher FSM proportions in certain LEAs appear to have developed effective support systems, possibly through targeted use of Pupil Premium funding and other specialisations.</w:t>
+      </w:r>
+    </w:p>
+    <w:p>
+      <w:pPr>
+        <w:pStyle w:val="BodyText"/>
+      </w:pPr>
+      <w:r>
+        <w:t xml:space="preserve">We should be careful about the interpretation of this positive coefficient. One reading is that equivalent disadvantaged pupils do genuinely better in higher-concentration schools (</w:t>
+      </w:r>
+      <w:r>
+        <w:t xml:space="preserve">‘differing effects’</w:t>
+      </w:r>
+      <w:r>
+        <w:t xml:space="preserve">). But an alternative is that the FSM binary cannot distinguish the depth or duration of disadvantage, so the disadvantaged pupils in a 50%-FSM school may differ systematically from those in a 20%-FSM school in ways our aggregate measures do not capture (</w:t>
+      </w:r>
+      <w:r>
+        <w:t xml:space="preserve">‘differing pupils’</w:t>
+      </w:r>
+      <w:r>
+        <w:t xml:space="preserve">). We cannot adjudicate between these with school-level data, and we do not claim to. The consistency of the result across multiple operationalisations of both disadvantage and disadvantaged attainment makes a pure measurement artefact less likely, and the stronger positive association we observe on the vocational/technical component of Attainment 8 (supplementary material) is at least suggestive of a genuine specialisation mechanism rather than pure composition. But the composition interpretation cannot be excluded, and distinguishing the two would require pupil-level data with disadvantage histories. Importantly, our policy argument does not depend on which interpretation holds: under either, there is no evidence that concentrating disadvantaged pupils</w:t>
+      </w:r>
+      <w:r>
+        <w:t xml:space="preserve"> </w:t>
+      </w:r>
+      <w:r>
+        <w:rPr>
+          <w:i/>
+          <w:iCs/>
+        </w:rPr>
+        <w:t xml:space="preserve">harms</w:t>
+      </w:r>
+      <w:r>
+        <w:t xml:space="preserve"> </w:t>
+      </w:r>
+      <w:r>
+        <w:t xml:space="preserve">their attainment, and therefore no support for the premise that de-concentration would</w:t>
+      </w:r>
+      <w:r>
+        <w:t xml:space="preserve"> </w:t>
+      </w:r>
+      <w:r>
+        <w:rPr>
+          <w:i/>
+          <w:iCs/>
+        </w:rPr>
+        <w:t xml:space="preserve">improve</w:t>
+      </w:r>
+      <w:r>
+        <w:t xml:space="preserve"> </w:t>
+      </w:r>
+      <w:r>
+        <w:t xml:space="preserve">it.</w:t>
       </w:r>
     </w:p>
     <w:p>
@@ -4185,7 +4496,7 @@
     </w:p>
     <w:bookmarkEnd w:id="50"/>
     <w:bookmarkEnd w:id="51"/>
-    <w:bookmarkStart w:id="86" w:name="brighton-and-hove-case-study"/>
+    <w:bookmarkStart w:id="87" w:name="brighton-and-hove-case-study"/>
     <w:p>
       <w:pPr>
         <w:pStyle w:val="Heading1"/>
@@ -4493,7 +4804,7 @@
       </w:tr>
     </w:tbl>
     <w:bookmarkEnd w:id="63"/>
-    <w:bookmarkStart w:id="68" w:name="local-authority-effects"/>
+    <w:bookmarkStart w:id="69" w:name="local-authority-effects"/>
     <w:p>
       <w:pPr>
         <w:pStyle w:val="Heading2"/>
@@ -4597,58 +4908,96 @@
         <w:t xml:space="preserve"> </w:t>
       </w:r>
       <w:r>
-        <w:t xml:space="preserve">shows that Brighton and Hove ranks 7th out of 152 LEAs for disadvantaged attainment once structural factors are accounted for in the multilevel model presented earlier. For non-disadvantaged pupils it ranks 5th; for all pupils, 4th. The positive random intercept of approximately +0.06 translates to around a 6% uplift in Attainment 8 — roughly 2 GCSE points above what structural factors would predict. This was unknown at the time of the 2024 consultation and entirely absent from the public narrative, which was framed around a premise of failure, based on the raw attainment gap only.</w:t>
-      </w:r>
-    </w:p>
-    <w:bookmarkEnd w:id="68"/>
-    <w:bookmarkStart w:id="73" w:name="X2c44da290b91186546cdc06847184f26ab3e331"/>
-    <w:p>
-      <w:pPr>
-        <w:pStyle w:val="Heading2"/>
-      </w:pPr>
-      <w:r>
-        <w:t xml:space="preserve">5.3 Comparing policy levers: absence versus disadvantage</w:t>
-      </w:r>
-    </w:p>
-    <w:p>
-      <w:pPr>
-        <w:pStyle w:val="FirstParagraph"/>
-      </w:pPr>
-      <w:r>
-        <w:t xml:space="preserve">Because the model uses log-transformed variables, the same percentage-point change produces different effects depending on where a school starts — returns</w:t>
-      </w:r>
-      <w:r>
-        <w:t xml:space="preserve"> </w:t>
-      </w:r>
-      <w:r>
-        <w:rPr>
-          <w:i/>
-          <w:iCs/>
-        </w:rPr>
-        <w:t xml:space="preserve">accelerate</w:t>
-      </w:r>
-      <w:r>
-        <w:t xml:space="preserve"> </w:t>
-      </w:r>
-      <w:r>
-        <w:t xml:space="preserve">as values improve.</w:t>
-      </w:r>
-      <w:r>
-        <w:t xml:space="preserve"> </w:t>
-      </w:r>
-      <w:hyperlink w:anchor="fig-accelerating-returns">
+        <w:t xml:space="preserve">shows the local-authority random intercepts for disadvantaged-pupil attainment. Conditional on the structural factors in the model — including school absence — Brighton and Hove ranks</w:t>
+      </w:r>
+      <w:r>
+        <w:t xml:space="preserve"> </w:t>
+      </w:r>
+      <w:r>
+        <w:rPr>
+          <w:b/>
+          <w:bCs/>
+        </w:rPr>
+        <w:t xml:space="preserve">7th of 151</w:t>
+      </w:r>
+      <w:r>
+        <w:t xml:space="preserve"> </w:t>
+      </w:r>
+      <w:r>
+        <w:t xml:space="preserve">local authorities, a positive random intercept equivalent to roughly</w:t>
+      </w:r>
+      <w:r>
+        <w:t xml:space="preserve"> </w:t>
+      </w:r>
+      <w:r>
+        <w:rPr>
+          <w:b/>
+          <w:bCs/>
+        </w:rPr>
+        <w:t xml:space="preserve">+2 Attainment 8 points</w:t>
+      </w:r>
+      <w:r>
+        <w:t xml:space="preserve"> </w:t>
+      </w:r>
+      <w:r>
+        <w:t xml:space="preserve">above what those factors would predict. On the same conditional basis the city ranks 5th for non-disadvantaged pupils and 4th for all pupils. This was unknown at the time of the 2024 consultation and entirely absent from a public narrative framed around the raw attainment gap alone.</w:t>
+      </w:r>
+    </w:p>
+    <w:p>
+      <w:pPr>
+        <w:pStyle w:val="BodyText"/>
+      </w:pPr>
+      <w:r>
+        <w:t xml:space="preserve">That conditional ranking, however, depends on a modelling choice that turns out to carry most of the result. Controlling for absence estimates the city’s performance</w:t>
+      </w:r>
+      <w:r>
+        <w:t xml:space="preserve"> </w:t>
+      </w:r>
+      <w:r>
+        <w:rPr>
+          <w:i/>
+          <w:iCs/>
+        </w:rPr>
+        <w:t xml:space="preserve">given</w:t>
+      </w:r>
+      <w:r>
+        <w:t xml:space="preserve"> </w:t>
+      </w:r>
+      <w:r>
+        <w:t xml:space="preserve">the attendance its pupils actually record — and Brighton and Hove has among the worst attendance of any authority in England.</w:t>
+      </w:r>
+      <w:r>
+        <w:t xml:space="preserve"> </w:t>
+      </w:r>
+      <w:hyperlink w:anchor="tbl-la-absence">
         <w:r>
           <w:rPr>
             <w:rStyle w:val="Hyperlink"/>
           </w:rPr>
-          <w:t xml:space="preserve">Figure 4</w:t>
+          <w:t xml:space="preserve">Table 2</w:t>
         </w:r>
       </w:hyperlink>
       <w:r>
         <w:t xml:space="preserve"> </w:t>
       </w:r>
       <w:r>
-        <w:t xml:space="preserve">places both the absence and FSM levers on a common y-axis.</w:t>
+        <w:t xml:space="preserve">reports the disadvantaged-attainment effect with and without that control. Without any absence term, the city falls from 7th to</w:t>
+      </w:r>
+      <w:r>
+        <w:t xml:space="preserve"> </w:t>
+      </w:r>
+      <w:r>
+        <w:rPr>
+          <w:b/>
+          <w:bCs/>
+        </w:rPr>
+        <w:t xml:space="preserve">46th of 151</w:t>
+      </w:r>
+      <w:r>
+        <w:t xml:space="preserve"> </w:t>
+      </w:r>
+      <w:r>
+        <w:t xml:space="preserve">and its effect is no longer statistically distinguishable from the national average. The city’s apparent excellence for disadvantaged pupils is, in this precise sense, conditional on setting its attendance problem aside.</w:t>
       </w:r>
     </w:p>
     <w:tbl>
@@ -4664,7 +5013,432 @@
       <w:tr>
         <w:tc>
           <w:tcPr/>
-          <w:bookmarkStart w:id="72" w:name="fig-accelerating-returns"/>
+          <w:bookmarkStart w:id="68" w:name="tbl-la-absence"/>
+          <w:p>
+            <w:pPr>
+              <w:jc w:val="center"/>
+            </w:pPr>
+            <w:pPr>
+              <w:jc w:val="left"/>
+              <w:spacing w:before="200"/>
+              <w:pStyle w:val="ImageCaption"/>
+            </w:pPr>
+            <w:r>
+              <w:t xml:space="preserve">Table 2: Brighton and Hove’s local-authority effect for disadvantaged-pupil attainment, with and without a control for school absence. The intake-predicted specification controls only for the part of absence that intake predicts, leaving the city’s excess absence in the residual.</w:t>
+            </w:r>
+          </w:p>
+          <w:tbl>
+            <w:tblPr>
+              <w:tblStyle w:val="Table"/>
+              <w:tblW w:type="pct" w:w="5000"/>
+              <w:tblLayout w:type="fixed"/>
+              <w:tblLook w:firstRow="1" w:lastRow="0" w:firstColumn="0" w:lastColumn="0" w:noHBand="0" w:noVBand="0" w:val="0020"/>
+            </w:tblPr>
+            <w:tblGrid>
+              <w:gridCol w:w="3203"/>
+              <w:gridCol w:w="978"/>
+              <w:gridCol w:w="1423"/>
+              <w:gridCol w:w="1512"/>
+              <w:gridCol w:w="800"/>
+            </w:tblGrid>
+            <w:tr>
+              <w:trPr>
+                <w:tblHeader w:val="on"/>
+              </w:trPr>
+              <w:tc>
+                <w:tcPr/>
+                <w:p>
+                  <w:pPr>
+                    <w:pStyle w:val="Compact"/>
+                    <w:jc w:val="left"/>
+                    <w:jc w:val="center"/>
+                  </w:pPr>
+                  <w:r>
+                    <w:t xml:space="preserve">Specification</w:t>
+                  </w:r>
+                </w:p>
+              </w:tc>
+              <w:tc>
+                <w:tcPr/>
+                <w:p>
+                  <w:pPr>
+                    <w:pStyle w:val="Compact"/>
+                    <w:jc w:val="right"/>
+                    <w:jc w:val="center"/>
+                  </w:pPr>
+                  <w:r>
+                    <w:t xml:space="preserve">B&amp;H effect</w:t>
+                  </w:r>
+                </w:p>
+              </w:tc>
+              <w:tc>
+                <w:tcPr/>
+                <w:p>
+                  <w:pPr>
+                    <w:pStyle w:val="Compact"/>
+                    <w:jc w:val="right"/>
+                    <w:jc w:val="center"/>
+                  </w:pPr>
+                  <w:r>
+                    <w:t xml:space="preserve">95% CI</w:t>
+                  </w:r>
+                </w:p>
+              </w:tc>
+              <w:tc>
+                <w:tcPr/>
+                <w:p>
+                  <w:pPr>
+                    <w:pStyle w:val="Compact"/>
+                    <w:jc w:val="left"/>
+                    <w:jc w:val="center"/>
+                  </w:pPr>
+                  <w:r>
+                    <w:t xml:space="preserve">Rank</w:t>
+                  </w:r>
+                </w:p>
+              </w:tc>
+              <w:tc>
+                <w:tcPr/>
+                <w:p>
+                  <w:pPr>
+                    <w:pStyle w:val="Compact"/>
+                    <w:jc w:val="right"/>
+                    <w:jc w:val="center"/>
+                  </w:pPr>
+                  <w:r>
+                    <w:t xml:space="preserve">ATT8 pts</w:t>
+                  </w:r>
+                </w:p>
+              </w:tc>
+            </w:tr>
+            <w:tr>
+              <w:tc>
+                <w:tcPr/>
+                <w:p>
+                  <w:pPr>
+                    <w:pStyle w:val="Compact"/>
+                    <w:jc w:val="left"/>
+                    <w:jc w:val="center"/>
+                  </w:pPr>
+                  <w:r>
+                    <w:t xml:space="preserve">No absence control</w:t>
+                  </w:r>
+                </w:p>
+              </w:tc>
+              <w:tc>
+                <w:tcPr/>
+                <w:p>
+                  <w:pPr>
+                    <w:pStyle w:val="Compact"/>
+                    <w:jc w:val="right"/>
+                    <w:jc w:val="center"/>
+                  </w:pPr>
+                  <w:r>
+                    <w:t xml:space="preserve">+0.018</w:t>
+                  </w:r>
+                </w:p>
+              </w:tc>
+              <w:tc>
+                <w:tcPr/>
+                <w:p>
+                  <w:pPr>
+                    <w:pStyle w:val="Compact"/>
+                    <w:jc w:val="right"/>
+                    <w:jc w:val="center"/>
+                  </w:pPr>
+                  <w:r>
+                    <w:t xml:space="preserve">-0.022 to 0.058</w:t>
+                  </w:r>
+                </w:p>
+              </w:tc>
+              <w:tc>
+                <w:tcPr/>
+                <w:p>
+                  <w:pPr>
+                    <w:pStyle w:val="Compact"/>
+                    <w:jc w:val="left"/>
+                    <w:jc w:val="center"/>
+                  </w:pPr>
+                  <w:r>
+                    <w:t xml:space="preserve">46 of 151 (n.s.)</w:t>
+                  </w:r>
+                </w:p>
+              </w:tc>
+              <w:tc>
+                <w:tcPr/>
+                <w:p>
+                  <w:pPr>
+                    <w:pStyle w:val="Compact"/>
+                    <w:jc w:val="right"/>
+                    <w:jc w:val="center"/>
+                  </w:pPr>
+                  <w:r>
+                    <w:t xml:space="preserve">+0.7</w:t>
+                  </w:r>
+                </w:p>
+              </w:tc>
+            </w:tr>
+            <w:tr>
+              <w:tc>
+                <w:tcPr/>
+                <w:p>
+                  <w:pPr>
+                    <w:pStyle w:val="Compact"/>
+                    <w:jc w:val="left"/>
+                    <w:jc w:val="center"/>
+                  </w:pPr>
+                  <w:r>
+                    <w:t xml:space="preserve">Absence controlled (main model)</w:t>
+                  </w:r>
+                </w:p>
+              </w:tc>
+              <w:tc>
+                <w:tcPr/>
+                <w:p>
+                  <w:pPr>
+                    <w:pStyle w:val="Compact"/>
+                    <w:jc w:val="right"/>
+                    <w:jc w:val="center"/>
+                  </w:pPr>
+                  <w:r>
+                    <w:t xml:space="preserve">+0.050</w:t>
+                  </w:r>
+                </w:p>
+              </w:tc>
+              <w:tc>
+                <w:tcPr/>
+                <w:p>
+                  <w:pPr>
+                    <w:pStyle w:val="Compact"/>
+                    <w:jc w:val="right"/>
+                    <w:jc w:val="center"/>
+                  </w:pPr>
+                  <w:r>
+                    <w:t xml:space="preserve">0.015 to 0.086</w:t>
+                  </w:r>
+                </w:p>
+              </w:tc>
+              <w:tc>
+                <w:tcPr/>
+                <w:p>
+                  <w:pPr>
+                    <w:pStyle w:val="Compact"/>
+                    <w:jc w:val="left"/>
+                    <w:jc w:val="center"/>
+                  </w:pPr>
+                  <w:r>
+                    <w:t xml:space="preserve">7 of 151</w:t>
+                  </w:r>
+                </w:p>
+              </w:tc>
+              <w:tc>
+                <w:tcPr/>
+                <w:p>
+                  <w:pPr>
+                    <w:pStyle w:val="Compact"/>
+                    <w:jc w:val="right"/>
+                    <w:jc w:val="center"/>
+                  </w:pPr>
+                  <w:r>
+                    <w:t xml:space="preserve">+2.0</w:t>
+                  </w:r>
+                </w:p>
+              </w:tc>
+            </w:tr>
+            <w:tr>
+              <w:tc>
+                <w:tcPr/>
+                <w:p>
+                  <w:pPr>
+                    <w:pStyle w:val="Compact"/>
+                    <w:jc w:val="left"/>
+                    <w:jc w:val="center"/>
+                  </w:pPr>
+                  <w:r>
+                    <w:t xml:space="preserve">Intake-predicted absence controlled</w:t>
+                  </w:r>
+                </w:p>
+              </w:tc>
+              <w:tc>
+                <w:tcPr/>
+                <w:p>
+                  <w:pPr>
+                    <w:pStyle w:val="Compact"/>
+                    <w:jc w:val="right"/>
+                    <w:jc w:val="center"/>
+                  </w:pPr>
+                  <w:r>
+                    <w:t xml:space="preserve">+0.017</w:t>
+                  </w:r>
+                </w:p>
+              </w:tc>
+              <w:tc>
+                <w:tcPr/>
+                <w:p>
+                  <w:pPr>
+                    <w:pStyle w:val="Compact"/>
+                    <w:jc w:val="right"/>
+                    <w:jc w:val="center"/>
+                  </w:pPr>
+                  <w:r>
+                    <w:t xml:space="preserve">-0.023 to 0.057</w:t>
+                  </w:r>
+                </w:p>
+              </w:tc>
+              <w:tc>
+                <w:tcPr/>
+                <w:p>
+                  <w:pPr>
+                    <w:pStyle w:val="Compact"/>
+                    <w:jc w:val="left"/>
+                    <w:jc w:val="center"/>
+                  </w:pPr>
+                  <w:r>
+                    <w:t xml:space="preserve">45 of 151 (n.s.)</w:t>
+                  </w:r>
+                </w:p>
+              </w:tc>
+              <w:tc>
+                <w:tcPr/>
+                <w:p>
+                  <w:pPr>
+                    <w:pStyle w:val="Compact"/>
+                    <w:jc w:val="right"/>
+                    <w:jc w:val="center"/>
+                  </w:pPr>
+                  <w:r>
+                    <w:t xml:space="preserve">+0.7</w:t>
+                  </w:r>
+                </w:p>
+              </w:tc>
+            </w:tr>
+          </w:tbl>
+          <w:bookmarkEnd w:id="68"/>
+          <w:p/>
+        </w:tc>
+      </w:tr>
+    </w:tbl>
+    <w:p>
+      <w:pPr>
+        <w:pStyle w:val="BodyText"/>
+      </w:pPr>
+      <w:r>
+        <w:t xml:space="preserve">This is not an artefact peculiar to Brighton and Hove: controlling for absence reshuffles the whole distribution of local-authority effects, and 14 authorities that appear significantly above average once absence is controlled are indistinguishable from average without it. Absence does a great deal of work in any model of attainment, and where an authority sits on it materially changes how its schools appear to perform. But the shift is unusually consequential for Brighton and Hove precisely because its attendance is so extreme.</w:t>
+      </w:r>
+    </w:p>
+    <w:p>
+      <w:pPr>
+        <w:pStyle w:val="BodyText"/>
+      </w:pPr>
+      <w:r>
+        <w:t xml:space="preserve">We regard the distance between these two numbers as the finding, rather than either number alone. Conditional on the absence its pupils face, Brighton and Hove’s schools are among the best in England for disadvantaged attainment; unconditionally they are unremarkable.</w:t>
+      </w:r>
+      <w:r>
+        <w:t xml:space="preserve"> </w:t>
+      </w:r>
+      <w:r>
+        <w:rPr>
+          <w:b/>
+          <w:bCs/>
+        </w:rPr>
+        <w:t xml:space="preserve">The gap between the two — about 1.3 Attainment 8 points per disadvantaged pupil — is a direct measure of what the city’s attendance problem costs its most disadvantaged children.</w:t>
+      </w:r>
+      <w:r>
+        <w:t xml:space="preserve"> </w:t>
+      </w:r>
+      <w:r>
+        <w:t xml:space="preserve">It is not a reason to discount the schools’ underlying effectiveness; it is a reason to treat attendance as the single most valuable lever available to the city, a point we develop in §5.5 and quantify through the accelerating-returns analysis below. (For all pupils the city’s advantage is more robust to this choice, remaining significantly positive without an absence control at 46th; it is specifically the disadvantaged-pupil result that rests on it.)</w:t>
+      </w:r>
+    </w:p>
+    <w:p>
+      <w:pPr>
+        <w:pStyle w:val="BodyText"/>
+      </w:pPr>
+      <w:r>
+        <w:t xml:space="preserve">Two features of the city’s absence confirm that this is a local problem rather than an inevitability of its intake. First, Brighton and Hove’s disadvantage is unexceptional: its mean school-level free-school-meal rate (25.2%) is slightly</w:t>
+      </w:r>
+      <w:r>
+        <w:t xml:space="preserve"> </w:t>
+      </w:r>
+      <w:r>
+        <w:rPr>
+          <w:i/>
+          <w:iCs/>
+        </w:rPr>
+        <w:t xml:space="preserve">below</w:t>
+      </w:r>
+      <w:r>
+        <w:t xml:space="preserve"> </w:t>
+      </w:r>
+      <w:r>
+        <w:t xml:space="preserve">the national average (27.1%). When we model expected absence from intake alone (§5.5), the city’s schools should record about 8.8% absence; they actually record 10.8%. Almost two percentage points of absence sit above what the intake predicts. Second, the problem has not been improving. Between 2021–22 and 2024–25, absence fell in 94% of English local authorities — the national mean dropping by 0.88 percentage points as attendance recovered from the pandemic — while Brighton and Hove’s barely moved (-0.03 points), leaving it 143th of 152 authorities for improvement. The city did not become an outlier because its absence rose; it became an outlier because, almost alone, its absence did not fall.</w:t>
+      </w:r>
+    </w:p>
+    <w:bookmarkEnd w:id="69"/>
+    <w:bookmarkStart w:id="74" w:name="X2c44da290b91186546cdc06847184f26ab3e331"/>
+    <w:p>
+      <w:pPr>
+        <w:pStyle w:val="Heading2"/>
+      </w:pPr>
+      <w:r>
+        <w:t xml:space="preserve">5.3 Comparing policy levers: absence versus disadvantage</w:t>
+      </w:r>
+    </w:p>
+    <w:p>
+      <w:pPr>
+        <w:pStyle w:val="FirstParagraph"/>
+      </w:pPr>
+      <w:r>
+        <w:t xml:space="preserve">Because the model uses log-transformed variables, the same percentage-point change produces different effects depending on where a school starts — returns</w:t>
+      </w:r>
+      <w:r>
+        <w:t xml:space="preserve"> </w:t>
+      </w:r>
+      <w:r>
+        <w:rPr>
+          <w:i/>
+          <w:iCs/>
+        </w:rPr>
+        <w:t xml:space="preserve">accelerate</w:t>
+      </w:r>
+      <w:r>
+        <w:t xml:space="preserve"> </w:t>
+      </w:r>
+      <w:r>
+        <w:t xml:space="preserve">as values improve.</w:t>
+      </w:r>
+      <w:r>
+        <w:t xml:space="preserve"> </w:t>
+      </w:r>
+      <w:hyperlink w:anchor="fig-accelerating-returns">
+        <w:r>
+          <w:rPr>
+            <w:rStyle w:val="Hyperlink"/>
+          </w:rPr>
+          <w:t xml:space="preserve">Figure 4</w:t>
+        </w:r>
+      </w:hyperlink>
+      <w:r>
+        <w:t xml:space="preserve"> </w:t>
+      </w:r>
+      <w:r>
+        <w:t xml:space="preserve">places both the absence and FSM levers on a common y-axis.</w:t>
+      </w:r>
+    </w:p>
+    <w:tbl>
+      <w:tblPr>
+        <w:tblStyle w:val="Table"/>
+        <w:tblW w:type="pct" w:w="5000"/>
+        <w:tblLayout w:type="fixed"/>
+        <w:tblLook w:firstRow="0" w:lastRow="0" w:firstColumn="0" w:lastColumn="0" w:noHBand="0" w:noVBand="0" w:val="0000"/>
+      </w:tblPr>
+      <w:tblGrid>
+        <w:gridCol w:w="7920"/>
+      </w:tblGrid>
+      <w:tr>
+        <w:tc>
+          <w:tcPr/>
+          <w:bookmarkStart w:id="73" w:name="fig-accelerating-returns"/>
           <w:p>
             <w:pPr>
               <w:pStyle w:val="Compact"/>
@@ -4675,18 +5449,18 @@
                 <wp:inline>
                   <wp:extent cx="5943600" cy="3820885"/>
                   <wp:effectExtent b="0" l="0" r="0" t="0"/>
-                  <wp:docPr descr="" title="" id="70" name="Picture"/>
+                  <wp:docPr descr="" title="" id="71" name="Picture"/>
                   <a:graphic>
                     <a:graphicData uri="http://schemas.openxmlformats.org/drawingml/2006/picture">
                       <pic:pic>
                         <pic:nvPicPr>
-                          <pic:cNvPr descr="RPE_Paper_files/figure-docx/fig-accelerating-returns-1.png" id="71" name="Picture"/>
+                          <pic:cNvPr descr="RPE_Paper_files/figure-docx/fig-accelerating-returns-1.png" id="72" name="Picture"/>
                           <pic:cNvPicPr>
                             <a:picLocks noChangeArrowheads="1" noChangeAspect="1"/>
                           </pic:cNvPicPr>
                         </pic:nvPicPr>
                         <pic:blipFill>
-                          <a:blip r:embed="rId69"/>
+                          <a:blip r:embed="rId70"/>
                           <a:stretch>
                             <a:fillRect/>
                           </a:stretch>
@@ -4726,7 +5500,7 @@
               <w:t xml:space="preserve">Figure 4: Accelerating returns: each percentage-point reduction buys a progressively larger ATT8 gain (reading right to left). Absence delivers substantially larger gains than FSM at every level. Brighton and Hove schools marked on each curve.</w:t>
             </w:r>
           </w:p>
-          <w:bookmarkEnd w:id="72"/>
+          <w:bookmarkEnd w:id="73"/>
         </w:tc>
       </w:tr>
     </w:tbl>
@@ -4770,8 +5544,8 @@
         <w:t xml:space="preserve">Bringing schools above the national average for absence down to it would produce predicted gains averaging +2.9 Attainment 8 points per school, with gains for disadvantaged pupils averaging +3.3 points. Even dramatic FSM reductions would yield gains closer to 1 point. On the evidence, attendance is the single most consequential lever the city has available, and admissions changes of the kind proposed in 2024 are very unlikely to produce equivalent gains in disadvantaged attainment.</w:t>
       </w:r>
     </w:p>
-    <w:bookmarkEnd w:id="73"/>
-    <w:bookmarkStart w:id="78" w:name="contextualised-school-performance"/>
+    <w:bookmarkEnd w:id="74"/>
+    <w:bookmarkStart w:id="79" w:name="contextualised-school-performance"/>
     <w:p>
       <w:pPr>
         <w:pStyle w:val="Heading2"/>
@@ -4793,7 +5567,7 @@
       <w:tr>
         <w:tc>
           <w:tcPr/>
-          <w:bookmarkStart w:id="77" w:name="fig-obs-vs-pred"/>
+          <w:bookmarkStart w:id="78" w:name="fig-obs-vs-pred"/>
           <w:p>
             <w:pPr>
               <w:pStyle w:val="Compact"/>
@@ -4804,18 +5578,18 @@
                 <wp:inline>
                   <wp:extent cx="5943600" cy="7641771"/>
                   <wp:effectExtent b="0" l="0" r="0" t="0"/>
-                  <wp:docPr descr="" title="" id="75" name="Picture"/>
+                  <wp:docPr descr="" title="" id="76" name="Picture"/>
                   <a:graphic>
                     <a:graphicData uri="http://schemas.openxmlformats.org/drawingml/2006/picture">
                       <pic:pic>
                         <pic:nvPicPr>
-                          <pic:cNvPr descr="RPE_Paper_files/figure-docx/fig-obs-vs-pred-1.png" id="76" name="Picture"/>
+                          <pic:cNvPr descr="RPE_Paper_files/figure-docx/fig-obs-vs-pred-1.png" id="77" name="Picture"/>
                           <pic:cNvPicPr>
                             <a:picLocks noChangeArrowheads="1" noChangeAspect="1"/>
                           </pic:cNvPicPr>
                         </pic:nvPicPr>
                         <pic:blipFill>
-                          <a:blip r:embed="rId74"/>
+                          <a:blip r:embed="rId75"/>
                           <a:stretch>
                             <a:fillRect/>
                           </a:stretch>
@@ -4855,7 +5629,7 @@
               <w:t xml:space="preserve">Figure 5: Observed versus predicted Attainment 8 for Brighton and Hove schools (highlighted) against all schools nationally, 2024–25.</w:t>
             </w:r>
           </w:p>
-          <w:bookmarkEnd w:id="77"/>
+          <w:bookmarkEnd w:id="78"/>
         </w:tc>
       </w:tr>
     </w:tbl>
@@ -4913,8 +5687,8 @@
         <w:t xml:space="preserve">measures - more nuanced than Progress 8 - as this model-based value added accounts for far more than just prior attainment in its representation.</w:t>
       </w:r>
     </w:p>
-    <w:bookmarkEnd w:id="78"/>
-    <w:bookmarkStart w:id="85" w:name="X8ff19f05081feb947c9bfda17930b607e81aacb"/>
+    <w:bookmarkEnd w:id="79"/>
+    <w:bookmarkStart w:id="86" w:name="X8ff19f05081feb947c9bfda17930b607e81aacb"/>
     <w:p>
       <w:pPr>
         <w:pStyle w:val="Heading2"/>
@@ -4986,7 +5760,7 @@
         <w:rPr>
           <w:rStyle w:val="FootnoteReference"/>
         </w:rPr>
-        <w:footnoteReference w:id="79"/>
+        <w:footnoteReference w:id="80"/>
       </w:r>
       <w:r>
         <w:t xml:space="preserve"> </w:t>
@@ -5064,7 +5838,7 @@
       <w:tr>
         <w:tc>
           <w:tcPr/>
-          <w:bookmarkStart w:id="84" w:name="fig-quadrant"/>
+          <w:bookmarkStart w:id="85" w:name="fig-quadrant"/>
           <w:p>
             <w:pPr>
               <w:pStyle w:val="Compact"/>
@@ -5075,18 +5849,18 @@
                 <wp:inline>
                   <wp:extent cx="5943600" cy="4245428"/>
                   <wp:effectExtent b="0" l="0" r="0" t="0"/>
-                  <wp:docPr descr="" title="" id="82" name="Picture"/>
+                  <wp:docPr descr="" title="" id="83" name="Picture"/>
                   <a:graphic>
                     <a:graphicData uri="http://schemas.openxmlformats.org/drawingml/2006/picture">
                       <pic:pic>
                         <pic:nvPicPr>
-                          <pic:cNvPr descr="RPE_Paper_files/figure-docx/fig-quadrant-1.png" id="83" name="Picture"/>
+                          <pic:cNvPr descr="RPE_Paper_files/figure-docx/fig-quadrant-1.png" id="84" name="Picture"/>
                           <pic:cNvPicPr>
                             <a:picLocks noChangeArrowheads="1" noChangeAspect="1"/>
                           </pic:cNvPicPr>
                         </pic:nvPicPr>
                         <pic:blipFill>
-                          <a:blip r:embed="rId81"/>
+                          <a:blip r:embed="rId82"/>
                           <a:stretch>
                             <a:fillRect/>
                           </a:stretch>
@@ -5126,7 +5900,7 @@
               <w:t xml:space="preserve">Figure 6: Brighton and Hove secondaries on the joint-signal plane: contextualised value-added (vertical, in Attainment 8 points) versus the school-controllable absence component (horizontal, in percentage points). The reference lines at zero on each axis split the plane into four narrative quadrants discussed in the text. The full national version with a local-authority filter is available interactively in the project’s HTML report.</w:t>
             </w:r>
           </w:p>
-          <w:bookmarkEnd w:id="84"/>
+          <w:bookmarkEnd w:id="85"/>
         </w:tc>
       </w:tr>
     </w:tbl>
@@ -5135,7 +5909,7 @@
         <w:pStyle w:val="BodyText"/>
       </w:pPr>
       <w:r>
-        <w:t xml:space="preserve">For local school-level diagnostics the decomposition becomes considerably more informative. Two signals can now be read side by side: the school’s contextualised value-added, and its residual absence (positive when the school runs more absence than its intake would predict, negative when less). Sorted on these two axes (</w:t>
+        <w:t xml:space="preserve">For local school-level diagnostics the decomposition becomes considerably more informative. Two signals can now be read side by side: the school’s contextualised value-added, and its residual absence (positive when the school has more absence than its intake would predict, negative when less). Sorted on these two axes (</w:t>
       </w:r>
       <w:hyperlink w:anchor="fig-quadrant">
         <w:r>
@@ -5177,9 +5951,9 @@
         <w:t xml:space="preserve">We are aware that Progress 8 is an attempt to bring a degree of value added into the reporting of attainment, but we would advocate for a more sophisticated, model-based measure of value added as outlined here. Controlling for many more of the exogenous variables that influence attainment allow us to dig deeper into the impact that schools are having, and as we have shown here, the reporting of measures such as value-added alongside residual absence means we can achieve a more honest framing than the single number that conventional benchmarking produces. This would help align local policy conversations with what the data can support them.</w:t>
       </w:r>
     </w:p>
-    <w:bookmarkEnd w:id="85"/>
     <w:bookmarkEnd w:id="86"/>
-    <w:bookmarkStart w:id="103" w:name="discussion"/>
+    <w:bookmarkEnd w:id="87"/>
+    <w:bookmarkStart w:id="104" w:name="discussion"/>
     <w:p>
       <w:pPr>
         <w:pStyle w:val="Heading1"/>
@@ -5188,7 +5962,7 @@
         <w:t xml:space="preserve">6. Discussion</w:t>
       </w:r>
     </w:p>
-    <w:bookmarkStart w:id="88" w:name="Xd3364b35d543c93770b334c5dc736f1edb746ee"/>
+    <w:bookmarkStart w:id="89" w:name="Xd3364b35d543c93770b334c5dc736f1edb746ee"/>
     <w:p>
       <w:pPr>
         <w:pStyle w:val="Heading2"/>
@@ -5208,7 +5982,7 @@
         <w:rPr>
           <w:rStyle w:val="FootnoteReference"/>
         </w:rPr>
-        <w:footnoteReference w:id="87"/>
+        <w:footnoteReference w:id="88"/>
       </w:r>
       <w:r>
         <w:t xml:space="preserve">, it was stated:</w:t>
@@ -5384,8 +6158,74 @@
         <w:t xml:space="preserve">sits awkwardly with this second-order literature.</w:t>
       </w:r>
     </w:p>
-    <w:bookmarkEnd w:id="88"/>
-    <w:bookmarkStart w:id="91" w:name="X721a00ff84e807512ec4207f4efbd7031d30b61"/>
+    <w:p>
+      <w:pPr>
+        <w:pStyle w:val="BodyText"/>
+      </w:pPr>
+      <w:r>
+        <w:t xml:space="preserve">It is worth making the mechanism explicit, because it clarifies how an admissions reform actually reaches attainment. There are two pathways. The first is the intended one: changing where pupils go alters the</w:t>
+      </w:r>
+      <w:r>
+        <w:t xml:space="preserve"> </w:t>
+      </w:r>
+      <w:r>
+        <w:rPr>
+          <w:i/>
+          <w:iCs/>
+        </w:rPr>
+        <w:t xml:space="preserve">FSM composition</w:t>
+      </w:r>
+      <w:r>
+        <w:t xml:space="preserve"> </w:t>
+      </w:r>
+      <w:r>
+        <w:t xml:space="preserve">of individual schools, which our modelling shows has, at most, a small effect on attainment — and for disadvantaged pupils, an effect that if anything runs the wrong way. The second is unintended: moving pupils further from home increases</w:t>
+      </w:r>
+      <w:r>
+        <w:t xml:space="preserve"> </w:t>
+      </w:r>
+      <w:r>
+        <w:rPr>
+          <w:i/>
+          <w:iCs/>
+        </w:rPr>
+        <w:t xml:space="preserve">travel</w:t>
+      </w:r>
+      <w:r>
+        <w:t xml:space="preserve">, which the evidence above links to</w:t>
+      </w:r>
+      <w:r>
+        <w:t xml:space="preserve"> </w:t>
+      </w:r>
+      <w:r>
+        <w:rPr>
+          <w:i/>
+          <w:iCs/>
+        </w:rPr>
+        <w:t xml:space="preserve">higher absence</w:t>
+      </w:r>
+      <w:r>
+        <w:t xml:space="preserve">, and absence is by a wide margin the strongest predictor of attainment we identify. In other words, the admissions lever operates on attainment mainly through the second, unintended channel, and in the direction opposite to the policy’s aim. This is why we describe it as pulling the wrong lever: not merely a weak instrument, but one whose most probable net effect on disadvantaged attainment is negative. We should be clear that this is a statement about</w:t>
+      </w:r>
+      <w:r>
+        <w:t xml:space="preserve"> </w:t>
+      </w:r>
+      <w:r>
+        <w:rPr>
+          <w:i/>
+          <w:iCs/>
+        </w:rPr>
+        <w:t xml:space="preserve">expected</w:t>
+      </w:r>
+      <w:r>
+        <w:t xml:space="preserve"> </w:t>
+      </w:r>
+      <w:r>
+        <w:t xml:space="preserve">effects derived from national associations, not an evaluation of the 2023 free-school-meal-priority policy or the 2026 arrangements, which post-date our outcome data and whose effects the council’s own commissioned follow-up work has yet to report.</w:t>
+      </w:r>
+    </w:p>
+    <w:bookmarkEnd w:id="89"/>
+    <w:bookmarkStart w:id="92" w:name="X721a00ff84e807512ec4207f4efbd7031d30b61"/>
     <w:p>
       <w:pPr>
         <w:pStyle w:val="Heading2"/>
@@ -5454,7 +6294,7 @@
         <w:rPr>
           <w:rStyle w:val="FootnoteReference"/>
         </w:rPr>
-        <w:footnoteReference w:id="89"/>
+        <w:footnoteReference w:id="90"/>
       </w:r>
       <w:r>
         <w:t xml:space="preserve">. Of the school-level barriers our modelling is able to quantify — intake composition, prior attainment, workforce stability, segregation, and absence — none has a larger or better-evidenced effect on disadvantaged attainment than absence. On the council’s own framing, in other words, the most direct route to</w:t>
@@ -5473,7 +6313,7 @@
         <w:t xml:space="preserve"> </w:t>
       </w:r>
       <w:r>
-        <w:t xml:space="preserve">for the city’s disadvantaged pupils points at attendance rather than at admissions arrangements. The city has the second-worst absence rate in England, and the wider evidence indicates that closing this gap would yield attainment gains for disadvantaged pupils that comfortably exceed anything achievable through changes to admissions arrangements — and would do so</w:t>
+        <w:t xml:space="preserve">for the city’s disadvantaged pupils points at attendance rather than at admissions arrangements. The city has the second-worst absence rate in England in 2024-25 — and, unlike almost every other authority, one that has barely improved since the pandemic — and the wider evidence indicates that closing this gap would yield attainment gains for disadvantaged pupils that comfortably exceed anything achievable through changes to admissions arrangements — and would do so</w:t>
       </w:r>
       <w:r>
         <w:t xml:space="preserve"> </w:t>
@@ -5503,14 +6343,14 @@
         <w:rPr>
           <w:rStyle w:val="FootnoteReference"/>
         </w:rPr>
-        <w:footnoteReference w:id="90"/>
+        <w:footnoteReference w:id="91"/>
       </w:r>
       <w:r>
         <w:t xml:space="preserve">, plus any further travel-assistance spending generated by the admissions changes, would arguably have a stronger evidence base for raising disadvantaged attainment if invested directly in attendance support, family liaison and pastoral capacity in the city’s most affected schools.</w:t>
       </w:r>
     </w:p>
-    <w:bookmarkEnd w:id="91"/>
-    <w:bookmarkStart w:id="95" w:name="Xe20933ab3677df6d1953e5d7ada5fd38009a941"/>
+    <w:bookmarkEnd w:id="92"/>
+    <w:bookmarkStart w:id="96" w:name="Xe20933ab3677df6d1953e5d7ada5fd38009a941"/>
     <w:p>
       <w:pPr>
         <w:pStyle w:val="Heading2"/>
@@ -5556,7 +6396,7 @@
       <w:tr>
         <w:tc>
           <w:tcPr/>
-          <w:bookmarkStart w:id="92" w:name="tbl-league"/>
+          <w:bookmarkStart w:id="93" w:name="tbl-league"/>
           <w:p>
             <w:pPr>
               <w:jc w:val="center"/>
@@ -5567,7 +6407,7 @@
               <w:pStyle w:val="ImageCaption"/>
             </w:pPr>
             <w:r>
-              <w:t xml:space="preserve">Table 2: Value-added rankings for Brighton and Hove schools (panel model residuals by year, in Attainment 8 points).</w:t>
+              <w:t xml:space="preserve">Table 3: Value-added rankings for Brighton and Hove schools (panel model residuals by year, in Attainment 8 points).</w:t>
             </w:r>
           </w:p>
           <w:tbl>
@@ -7543,7 +8383,7 @@
               </w:tc>
             </w:tr>
           </w:tbl>
-          <w:bookmarkEnd w:id="92"/>
+          <w:bookmarkEnd w:id="93"/>
           <w:p/>
         </w:tc>
       </w:tr>
@@ -7595,7 +8435,7 @@
           <w:rPr>
             <w:rStyle w:val="Hyperlink"/>
           </w:rPr>
-          <w:t xml:space="preserve">Table 2</w:t>
+          <w:t xml:space="preserve">Table 3</w:t>
         </w:r>
       </w:hyperlink>
       <w:r>
@@ -7643,7 +8483,7 @@
         <w:rPr>
           <w:rStyle w:val="FootnoteReference"/>
         </w:rPr>
-        <w:footnoteReference w:id="93"/>
+        <w:footnoteReference w:id="94"/>
       </w:r>
       <w:r>
         <w:t xml:space="preserve"> </w:t>
@@ -7652,8 +8492,8 @@
         <w:t xml:space="preserve">is unsurprising in the context of this analysis, but would have been surprising to anyone looking only at prior raw attainment and Ofsted ratings. Patcham, by contrast, sits ~2.6 GCSE points below expectation for disadvantaged pupils on a four-year average, with the gap reaching double figures in 2023-24 — differences hidden by its comfortable mid-table raw position. What other schools could learn from Patcham, however, is its attendance: it is one of only two city schools with absence below the national average, and exploring how it achieves this is a constructive city-level policy focus.</w:t>
       </w:r>
     </w:p>
-    <w:bookmarkEnd w:id="95"/>
-    <w:bookmarkStart w:id="97" w:name="viability-versus-attainment"/>
+    <w:bookmarkEnd w:id="96"/>
+    <w:bookmarkStart w:id="98" w:name="viability-versus-attainment"/>
     <w:p>
       <w:pPr>
         <w:pStyle w:val="Heading2"/>
@@ -7673,7 +8513,7 @@
         <w:rPr>
           <w:rStyle w:val="FootnoteReference"/>
         </w:rPr>
-        <w:footnoteReference w:id="96"/>
+        <w:footnoteReference w:id="97"/>
       </w:r>
       <w:r>
         <w:t xml:space="preserve"> </w:t>
@@ -7719,14 +8559,14 @@
         <w:t xml:space="preserve">Following widespread opposition and appeals to the Schools Adjudicator, the proposed PAN reductions were rejected. Parental objections meant that the 20% out-of-catchment priority was reduced to 5%. While displacement was minimised, the policy reverberations continued through choices expressed by parents already influenced by the preceding debate.</w:t>
       </w:r>
     </w:p>
-    <w:bookmarkEnd w:id="97"/>
-    <w:bookmarkStart w:id="98" w:name="Xe702bd681683f111ef0a20a6f3096e42cc57ffb"/>
+    <w:bookmarkEnd w:id="98"/>
+    <w:bookmarkStart w:id="99" w:name="X66de271a6aca02794f420f50f4d8a324e8e27cc"/>
     <w:p>
       <w:pPr>
         <w:pStyle w:val="Heading2"/>
       </w:pPr>
       <w:r>
-        <w:t xml:space="preserve">6.5 What is driving Brighton and Hove’s over-achievement? And what we don’t yet know</w:t>
+        <w:t xml:space="preserve">6.5 Conditional performance and the cost of absence</w:t>
       </w:r>
     </w:p>
     <w:p>
@@ -7734,7 +8574,7 @@
         <w:pStyle w:val="FirstParagraph"/>
       </w:pPr>
       <w:r>
-        <w:t xml:space="preserve">The LEA random effect for Brighton and Hove is large and statistically significant across all three attainment groups. After accounting for the structural (disadvantage, absence, prior attainment) or school management and governance (workforce characteristics, staff retention) factors in the model - schools in the city consistently outperform what the national picture would predict. For disadvantaged pupils, the city ranks 7th; for non-disadvantaged pupils, 5th; for all pupils, 4th in England.</w:t>
+        <w:t xml:space="preserve">The LEA random effect for Brighton and Hove is positive and, in the main model, statistically significant across all three attainment groups. As §5.2 set out, however, this result is conditional on how the model treats absence, and the city’s attendance is so extreme that the conditioning does most of the work. Controlling for absence, the city’s schools rank 7th of 151 for disadvantaged attainment; without that control they rank 46th and are statistically ordinary. We take neither number as the whole truth. Together they say something more useful than either alone: Brighton and Hove’s schools appear to be genuinely effective for the pupils who attend them, and the city’s attendance problem is large enough to erase that advantage in the aggregate.</w:t>
       </w:r>
     </w:p>
     <w:p>
@@ -7742,7 +8582,7 @@
         <w:pStyle w:val="BodyText"/>
       </w:pPr>
       <w:r>
-        <w:t xml:space="preserve">This is a genuinely important finding that should re-frame the policy conversation. The starting point for the 2024 consultation was a narrative of failure — the city was presented as uniquely failing its disadvantaged students, sitting on a vast attainment gap, with radical structural reform required to address the problem. The evidence suggests the opposite: Brighton and Hove is one of the highest-performing LEAs in the country once we account for the factors that we know drive attainment. Rather than asking what the city is doing wrong, the more productive question is what it is doing right — and how that can be protected and extended?</w:t>
+        <w:t xml:space="preserve">The distance between the two rankings has a concrete interpretation. It is roughly 1.3 Attainment 8 points per disadvantaged pupil — the difference between what the city’s disadvantaged children achieve and what they might achieve if their schools’ underlying effectiveness were not being drained by absence. Read this way, the city’s attendance is not a caveat to a good-news story; it is the story.</w:t>
       </w:r>
     </w:p>
     <w:p>
@@ -7750,11 +8590,19 @@
         <w:pStyle w:val="BodyText"/>
       </w:pPr>
       <w:r>
-        <w:t xml:space="preserve">The honest answer is that we do not yet know what produces this LEA effect. The random effect, by definition, captures variance that the fixed-effect predictors do not explain. It could reflect high levels of parental engagement and aspiration — Brighton and Hove has a well-educated population with a strong civic culture. It could relate to the quality of school leadership and governance across the city, or to effective local authority support services and school improvement programmes. It could be something about the collaborative relationships between schools, or community factors that are difficult to quantify. It could even be that if otherwise disruptive students switch to being absent students at a higher rate in Brighton and Hove, this may even have a positive impact on learning for those who remain in school. But without pupil and class-level longitudinal analysis, this hypothesis would be impossible to test. What all of these hypotheses show, however, it that identifying the sources of this over-performance is an important research question in its own right, and one that could require additional qualitative investigation or access to pupil-level data that goes beyond what is publicly available. But what is clear is that policy interventions which risk disrupting a well-functioning system without understanding what makes it function well carry substantial downside risks.</w:t>
-      </w:r>
-    </w:p>
-    <w:bookmarkEnd w:id="98"/>
-    <w:bookmarkStart w:id="101" w:name="implications-for-national-policy"/>
+        <w:t xml:space="preserve">This reframes what the 2024 consultation got right and what it got wrong. The council was not wrong that Brighton and Hove has a problem: unconditionally, its disadvantaged pupils do no better than the national average, and the raw attainment gap that motivated the consultation is real. What the consultation got wrong was the diagnosis. Presented with an attainment gap, it reached for the social composition of schools — one of the weakest levers our modelling identifies, and for disadvantaged pupils a lever that may point the wrong way (§4.3, §5.3) — while the factor that actually separates the city’s conditional standing from its unconditional standing, attendance, was absent from the consultation entirely. The more accurate account is not that a high-performing city was mistaken for a failing one, but that a city with one specific, severe, addressable problem was prescribed a treatment for a different problem it did not have.</w:t>
+      </w:r>
+    </w:p>
+    <w:p>
+      <w:pPr>
+        <w:pStyle w:val="BodyText"/>
+      </w:pPr>
+      <w:r>
+        <w:t xml:space="preserve">The honest answer is that we do not yet know what produces this LEA effect. The random effect, by definition, captures variance that the fixed-effect predictors do not explain. It could reflect high levels of parental engagement and aspiration — Brighton and Hove has a well-educated population with a strong civic culture. It could relate to the quality of school leadership and governance across the city, or to effective local authority support services and school improvement programmes. It could be something about the collaborative relationships between schools, or community factors that are difficult to quantify. It could even be that if otherwise disruptive students switch to being absent students at a higher rate in Brighton and Hove, this may even have a positive impact on learning for those who remain in school. But without pupil and class-level longitudinal analysis, this hypothesis would be impossible to test. What all of these hypotheses show, however, is that identifying the sources of this conditional over-performance is an important research question in its own right, and one that could require additional qualitative investigation or access to pupil-level data that goes beyond what is publicly available. But what is clear is that policy interventions which risk disrupting a well-functioning system without understanding what makes it function well carry substantial downside risks.</w:t>
+      </w:r>
+    </w:p>
+    <w:bookmarkEnd w:id="99"/>
+    <w:bookmarkStart w:id="102" w:name="implications-for-national-policy"/>
     <w:p>
       <w:pPr>
         <w:pStyle w:val="Heading2"/>
@@ -7788,23 +8636,75 @@
         <w:pStyle w:val="BodyText"/>
       </w:pPr>
       <w:r>
+        <w:t xml:space="preserve">We should be candid that this gap is, in part, a structural consequence of policy since 2010. Academisation and sustained real-terms reductions in local authority central-services funding have substantially eroded the analytical capacity that once sat within LEAs, so a recommendation simply to</w:t>
+      </w:r>
+      <w:r>
+        <w:t xml:space="preserve"> </w:t>
+      </w:r>
+      <w:r>
+        <w:t xml:space="preserve">‘invest locally’</w:t>
+      </w:r>
+      <w:r>
+        <w:t xml:space="preserve"> </w:t>
+      </w:r>
+      <w:r>
+        <w:t xml:space="preserve">sits uneasily with the fiscal reality most authorities face. Multi-academy trusts have absorbed some of this function, but only for their own constituent schools; no actor now has both the remit and the capacity for the</w:t>
+      </w:r>
+      <w:r>
+        <w:t xml:space="preserve"> </w:t>
+      </w:r>
+      <w:r>
+        <w:rPr>
+          <w:i/>
+          <w:iCs/>
+        </w:rPr>
+        <w:t xml:space="preserve">locality-wide</w:t>
+      </w:r>
+      <w:r>
+        <w:t xml:space="preserve"> </w:t>
+      </w:r>
+      <w:r>
+        <w:t xml:space="preserve">analysis that spans maintained schools, academies across different trusts, and church schools within a single place. Brighton and Hove illustrates the gap precisely: the council remains the admissions authority for a system it has limited capacity to analyse as a whole, while its two academies — central to the policy question — sit outside its analytical reach. The need, then, is less for every council to rebuild bespoke capacity than for the</w:t>
+      </w:r>
+      <w:r>
+        <w:t xml:space="preserve"> </w:t>
+      </w:r>
+      <w:r>
+        <w:rPr>
+          <w:i/>
+          <w:iCs/>
+        </w:rPr>
+        <w:t xml:space="preserve">system</w:t>
+      </w:r>
+      <w:r>
+        <w:t xml:space="preserve"> </w:t>
+      </w:r>
+      <w:r>
+        <w:t xml:space="preserve">to close a locality-level analytical gap, whether through central funding for local capacity or nationally maintained benchmarking tools that any locality can use.</w:t>
+      </w:r>
+    </w:p>
+    <w:p>
+      <w:pPr>
+        <w:pStyle w:val="BodyText"/>
+      </w:pPr>
+      <w:r>
         <w:t xml:space="preserve">We have developed an interactive Policy Simulator tool,</w:t>
       </w:r>
       <w:r>
         <w:rPr>
           <w:rStyle w:val="FootnoteReference"/>
         </w:rPr>
-        <w:footnoteReference w:id="99"/>
-      </w:r>
-      <w:r>
-        <w:t xml:space="preserve"> </w:t>
-      </w:r>
-      <w:r>
-        <w:t xml:space="preserve">underpinned by the models in this paper, to begin bridging that gap. The tool allows users to explore any school in England, compare against contextual expectations, and model the indicative impact of changes to key variables.</w:t>
-      </w:r>
-    </w:p>
-    <w:bookmarkEnd w:id="101"/>
-    <w:bookmarkStart w:id="102" w:name="limitations"/>
+        <w:footnoteReference w:id="100"/>
+      </w:r>
+      <w:r>
+        <w:t xml:space="preserve"> </w:t>
+      </w:r>
+      <w:r>
+        <w:t xml:space="preserve">underpinned by the models in this paper, as a prototype of exactly this kind of shared, locality-level infrastructure. The tool allows users to explore any school in England, compare against contextual expectations, and model the indicative impact of changes to key variables.</w:t>
+      </w:r>
+    </w:p>
+    <w:bookmarkEnd w:id="102"/>
+    <w:bookmarkStart w:id="103" w:name="limitations"/>
     <w:p>
       <w:pPr>
         <w:pStyle w:val="Heading2"/>
@@ -7821,9 +8721,9 @@
         <w:t xml:space="preserve">These are school-level models built from aggregate published data, not pupil-level analyses. The associations identified are not experimental causal estimates but the best approximations available from observational data. The models cannot capture unmeasured factors such as school culture, parental engagement, or individual pupil resilience. The Policy Simulator translates associations into indicative, not definitive, projections. We do not claim that reducing absence by a given amount will mechanically produce the predicted gain — the real world is more complex than any model captures. What we do claim is that these models are accurate enough, and the patterns consistent enough across years and specifications, to substantially improve the quality of the conversation around what matters most.</w:t>
       </w:r>
     </w:p>
-    <w:bookmarkEnd w:id="102"/>
     <w:bookmarkEnd w:id="103"/>
-    <w:bookmarkStart w:id="104" w:name="conclusion"/>
+    <w:bookmarkEnd w:id="104"/>
+    <w:bookmarkStart w:id="105" w:name="conclusion"/>
     <w:p>
       <w:pPr>
         <w:pStyle w:val="Heading1"/>
@@ -7875,7 +8775,7 @@
         <w:t xml:space="preserve">attendance</w:t>
       </w:r>
       <w:r>
-        <w:t xml:space="preserve">. The city has the second-worst absence rate in England, and the modelling suggests that moving the city’s worst-affected schools toward the national absence average would yield gains for disadvantaged pupils that comfortably exceed anything achievable through admissions reform. The two-stage decomposition we develop here also shows that this lever has two parts to it: a</w:t>
+        <w:t xml:space="preserve">. The city had the second-worst absence rate in England in 2024-25 — and its absence has failed to fall while it fell almost everywhere else — and the modelling suggests that moving the city’s worst-affected schools toward the national absence average would yield gains for disadvantaged pupils that comfortably exceed anything achievable through admissions reform. The two-stage decomposition we develop here also shows that this lever has two parts to it: a</w:t>
       </w:r>
       <w:r>
         <w:t xml:space="preserve"> </w:t>
@@ -7940,70 +8840,6 @@
       </w:pPr>
       <w:r>
         <w:t xml:space="preserve">Our recommendations follow. For the DfE: invest in analytical infrastructure at the local level and consider how contextualised benchmarking tools might be developed at scale. For LEAs: contextualised benchmarking and a focus on the most impactful levers should be at the centre of local policy on attainment. The factors affecting attainment are multiple, interacting, non-linear and context-dependent, and a single-narrative approach risks pulling the wrong lever. For schools, governors and parents: a contextualised value-added view offers a fairer basis for understanding school quality than raw scores or Ofsted ratings, and can support better choices that do not come at the cost of community-anchored schooling, while helping point to where improvement efforts might be most usefully targeted.</w:t>
-      </w:r>
-    </w:p>
-    <w:bookmarkEnd w:id="104"/>
-    <w:bookmarkStart w:id="105" w:name="credit-authorship-contribution-statement"/>
-    <w:p>
-      <w:pPr>
-        <w:pStyle w:val="Heading1"/>
-      </w:pPr>
-      <w:r>
-        <w:t xml:space="preserve">CRediT authorship contribution statement</w:t>
-      </w:r>
-    </w:p>
-    <w:p>
-      <w:pPr>
-        <w:pStyle w:val="FirstParagraph"/>
-      </w:pPr>
-      <w:r>
-        <w:rPr>
-          <w:b/>
-          <w:bCs/>
-        </w:rPr>
-        <w:t xml:space="preserve">Adam Dennett:</w:t>
-      </w:r>
-      <w:r>
-        <w:t xml:space="preserve"> </w:t>
-      </w:r>
-      <w:r>
-        <w:t xml:space="preserve">Conceptualisation, Methodology, Software, Formal analysis, Data curation, Writing – original draft, Writing – review &amp; editing, Visualisation, Project administration.</w:t>
-      </w:r>
-    </w:p>
-    <w:p>
-      <w:pPr>
-        <w:pStyle w:val="BodyText"/>
-      </w:pPr>
-      <w:r>
-        <w:rPr>
-          <w:b/>
-          <w:bCs/>
-        </w:rPr>
-        <w:t xml:space="preserve">Beatrice Taylor:</w:t>
-      </w:r>
-      <w:r>
-        <w:t xml:space="preserve"> </w:t>
-      </w:r>
-      <w:r>
-        <w:t xml:space="preserve">Methodology – refining and review; Writing – review &amp; editing.</w:t>
-      </w:r>
-    </w:p>
-    <w:p>
-      <w:pPr>
-        <w:pStyle w:val="BodyText"/>
-      </w:pPr>
-      <w:r>
-        <w:rPr>
-          <w:b/>
-          <w:bCs/>
-        </w:rPr>
-        <w:t xml:space="preserve">Daniel Campbell-Meiklejohn:</w:t>
-      </w:r>
-      <w:r>
-        <w:t xml:space="preserve"> </w:t>
-      </w:r>
-      <w:r>
-        <w:t xml:space="preserve">Methodology – refining and review; Writing – review &amp; editing.</w:t>
       </w:r>
     </w:p>
     <w:bookmarkEnd w:id="105"/>
@@ -8025,13 +8861,13 @@
       </w:r>
     </w:p>
     <w:bookmarkEnd w:id="106"/>
-    <w:bookmarkStart w:id="107" w:name="funding-details"/>
+    <w:bookmarkStart w:id="107" w:name="disclosure-statement"/>
     <w:p>
       <w:pPr>
         <w:pStyle w:val="Heading1"/>
       </w:pPr>
       <w:r>
-        <w:t xml:space="preserve">Funding Details</w:t>
+        <w:t xml:space="preserve">Disclosure Statement</w:t>
       </w:r>
     </w:p>
     <w:p>
@@ -8039,66 +8875,21 @@
         <w:pStyle w:val="FirstParagraph"/>
       </w:pPr>
       <w:r>
-        <w:t xml:space="preserve">This work was supported by: EPSRC under grant EP/Y028392/1.</w:t>
+        <w:t xml:space="preserve">Some of the authors are residents of Brighton and Hove with school aged children and lived experience of the effects of the admissions policy process described. No financial conflicts of interest exist.</w:t>
       </w:r>
     </w:p>
     <w:bookmarkEnd w:id="107"/>
-    <w:bookmarkStart w:id="108" w:name="acknowledgements"/>
+    <w:bookmarkStart w:id="204" w:name="references"/>
     <w:p>
       <w:pPr>
         <w:pStyle w:val="Heading1"/>
       </w:pPr>
       <w:r>
-        <w:t xml:space="preserve">Acknowledgements</w:t>
-      </w:r>
-    </w:p>
-    <w:p>
-      <w:pPr>
-        <w:pStyle w:val="FirstParagraph"/>
-      </w:pPr>
-      <w:r>
-        <w:t xml:space="preserve">Development of the Policy Simulator tool was substantially accelerated by large language model assistance (Anthropic’s Claude) as part of work supported by the UKRI National AI Research Hub for Collective Intelligence (AI4CI). All of this work has been co-designed through many hours of conversations over the last 18 months or so with a group of parents in Brighton and Hove who have come together under the banner of the</w:t>
-      </w:r>
-      <w:r>
-        <w:t xml:space="preserve"> </w:t>
-      </w:r>
-      <w:r>
-        <w:t xml:space="preserve">‘Parent Support Group’</w:t>
-      </w:r>
-      <w:r>
-        <w:t xml:space="preserve">. The range of perspectives and breadth of expertise within this group has been inspirational.</w:t>
-      </w:r>
-    </w:p>
-    <w:bookmarkEnd w:id="108"/>
-    <w:bookmarkStart w:id="109" w:name="declaration-of-interest"/>
-    <w:p>
-      <w:pPr>
-        <w:pStyle w:val="Heading1"/>
-      </w:pPr>
-      <w:r>
-        <w:t xml:space="preserve">Declaration of interest</w:t>
-      </w:r>
-    </w:p>
-    <w:p>
-      <w:pPr>
-        <w:pStyle w:val="FirstParagraph"/>
-      </w:pPr>
-      <w:r>
-        <w:t xml:space="preserve">Some of the authors are residents of Brighton and Hove with school aged children and lived experience of the effects of the admissions policy process described. No financial conflicts of interest exist.</w:t>
-      </w:r>
-    </w:p>
-    <w:bookmarkEnd w:id="109"/>
-    <w:bookmarkStart w:id="204" w:name="references"/>
-    <w:p>
-      <w:pPr>
-        <w:pStyle w:val="Heading1"/>
-      </w:pPr>
-      <w:r>
         <w:t xml:space="preserve">References</w:t>
       </w:r>
     </w:p>
     <w:bookmarkStart w:id="203" w:name="refs"/>
-    <w:bookmarkStart w:id="111" w:name="ref-Allen2018"/>
+    <w:bookmarkStart w:id="109" w:name="ref-Allen2018"/>
     <w:p>
       <w:pPr>
         <w:pStyle w:val="Bibliography"/>
@@ -8140,7 +8931,7 @@
       <w:r>
         <w:t xml:space="preserve"> </w:t>
       </w:r>
-      <w:hyperlink r:id="rId110">
+      <w:hyperlink r:id="rId108">
         <w:r>
           <w:rPr>
             <w:rStyle w:val="Hyperlink"/>
@@ -8152,8 +8943,8 @@
         <w:t xml:space="preserve">.</w:t>
       </w:r>
     </w:p>
-    <w:bookmarkEnd w:id="111"/>
-    <w:bookmarkStart w:id="113" w:name="ref-Allen2013"/>
+    <w:bookmarkEnd w:id="109"/>
+    <w:bookmarkStart w:id="111" w:name="ref-Allen2013"/>
     <w:p>
       <w:pPr>
         <w:pStyle w:val="Bibliography"/>
@@ -8207,7 +8998,7 @@
       <w:r>
         <w:t xml:space="preserve"> </w:t>
       </w:r>
-      <w:hyperlink r:id="rId112">
+      <w:hyperlink r:id="rId110">
         <w:r>
           <w:rPr>
             <w:rStyle w:val="Hyperlink"/>
@@ -8219,8 +9010,8 @@
         <w:t xml:space="preserve">.</w:t>
       </w:r>
     </w:p>
-    <w:bookmarkEnd w:id="113"/>
-    <w:bookmarkStart w:id="115" w:name="ref-Anders2024"/>
+    <w:bookmarkEnd w:id="111"/>
+    <w:bookmarkStart w:id="113" w:name="ref-Anders2024"/>
     <w:p>
       <w:pPr>
         <w:pStyle w:val="Bibliography"/>
@@ -8274,7 +9065,7 @@
       <w:r>
         <w:t xml:space="preserve"> </w:t>
       </w:r>
-      <w:hyperlink r:id="rId114">
+      <w:hyperlink r:id="rId112">
         <w:r>
           <w:rPr>
             <w:rStyle w:val="Hyperlink"/>
@@ -8286,8 +9077,8 @@
         <w:t xml:space="preserve">.</w:t>
       </w:r>
     </w:p>
-    <w:bookmarkEnd w:id="115"/>
-    <w:bookmarkStart w:id="117" w:name="ref-Blagg2018"/>
+    <w:bookmarkEnd w:id="113"/>
+    <w:bookmarkStart w:id="115" w:name="ref-Blagg2018"/>
     <w:p>
       <w:pPr>
         <w:pStyle w:val="Bibliography"/>
@@ -8479,7 +9270,7 @@
       <w:r>
         <w:t xml:space="preserve"> </w:t>
       </w:r>
-      <w:hyperlink r:id="rId116">
+      <w:hyperlink r:id="rId114">
         <w:r>
           <w:rPr>
             <w:rStyle w:val="Hyperlink"/>
@@ -8491,8 +9282,8 @@
         <w:t xml:space="preserve">.</w:t>
       </w:r>
     </w:p>
-    <w:bookmarkEnd w:id="117"/>
-    <w:bookmarkStart w:id="119" w:name="ref-Burgess2018"/>
+    <w:bookmarkEnd w:id="115"/>
+    <w:bookmarkStart w:id="117" w:name="ref-Burgess2018"/>
     <w:p>
       <w:pPr>
         <w:pStyle w:val="Bibliography"/>
@@ -8525,7 +9316,7 @@
       <w:r>
         <w:t xml:space="preserve"> </w:t>
       </w:r>
-      <w:hyperlink r:id="rId118">
+      <w:hyperlink r:id="rId116">
         <w:r>
           <w:rPr>
             <w:rStyle w:val="Hyperlink"/>
@@ -8537,8 +9328,8 @@
         <w:t xml:space="preserve">.</w:t>
       </w:r>
     </w:p>
-    <w:bookmarkEnd w:id="119"/>
-    <w:bookmarkStart w:id="121" w:name="ref-Burgess2023"/>
+    <w:bookmarkEnd w:id="117"/>
+    <w:bookmarkStart w:id="119" w:name="ref-Burgess2023"/>
     <w:p>
       <w:pPr>
         <w:pStyle w:val="Bibliography"/>
@@ -8571,7 +9362,7 @@
       <w:r>
         <w:t xml:space="preserve"> </w:t>
       </w:r>
-      <w:hyperlink r:id="rId120">
+      <w:hyperlink r:id="rId118">
         <w:r>
           <w:rPr>
             <w:rStyle w:val="Hyperlink"/>
@@ -8583,50 +9374,13 @@
         <w:t xml:space="preserve">.</w:t>
       </w:r>
     </w:p>
-    <w:bookmarkEnd w:id="121"/>
-    <w:bookmarkStart w:id="123" w:name="ref-Burgess2022"/>
+    <w:bookmarkEnd w:id="119"/>
+    <w:bookmarkStart w:id="121" w:name="ref-Chairassamee2024"/>
     <w:p>
       <w:pPr>
         <w:pStyle w:val="Bibliography"/>
       </w:pPr>
       <w:r>
-        <w:t xml:space="preserve">Burgess, S., S. Rawal, and E. Taylor. 2022.</w:t>
-      </w:r>
-      <w:r>
-        <w:t xml:space="preserve"> </w:t>
-      </w:r>
-      <w:r>
-        <w:rPr>
-          <w:i/>
-          <w:iCs/>
-        </w:rPr>
-        <w:t xml:space="preserve">Characterising Effective Teaching</w:t>
-      </w:r>
-      <w:r>
-        <w:t xml:space="preserve">. Nuffield Foundation.</w:t>
-      </w:r>
-      <w:r>
-        <w:t xml:space="preserve"> </w:t>
-      </w:r>
-      <w:hyperlink r:id="rId122">
-        <w:r>
-          <w:rPr>
-            <w:rStyle w:val="Hyperlink"/>
-          </w:rPr>
-          <w:t xml:space="preserve">https://www.nuffieldfoundation.org/project/characterising-effective-teaching-2</w:t>
-        </w:r>
-      </w:hyperlink>
-      <w:r>
-        <w:t xml:space="preserve">.</w:t>
-      </w:r>
-    </w:p>
-    <w:bookmarkEnd w:id="123"/>
-    <w:bookmarkStart w:id="125" w:name="ref-Chairassamee2024"/>
-    <w:p>
-      <w:pPr>
-        <w:pStyle w:val="Bibliography"/>
-      </w:pPr>
-      <w:r>
         <w:t xml:space="preserve">Chairassamee, Nattanicha, Kanokwan Chancharoenchai, and Wuthiya Saraithong. 2024.</w:t>
       </w:r>
       <w:r>
@@ -8654,7 +9408,7 @@
       <w:r>
         <w:t xml:space="preserve"> </w:t>
       </w:r>
-      <w:hyperlink r:id="rId124">
+      <w:hyperlink r:id="rId120">
         <w:r>
           <w:rPr>
             <w:rStyle w:val="Hyperlink"/>
@@ -8666,8 +9420,8 @@
         <w:t xml:space="preserve">.</w:t>
       </w:r>
     </w:p>
-    <w:bookmarkEnd w:id="125"/>
-    <w:bookmarkStart w:id="127" w:name="ref-HouseofCommons2021"/>
+    <w:bookmarkEnd w:id="121"/>
+    <w:bookmarkStart w:id="123" w:name="ref-HouseofCommons2021"/>
     <w:p>
       <w:pPr>
         <w:pStyle w:val="Bibliography"/>
@@ -8817,7 +9571,7 @@
       <w:r>
         <w:t xml:space="preserve"> </w:t>
       </w:r>
-      <w:hyperlink r:id="rId126">
+      <w:hyperlink r:id="rId122">
         <w:r>
           <w:rPr>
             <w:rStyle w:val="Hyperlink"/>
@@ -8829,8 +9583,8 @@
         <w:t xml:space="preserve">.</w:t>
       </w:r>
     </w:p>
-    <w:bookmarkEnd w:id="127"/>
-    <w:bookmarkStart w:id="129" w:name="ref-Cordes2022"/>
+    <w:bookmarkEnd w:id="123"/>
+    <w:bookmarkStart w:id="125" w:name="ref-Cordes2022"/>
     <w:p>
       <w:pPr>
         <w:pStyle w:val="Bibliography"/>
@@ -8863,7 +9617,7 @@
       <w:r>
         <w:t xml:space="preserve"> </w:t>
       </w:r>
-      <w:hyperlink r:id="rId128">
+      <w:hyperlink r:id="rId124">
         <w:r>
           <w:rPr>
             <w:rStyle w:val="Hyperlink"/>
@@ -8875,8 +9629,8 @@
         <w:t xml:space="preserve">.</w:t>
       </w:r>
     </w:p>
-    <w:bookmarkEnd w:id="129"/>
-    <w:bookmarkStart w:id="131" w:name="ref-DfE2022"/>
+    <w:bookmarkEnd w:id="125"/>
+    <w:bookmarkStart w:id="127" w:name="ref-DfE2022"/>
     <w:p>
       <w:pPr>
         <w:pStyle w:val="Bibliography"/>
@@ -8977,7 +9731,7 @@
       <w:r>
         <w:t xml:space="preserve"> </w:t>
       </w:r>
-      <w:hyperlink r:id="rId130">
+      <w:hyperlink r:id="rId126">
         <w:r>
           <w:rPr>
             <w:rStyle w:val="Hyperlink"/>
@@ -8989,8 +9743,8 @@
         <w:t xml:space="preserve">.</w:t>
       </w:r>
     </w:p>
-    <w:bookmarkEnd w:id="131"/>
-    <w:bookmarkStart w:id="133" w:name="ref-DfE2025a"/>
+    <w:bookmarkEnd w:id="127"/>
+    <w:bookmarkStart w:id="129" w:name="ref-DfE2025a"/>
     <w:p>
       <w:pPr>
         <w:pStyle w:val="Bibliography"/>
@@ -9014,7 +9768,7 @@
       <w:r>
         <w:t xml:space="preserve"> </w:t>
       </w:r>
-      <w:hyperlink r:id="rId132">
+      <w:hyperlink r:id="rId128">
         <w:r>
           <w:rPr>
             <w:rStyle w:val="Hyperlink"/>
@@ -9026,8 +9780,8 @@
         <w:t xml:space="preserve">.</w:t>
       </w:r>
     </w:p>
-    <w:bookmarkEnd w:id="133"/>
-    <w:bookmarkStart w:id="135" w:name="ref-DfE2025b"/>
+    <w:bookmarkEnd w:id="129"/>
+    <w:bookmarkStart w:id="131" w:name="ref-DfE2025b"/>
     <w:p>
       <w:pPr>
         <w:pStyle w:val="Bibliography"/>
@@ -9100,7 +9854,7 @@
       <w:r>
         <w:t xml:space="preserve"> </w:t>
       </w:r>
-      <w:hyperlink r:id="rId134">
+      <w:hyperlink r:id="rId130">
         <w:r>
           <w:rPr>
             <w:rStyle w:val="Hyperlink"/>
@@ -9112,8 +9866,8 @@
         <w:t xml:space="preserve">.</w:t>
       </w:r>
     </w:p>
-    <w:bookmarkEnd w:id="135"/>
-    <w:bookmarkStart w:id="137" w:name="ref-dfe_every_2026"/>
+    <w:bookmarkEnd w:id="131"/>
+    <w:bookmarkStart w:id="133" w:name="ref-dfe_every_2026"/>
     <w:p>
       <w:pPr>
         <w:pStyle w:val="Bibliography"/>
@@ -9137,7 +9891,7 @@
       <w:r>
         <w:t xml:space="preserve"> </w:t>
       </w:r>
-      <w:hyperlink r:id="rId136">
+      <w:hyperlink r:id="rId132">
         <w:r>
           <w:rPr>
             <w:rStyle w:val="Hyperlink"/>
@@ -9149,8 +9903,8 @@
         <w:t xml:space="preserve">.</w:t>
       </w:r>
     </w:p>
-    <w:bookmarkEnd w:id="137"/>
-    <w:bookmarkStart w:id="139" w:name="ref-Ding2023"/>
+    <w:bookmarkEnd w:id="133"/>
+    <w:bookmarkStart w:id="135" w:name="ref-Ding2023"/>
     <w:p>
       <w:pPr>
         <w:pStyle w:val="Bibliography"/>
@@ -9204,7 +9958,7 @@
       <w:r>
         <w:t xml:space="preserve"> </w:t>
       </w:r>
-      <w:hyperlink r:id="rId138">
+      <w:hyperlink r:id="rId134">
         <w:r>
           <w:rPr>
             <w:rStyle w:val="Hyperlink"/>
@@ -9216,8 +9970,8 @@
         <w:t xml:space="preserve">.</w:t>
       </w:r>
     </w:p>
-    <w:bookmarkEnd w:id="139"/>
-    <w:bookmarkStart w:id="141" w:name="ref-Drager2024"/>
+    <w:bookmarkEnd w:id="135"/>
+    <w:bookmarkStart w:id="137" w:name="ref-Drager2024"/>
     <w:p>
       <w:pPr>
         <w:pStyle w:val="Bibliography"/>
@@ -9250,7 +10004,7 @@
       <w:r>
         <w:t xml:space="preserve"> </w:t>
       </w:r>
-      <w:hyperlink r:id="rId140">
+      <w:hyperlink r:id="rId136">
         <w:r>
           <w:rPr>
             <w:rStyle w:val="Hyperlink"/>
@@ -9262,8 +10016,8 @@
         <w:t xml:space="preserve">.</w:t>
       </w:r>
     </w:p>
-    <w:bookmarkEnd w:id="141"/>
-    <w:bookmarkStart w:id="143" w:name="ref-Farquharson2024"/>
+    <w:bookmarkEnd w:id="137"/>
+    <w:bookmarkStart w:id="139" w:name="ref-Farquharson2024"/>
     <w:p>
       <w:pPr>
         <w:pStyle w:val="Bibliography"/>
@@ -9296,7 +10050,7 @@
       <w:r>
         <w:t xml:space="preserve"> </w:t>
       </w:r>
-      <w:hyperlink r:id="rId142">
+      <w:hyperlink r:id="rId138">
         <w:r>
           <w:rPr>
             <w:rStyle w:val="Hyperlink"/>
@@ -9308,8 +10062,8 @@
         <w:t xml:space="preserve">.</w:t>
       </w:r>
     </w:p>
-    <w:bookmarkEnd w:id="143"/>
-    <w:bookmarkStart w:id="145" w:name="ref-Faulkner2013"/>
+    <w:bookmarkEnd w:id="139"/>
+    <w:bookmarkStart w:id="141" w:name="ref-Faulkner2013"/>
     <w:p>
       <w:pPr>
         <w:pStyle w:val="Bibliography"/>
@@ -9342,7 +10096,7 @@
       <w:r>
         <w:t xml:space="preserve"> </w:t>
       </w:r>
-      <w:hyperlink r:id="rId144">
+      <w:hyperlink r:id="rId140">
         <w:r>
           <w:rPr>
             <w:rStyle w:val="Hyperlink"/>
@@ -9354,8 +10108,8 @@
         <w:t xml:space="preserve">.</w:t>
       </w:r>
     </w:p>
-    <w:bookmarkEnd w:id="145"/>
-    <w:bookmarkStart w:id="147" w:name="ref-Fredriksen2004"/>
+    <w:bookmarkEnd w:id="141"/>
+    <w:bookmarkStart w:id="143" w:name="ref-Fredriksen2004"/>
     <w:p>
       <w:pPr>
         <w:pStyle w:val="Bibliography"/>
@@ -9385,7 +10139,7 @@
       <w:r>
         <w:t xml:space="preserve">75 (1): 84–95. https://doi.org/</w:t>
       </w:r>
-      <w:hyperlink r:id="rId146">
+      <w:hyperlink r:id="rId142">
         <w:r>
           <w:rPr>
             <w:rStyle w:val="Hyperlink"/>
@@ -9397,8 +10151,8 @@
         <w:t xml:space="preserve">.</w:t>
       </w:r>
     </w:p>
-    <w:bookmarkEnd w:id="147"/>
-    <w:bookmarkStart w:id="149" w:name="ref-Gibbons2018"/>
+    <w:bookmarkEnd w:id="143"/>
+    <w:bookmarkStart w:id="145" w:name="ref-Gibbons2018"/>
     <w:p>
       <w:pPr>
         <w:pStyle w:val="Bibliography"/>
@@ -9422,7 +10176,7 @@
       <w:r>
         <w:t xml:space="preserve"> </w:t>
       </w:r>
-      <w:hyperlink r:id="rId148">
+      <w:hyperlink r:id="rId144">
         <w:r>
           <w:rPr>
             <w:rStyle w:val="Hyperlink"/>
@@ -9434,8 +10188,8 @@
         <w:t xml:space="preserve">.</w:t>
       </w:r>
     </w:p>
-    <w:bookmarkEnd w:id="149"/>
-    <w:bookmarkStart w:id="151" w:name="ref-Gillborn2017"/>
+    <w:bookmarkEnd w:id="145"/>
+    <w:bookmarkStart w:id="147" w:name="ref-Gillborn2017"/>
     <w:p>
       <w:pPr>
         <w:pStyle w:val="Bibliography"/>
@@ -9498,7 +10252,7 @@
       <w:r>
         <w:t xml:space="preserve"> </w:t>
       </w:r>
-      <w:hyperlink r:id="rId150">
+      <w:hyperlink r:id="rId146">
         <w:r>
           <w:rPr>
             <w:rStyle w:val="Hyperlink"/>
@@ -9510,8 +10264,8 @@
         <w:t xml:space="preserve">.</w:t>
       </w:r>
     </w:p>
-    <w:bookmarkEnd w:id="151"/>
-    <w:bookmarkStart w:id="153" w:name="ref-gorard_how_2019"/>
+    <w:bookmarkEnd w:id="147"/>
+    <w:bookmarkStart w:id="149" w:name="ref-gorard_how_2019"/>
     <w:p>
       <w:pPr>
         <w:pStyle w:val="Bibliography"/>
@@ -9589,7 +10343,7 @@
       <w:r>
         <w:t xml:space="preserve"> </w:t>
       </w:r>
-      <w:hyperlink r:id="rId152">
+      <w:hyperlink r:id="rId148">
         <w:r>
           <w:rPr>
             <w:rStyle w:val="Hyperlink"/>
@@ -9601,8 +10355,8 @@
         <w:t xml:space="preserve">.</w:t>
       </w:r>
     </w:p>
-    <w:bookmarkEnd w:id="153"/>
-    <w:bookmarkStart w:id="155" w:name="ref-gorard_school_2025"/>
+    <w:bookmarkEnd w:id="149"/>
+    <w:bookmarkStart w:id="151" w:name="ref-gorard_school_2025"/>
     <w:p>
       <w:pPr>
         <w:pStyle w:val="Bibliography"/>
@@ -9755,7 +10509,7 @@
       <w:r>
         <w:t xml:space="preserve"> </w:t>
       </w:r>
-      <w:hyperlink r:id="rId154">
+      <w:hyperlink r:id="rId150">
         <w:r>
           <w:rPr>
             <w:rStyle w:val="Hyperlink"/>
@@ -9767,8 +10521,8 @@
         <w:t xml:space="preserve">.</w:t>
       </w:r>
     </w:p>
-    <w:bookmarkEnd w:id="155"/>
-    <w:bookmarkStart w:id="157" w:name="ref-Grant2017"/>
+    <w:bookmarkEnd w:id="151"/>
+    <w:bookmarkStart w:id="153" w:name="ref-Grant2017"/>
     <w:p>
       <w:pPr>
         <w:pStyle w:val="Bibliography"/>
@@ -9876,7 +10630,7 @@
       <w:r>
         <w:t xml:space="preserve"> </w:t>
       </w:r>
-      <w:hyperlink r:id="rId156">
+      <w:hyperlink r:id="rId152">
         <w:r>
           <w:rPr>
             <w:rStyle w:val="Hyperlink"/>
@@ -9888,8 +10642,8 @@
         <w:t xml:space="preserve">.</w:t>
       </w:r>
     </w:p>
-    <w:bookmarkEnd w:id="157"/>
-    <w:bookmarkStart w:id="159" w:name="ref-Guan2025"/>
+    <w:bookmarkEnd w:id="153"/>
+    <w:bookmarkStart w:id="155" w:name="ref-Guan2025"/>
     <w:p>
       <w:pPr>
         <w:pStyle w:val="Bibliography"/>
@@ -9931,7 +10685,7 @@
       <w:r>
         <w:t xml:space="preserve"> </w:t>
       </w:r>
-      <w:hyperlink r:id="rId158">
+      <w:hyperlink r:id="rId154">
         <w:r>
           <w:rPr>
             <w:rStyle w:val="Hyperlink"/>
@@ -9943,13 +10697,80 @@
         <w:t xml:space="preserve">.</w:t>
       </w:r>
     </w:p>
-    <w:bookmarkEnd w:id="159"/>
-    <w:bookmarkStart w:id="161" w:name="ref-Karan2021"/>
+    <w:bookmarkEnd w:id="155"/>
+    <w:bookmarkStart w:id="157" w:name="ref-houtepen_associations_2020"/>
     <w:p>
       <w:pPr>
         <w:pStyle w:val="Bibliography"/>
       </w:pPr>
       <w:r>
+        <w:t xml:space="preserve">Houtepen, Lotte C., Jon Heron, Matthew J. Suderman, Abigail Fraser, Catherine R. Chittleborough, and Laura D. Howe. 2020.</w:t>
+      </w:r>
+      <w:r>
+        <w:t xml:space="preserve"> </w:t>
+      </w:r>
+      <w:r>
+        <w:t xml:space="preserve">“Associations of Adverse Childhood Experiences with Educational Attainment and Adolescent Health and the Role of Family and Socioeconomic Factors:</w:t>
+      </w:r>
+      <w:r>
+        <w:t xml:space="preserve"> </w:t>
+      </w:r>
+      <w:r>
+        <w:t xml:space="preserve">A</w:t>
+      </w:r>
+      <w:r>
+        <w:t xml:space="preserve"> </w:t>
+      </w:r>
+      <w:r>
+        <w:t xml:space="preserve">Prospective Cohort Study in the</w:t>
+      </w:r>
+      <w:r>
+        <w:t xml:space="preserve"> </w:t>
+      </w:r>
+      <w:r>
+        <w:t xml:space="preserve">UK</w:t>
+      </w:r>
+      <w:r>
+        <w:t xml:space="preserve">.”</w:t>
+      </w:r>
+      <w:r>
+        <w:t xml:space="preserve"> </w:t>
+      </w:r>
+      <w:r>
+        <w:rPr>
+          <w:i/>
+          <w:iCs/>
+        </w:rPr>
+        <w:t xml:space="preserve">PLOS Medicine</w:t>
+      </w:r>
+      <w:r>
+        <w:t xml:space="preserve"> </w:t>
+      </w:r>
+      <w:r>
+        <w:t xml:space="preserve">17 (3): e1003031.</w:t>
+      </w:r>
+      <w:r>
+        <w:t xml:space="preserve"> </w:t>
+      </w:r>
+      <w:hyperlink r:id="rId156">
+        <w:r>
+          <w:rPr>
+            <w:rStyle w:val="Hyperlink"/>
+          </w:rPr>
+          <w:t xml:space="preserve">https://doi.org/10.1371/journal.pmed.1003031</w:t>
+        </w:r>
+      </w:hyperlink>
+      <w:r>
+        <w:t xml:space="preserve">.</w:t>
+      </w:r>
+    </w:p>
+    <w:bookmarkEnd w:id="157"/>
+    <w:bookmarkStart w:id="159" w:name="ref-Karan2021"/>
+    <w:p>
+      <w:pPr>
+        <w:pStyle w:val="Bibliography"/>
+      </w:pPr>
+      <w:r>
         <w:t xml:space="preserve">Karan, Maira, Danny Rahal, David M. Almeida, et al. 2021.</w:t>
       </w:r>
       <w:r>
@@ -9989,7 +10810,7 @@
       <w:r>
         <w:t xml:space="preserve"> </w:t>
       </w:r>
-      <w:hyperlink r:id="rId160">
+      <w:hyperlink r:id="rId158">
         <w:r>
           <w:rPr>
             <w:rStyle w:val="Hyperlink"/>
@@ -10001,8 +10822,8 @@
         <w:t xml:space="preserve">.</w:t>
       </w:r>
     </w:p>
-    <w:bookmarkEnd w:id="161"/>
-    <w:bookmarkStart w:id="163" w:name="ref-macleod_supporting_2015"/>
+    <w:bookmarkEnd w:id="159"/>
+    <w:bookmarkStart w:id="161" w:name="ref-macleod_supporting_2015"/>
     <w:p>
       <w:pPr>
         <w:pStyle w:val="Bibliography"/>
@@ -10159,7 +10980,7 @@
       <w:r>
         <w:t xml:space="preserve"> </w:t>
       </w:r>
-      <w:hyperlink r:id="rId162">
+      <w:hyperlink r:id="rId160">
         <w:r>
           <w:rPr>
             <w:rStyle w:val="Hyperlink"/>
@@ -10171,8 +10992,8 @@
         <w:t xml:space="preserve">.</w:t>
       </w:r>
     </w:p>
-    <w:bookmarkEnd w:id="163"/>
-    <w:bookmarkStart w:id="165" w:name="ref-Menzies2023"/>
+    <w:bookmarkEnd w:id="161"/>
+    <w:bookmarkStart w:id="163" w:name="ref-Menzies2023"/>
     <w:p>
       <w:pPr>
         <w:pStyle w:val="Bibliography"/>
@@ -10205,7 +11026,7 @@
       <w:r>
         <w:t xml:space="preserve"> </w:t>
       </w:r>
-      <w:hyperlink r:id="rId164">
+      <w:hyperlink r:id="rId162">
         <w:r>
           <w:rPr>
             <w:rStyle w:val="Hyperlink"/>
@@ -10217,8 +11038,8 @@
         <w:t xml:space="preserve">.</w:t>
       </w:r>
     </w:p>
-    <w:bookmarkEnd w:id="165"/>
-    <w:bookmarkStart w:id="167" w:name="ref-nakagawa_coefficient_2017"/>
+    <w:bookmarkEnd w:id="163"/>
+    <w:bookmarkStart w:id="165" w:name="ref-nakagawa_coefficient_2017"/>
     <w:p>
       <w:pPr>
         <w:pStyle w:val="Bibliography"/>
@@ -10263,7 +11084,7 @@
       <w:r>
         <w:t xml:space="preserve"> </w:t>
       </w:r>
-      <w:hyperlink r:id="rId166">
+      <w:hyperlink r:id="rId164">
         <w:r>
           <w:rPr>
             <w:rStyle w:val="Hyperlink"/>
@@ -10275,8 +11096,8 @@
         <w:t xml:space="preserve">.</w:t>
       </w:r>
     </w:p>
-    <w:bookmarkEnd w:id="167"/>
-    <w:bookmarkStart w:id="169" w:name="ref-nakagawa_general_2013"/>
+    <w:bookmarkEnd w:id="165"/>
+    <w:bookmarkStart w:id="167" w:name="ref-nakagawa_general_2013"/>
     <w:p>
       <w:pPr>
         <w:pStyle w:val="Bibliography"/>
@@ -10321,7 +11142,7 @@
       <w:r>
         <w:t xml:space="preserve"> </w:t>
       </w:r>
-      <w:hyperlink r:id="rId168">
+      <w:hyperlink r:id="rId166">
         <w:r>
           <w:rPr>
             <w:rStyle w:val="Hyperlink"/>
@@ -10333,8 +11154,8 @@
         <w:t xml:space="preserve">.</w:t>
       </w:r>
     </w:p>
-    <w:bookmarkEnd w:id="169"/>
-    <w:bookmarkStart w:id="171" w:name="ref-Nakajima2024"/>
+    <w:bookmarkEnd w:id="167"/>
+    <w:bookmarkStart w:id="169" w:name="ref-Nakajima2024"/>
     <w:p>
       <w:pPr>
         <w:pStyle w:val="Bibliography"/>
@@ -10379,7 +11200,7 @@
       <w:r>
         <w:t xml:space="preserve"> </w:t>
       </w:r>
-      <w:hyperlink r:id="rId170">
+      <w:hyperlink r:id="rId168">
         <w:r>
           <w:rPr>
             <w:rStyle w:val="Hyperlink"/>
@@ -10391,8 +11212,8 @@
         <w:t xml:space="preserve">.</w:t>
       </w:r>
     </w:p>
-    <w:bookmarkEnd w:id="171"/>
-    <w:bookmarkStart w:id="173" w:name="ref-Otsuka2025"/>
+    <w:bookmarkEnd w:id="169"/>
+    <w:bookmarkStart w:id="171" w:name="ref-Otsuka2025"/>
     <w:p>
       <w:pPr>
         <w:pStyle w:val="Bibliography"/>
@@ -10437,7 +11258,7 @@
       <w:r>
         <w:t xml:space="preserve"> </w:t>
       </w:r>
-      <w:hyperlink r:id="rId172">
+      <w:hyperlink r:id="rId170">
         <w:r>
           <w:rPr>
             <w:rStyle w:val="Hyperlink"/>
@@ -10449,8 +11270,8 @@
         <w:t xml:space="preserve">.</w:t>
       </w:r>
     </w:p>
-    <w:bookmarkEnd w:id="173"/>
-    <w:bookmarkStart w:id="175" w:name="ref-Pereira2014"/>
+    <w:bookmarkEnd w:id="171"/>
+    <w:bookmarkStart w:id="173" w:name="ref-Pereira2014"/>
     <w:p>
       <w:pPr>
         <w:pStyle w:val="Bibliography"/>
@@ -10483,7 +11304,7 @@
       <w:r>
         <w:t xml:space="preserve"> </w:t>
       </w:r>
-      <w:hyperlink r:id="rId174">
+      <w:hyperlink r:id="rId172">
         <w:r>
           <w:rPr>
             <w:rStyle w:val="Hyperlink"/>
@@ -10495,36 +11316,109 @@
         <w:t xml:space="preserve">.</w:t>
       </w:r>
     </w:p>
+    <w:bookmarkEnd w:id="173"/>
+    <w:bookmarkStart w:id="175" w:name="ref-Pradhan2017"/>
+    <w:p>
+      <w:pPr>
+        <w:pStyle w:val="Bibliography"/>
+      </w:pPr>
+      <w:r>
+        <w:t xml:space="preserve">Pradhan, Rajesh Kumar, and Nandita Sinha. 2017.</w:t>
+      </w:r>
+      <w:r>
+        <w:t xml:space="preserve"> </w:t>
+      </w:r>
+      <w:r>
+        <w:t xml:space="preserve">“Impact of Commuting Distance and School Timing on Sleep of School Students.”</w:t>
+      </w:r>
+      <w:r>
+        <w:t xml:space="preserve"> </w:t>
+      </w:r>
+      <w:r>
+        <w:rPr>
+          <w:i/>
+          <w:iCs/>
+        </w:rPr>
+        <w:t xml:space="preserve">Sleep and Biological Rhythms</w:t>
+      </w:r>
+      <w:r>
+        <w:t xml:space="preserve"> </w:t>
+      </w:r>
+      <w:r>
+        <w:t xml:space="preserve">15 (2): 153–58.</w:t>
+      </w:r>
+      <w:r>
+        <w:t xml:space="preserve"> </w:t>
+      </w:r>
+      <w:hyperlink r:id="rId174">
+        <w:r>
+          <w:rPr>
+            <w:rStyle w:val="Hyperlink"/>
+          </w:rPr>
+          <w:t xml:space="preserve">https://doi.org/10.1007/s41105-017-0091-0</w:t>
+        </w:r>
+      </w:hyperlink>
+      <w:r>
+        <w:t xml:space="preserve">.</w:t>
+      </w:r>
+    </w:p>
     <w:bookmarkEnd w:id="175"/>
-    <w:bookmarkStart w:id="177" w:name="ref-Pradhan2017"/>
+    <w:bookmarkStart w:id="177" w:name="ref-Rakesh2025"/>
     <w:p>
       <w:pPr>
         <w:pStyle w:val="Bibliography"/>
       </w:pPr>
       <w:r>
-        <w:t xml:space="preserve">Pradhan, Rajesh Kumar, and Nandita Sinha. 2017.</w:t>
-      </w:r>
-      <w:r>
-        <w:t xml:space="preserve"> </w:t>
-      </w:r>
-      <w:r>
-        <w:t xml:space="preserve">“Impact of Commuting Distance and School Timing on Sleep of School Students.”</w:t>
-      </w:r>
-      <w:r>
-        <w:t xml:space="preserve"> </w:t>
-      </w:r>
-      <w:r>
-        <w:rPr>
-          <w:i/>
-          <w:iCs/>
-        </w:rPr>
-        <w:t xml:space="preserve">Sleep and Biological Rhythms</w:t>
-      </w:r>
-      <w:r>
-        <w:t xml:space="preserve"> </w:t>
-      </w:r>
-      <w:r>
-        <w:t xml:space="preserve">15 (2): 153–58.</w:t>
+        <w:t xml:space="preserve">Rakesh, Divyangana, Paris Anne Lee, Amruta Gaikwad, and Katie A. McLaughlin. 2025.</w:t>
+      </w:r>
+      <w:r>
+        <w:t xml:space="preserve"> </w:t>
+      </w:r>
+      <w:r>
+        <w:t xml:space="preserve">“Annual</w:t>
+      </w:r>
+      <w:r>
+        <w:t xml:space="preserve"> </w:t>
+      </w:r>
+      <w:r>
+        <w:t xml:space="preserve">Research</w:t>
+      </w:r>
+      <w:r>
+        <w:t xml:space="preserve"> </w:t>
+      </w:r>
+      <w:r>
+        <w:t xml:space="preserve">Review</w:t>
+      </w:r>
+      <w:r>
+        <w:t xml:space="preserve">:</w:t>
+      </w:r>
+      <w:r>
+        <w:t xml:space="preserve"> </w:t>
+      </w:r>
+      <w:r>
+        <w:t xml:space="preserve">Associations</w:t>
+      </w:r>
+      <w:r>
+        <w:t xml:space="preserve"> </w:t>
+      </w:r>
+      <w:r>
+        <w:t xml:space="preserve">of Socioeconomic Status with Cognitive Function, Language Ability, and Academic Achievement in Youth: A Systematic Review of Mechanisms and Protective Factors.”</w:t>
+      </w:r>
+      <w:r>
+        <w:t xml:space="preserve"> </w:t>
+      </w:r>
+      <w:r>
+        <w:rPr>
+          <w:i/>
+          <w:iCs/>
+        </w:rPr>
+        <w:t xml:space="preserve">Journal of Child Psychology and Psychiatry</w:t>
+      </w:r>
+      <w:r>
+        <w:t xml:space="preserve"> </w:t>
+      </w:r>
+      <w:r>
+        <w:t xml:space="preserve">66 (4): 417–39.</w:t>
       </w:r>
       <w:r>
         <w:t xml:space="preserve"> </w:t>
@@ -10534,7 +11428,7 @@
           <w:rPr>
             <w:rStyle w:val="Hyperlink"/>
           </w:rPr>
-          <w:t xml:space="preserve">https://doi.org/10.1007/s41105-017-0091-0</w:t>
+          <w:t xml:space="preserve">https://doi.org/10.1111/jcpp.14082</w:t>
         </w:r>
       </w:hyperlink>
       <w:r>
@@ -11627,7 +12521,7 @@
           <w:rPr>
             <w:rStyle w:val="Hyperlink"/>
           </w:rPr>
-          <w:t xml:space="preserve">https://adamdennett.github.io/school_attainment_tool/data_overview.html</w:t>
+          <w:t xml:space="preserve">https://osf.io/x82j3/overview</w:t>
         </w:r>
       </w:hyperlink>
     </w:p>
@@ -12024,7 +12918,7 @@
       </w:hyperlink>
     </w:p>
   </w:footnote>
-  <w:footnote w:id="79">
+  <w:footnote w:id="80">
     <w:p>
       <w:pPr>
         <w:pStyle w:val="FootnoteText"/>
@@ -12044,7 +12938,7 @@
       <w:r>
         <w:t xml:space="preserve"> </w:t>
       </w:r>
-      <w:hyperlink r:id="rId80">
+      <w:hyperlink r:id="rId81">
         <w:r>
           <w:rPr>
             <w:rStyle w:val="Hyperlink"/>
@@ -12054,7 +12948,7 @@
       </w:hyperlink>
     </w:p>
   </w:footnote>
-  <w:footnote w:id="87">
+  <w:footnote w:id="88">
     <w:p>
       <w:pPr>
         <w:pStyle w:val="FootnoteText"/>
@@ -12084,7 +12978,7 @@
       </w:hyperlink>
     </w:p>
   </w:footnote>
-  <w:footnote w:id="89">
+  <w:footnote w:id="90">
     <w:p>
       <w:pPr>
         <w:pStyle w:val="FootnoteText"/>
@@ -12163,7 +13057,7 @@
       </w:r>
     </w:p>
   </w:footnote>
-  <w:footnote w:id="90">
+  <w:footnote w:id="91">
     <w:p>
       <w:pPr>
         <w:pStyle w:val="FootnoteText"/>
@@ -12209,7 +13103,7 @@
       </w:r>
     </w:p>
   </w:footnote>
-  <w:footnote w:id="93">
+  <w:footnote w:id="94">
     <w:p>
       <w:pPr>
         <w:pStyle w:val="FootnoteText"/>
@@ -12223,7 +13117,7 @@
       <w:r>
         <w:t xml:space="preserve"> </w:t>
       </w:r>
-      <w:hyperlink r:id="rId94">
+      <w:hyperlink r:id="rId95">
         <w:r>
           <w:rPr>
             <w:rStyle w:val="Hyperlink"/>
@@ -12233,7 +13127,7 @@
       </w:hyperlink>
     </w:p>
   </w:footnote>
-  <w:footnote w:id="96">
+  <w:footnote w:id="97">
     <w:p>
       <w:pPr>
         <w:pStyle w:val="FootnoteText"/>
@@ -12312,7 +13206,7 @@
       </w:r>
     </w:p>
   </w:footnote>
-  <w:footnote w:id="99">
+  <w:footnote w:id="100">
     <w:p>
       <w:pPr>
         <w:pStyle w:val="FootnoteText"/>
@@ -12332,7 +13226,7 @@
       <w:r>
         <w:t xml:space="preserve"> </w:t>
       </w:r>
-      <w:hyperlink r:id="rId100">
+      <w:hyperlink r:id="rId101">
         <w:r>
           <w:rPr>
             <w:rStyle w:val="Hyperlink"/>

</xml_diff>

<commit_message>
Add Moore et al. (2026) NFER reference; re-render PDF and DOCX
Replace the (Moore et al., 2006) placeholder in the single-lever
policy thinking section with a proper citation. Add the bibliography
entry: Moore, Del Pozo Segura and Julius (2026), "Understanding the
relationship between attendance, wellbeing and sense of belonging",
NFER. Note the placeholder year was 2006; the report is 2026.

Also picks up the user's manual edits to RPE_Paper.qmd (footnote links
and text). No other changes made to the qmd.

Co-Authored-By: Claude Opus 5 <noreply@anthropic.com>
</commit_message>
<xml_diff>
--- a/RPE_Paper.docx
+++ b/RPE_Paper.docx
@@ -150,7 +150,7 @@
         <w:pStyle w:val="BodyText"/>
       </w:pPr>
       <w:r>
-        <w:t xml:space="preserve">Raw data on the attainment gap, without context, was presented to the city alongside statements correlating concentrations of disadvantage with lower attainment. The gap was framed as a unique failure requiring urgent action; the second-order impacts of the proposed interventions — longer school journeys, displacement from local communities, effects on well-being — were not scrutinised in depth. Our modelling addresses a critical blind spot in local decision-making: without the ability to account for structural factors like absence and prior attainment, councillors and citizens were unaware that,</w:t>
+        <w:t xml:space="preserve">Raw data on the attainment gap, without context, was presented to the city alongside statements correlating concentrations of disadvantage with lower attainment. The gap was framed as a unique failure requiring urgent action; the second-order impacts of the proposed interventions - longer school journeys, displacement from local communities, effects on well-being - were not scrutinised in depth. Our modelling addresses a critical blind spot in local decision-making: without the ability to account for structural factors like absence and prior attainment, councillors and citizens were unaware that,</w:t>
       </w:r>
       <w:r>
         <w:t xml:space="preserve"> </w:t>
@@ -163,7 +163,7 @@
         <w:t xml:space="preserve">after controlling for absence in particular</w:t>
       </w:r>
       <w:r>
-        <w:t xml:space="preserve">, Brighton and Hove was already among the highest-performing LEAs nationally for taking students beyond those factors — ranking 7th of 151 for disadvantaged pupils and 5th for non-disadvantaged pupils. As we show later, that conditional ranking is itself a measure of how much the city’s severe absence problem is costing its disadvantaged pupils: set absence aside and the schools look exceptional; leave it in the ledger and the city is ordinary. These insights come from the analysis of open data presented in this paper and carried out after the consultation had closed. However, with more timely analysis and with this knowledge, the approach to improving outcomes for disadvantaged pupils in the city could have been more effective and different questions asked:</w:t>
+        <w:t xml:space="preserve">, Brighton and Hove was already among the highest-performing LEAs nationally for taking students beyond those factors - ranking 7th of 151 for disadvantaged pupils and 5th for non-disadvantaged pupils. As we show later, that conditional ranking is itself a measure of how much the city’s severe absence problem is costing its disadvantaged pupils: set absence aside and the schools look exceptional; leave it in the ledger and the city is ordinary. These insights come from the analysis of open data presented in this paper and carried out after the consultation had closed. However, with more timely analysis and with this knowledge, the approach to improving outcomes for disadvantaged pupils in the city could have been more effective and different questions asked:</w:t>
       </w:r>
       <w:r>
         <w:t xml:space="preserve"> </w:t>
@@ -204,7 +204,7 @@
         <w:pStyle w:val="BodyText"/>
       </w:pPr>
       <w:r>
-        <w:t xml:space="preserve">The discussions that led to this paper took place over an 18-month period spanning the 2024 and 2025 admissions consultations and involved a diverse group of parents, academics, policy practitioners and school governors. We do not claim our model is optimal or novel — the variables and effects are very similar to those reported by</w:t>
+        <w:t xml:space="preserve">The discussions that led to this paper took place over an 18-month period spanning the 2024 and 2025 admissions consultations and involved a diverse group of parents, academics, policy practitioners and school governors. We do not claim our model is optimal or novel - the variables and effects are very similar to those reported by</w:t>
       </w:r>
       <w:r>
         <w:t xml:space="preserve"> </w:t>
@@ -362,7 +362,7 @@
         <w:pStyle w:val="BodyText"/>
       </w:pPr>
       <w:r>
-        <w:t xml:space="preserve">Inequalities in GCSE outcomes are substantially mediated by prior attainment at National Curriculum Key Stage 2 (KS2 — the latter stages of primary school from ages 7 to 11</w:t>
+        <w:t xml:space="preserve">Inequalities in GCSE outcomes are substantially mediated by prior attainment at National Curriculum Key Stage 2 (KS2 - the latter stages of primary school from ages 7 to 11</w:t>
       </w:r>
       <w:r>
         <w:rPr>
@@ -404,7 +404,7 @@
         <w:t xml:space="preserve"> </w:t>
       </w:r>
       <w:r>
-        <w:t xml:space="preserve">— a conjecture that overlooks real-world consequences for communities, particularly where local social geographies mean de-concentration requires children travelling long distances.</w:t>
+        <w:t xml:space="preserve">- a conjecture that overlooks real-world consequences for communities, particularly where local social geographies mean de-concentration requires children travelling long distances.</w:t>
       </w:r>
     </w:p>
     <w:bookmarkEnd w:id="25"/>
@@ -523,7 +523,7 @@
         <w:t xml:space="preserve"> </w:t>
       </w:r>
       <w:r>
-        <w:t xml:space="preserve">action is an important and under-settled question. Some of the variation reflects school practice — pastoral systems, attendance follow-up and ethos — but a substantial share is driven by circumstances beyond the school gate: family poverty, physical and mental ill-health, special educational needs, caring responsibilities, and the broader adversities that depress attainment through multiple channels</w:t>
+        <w:t xml:space="preserve">action is an important and under-settled question. Some of the variation reflects school practice - pastoral systems, attendance follow-up and ethos - but a substantial share is driven by circumstances beyond the school gate: family poverty, physical and mental ill-health, special educational needs, caring responsibilities, and the broader adversities that depress attainment through multiple channels</w:t>
       </w:r>
       <w:r>
         <w:t xml:space="preserve"> </w:t>
@@ -532,7 +532,7 @@
         <w:t xml:space="preserve">(Houtepen et al. 2020; Rakesh et al. 2025)</w:t>
       </w:r>
       <w:r>
-        <w:t xml:space="preserve">. The steep, largely exogenous rise in absence since the pandemic underlines how much of the recent problem sits outside any individual school’s control. This distinction — between the intake-driven component of absence and the smaller portion a school can itself move — is central to how absence should be interpreted as a policy lever, and we make it explicit in our modelling in §5.5. It also implies that authority-wide improvement is unlikely to come from school-led practice-sharing alone, and more probably requires cross-departmental action spanning health, children’s services and family support alongside schools.</w:t>
+        <w:t xml:space="preserve">. The steep, largely exogenous rise in absence since the pandemic underlines how much of the recent problem sits outside any individual school’s control. This distinction - between the intake-driven component of absence and the smaller portion a school can itself move - is central to how absence should be interpreted as a policy lever, and we make it explicit in our modelling in §5.5. It also implies that authority-wide improvement is unlikely to come from school-led practice-sharing alone, and more probably requires cross-departmental action spanning health, children’s services and family support alongside schools.</w:t>
       </w:r>
     </w:p>
     <w:bookmarkEnd w:id="26"/>
@@ -683,7 +683,7 @@
         <w:t xml:space="preserve"> </w:t>
       </w:r>
       <w:r>
-        <w:t xml:space="preserve">reflects a localised concentration of agency factors — parental expectations, homework hours, lower unauthorised absence — rather than a purely geographic phenomenon.</w:t>
+        <w:t xml:space="preserve">reflects a localised concentration of agency factors - parental expectations, homework hours, lower unauthorised absence - rather than a purely geographic phenomenon.</w:t>
       </w:r>
     </w:p>
     <w:p>
@@ -691,12 +691,12 @@
         <w:pStyle w:val="BodyText"/>
       </w:pPr>
       <w:r>
-        <w:t xml:space="preserve">The factors affecting attainment are multifaceted and interrelated, and many drivers are well-established. With so many concurrently relevant predictors, however, it is difficult to judge their relative importance in any specific context. What is required is an analysis combining as many drivers as possible, so that their relative influences, interactions, and mediation pathways can be assessed concurrently — which is where we now turn.</w:t>
+        <w:t xml:space="preserve">The factors affecting attainment are multifaceted and interrelated, and many drivers are well-established. With so many concurrently relevant predictors, however, it is difficult to judge their relative importance in any specific context. What is required is an analysis combining as many drivers as possible, so that their relative influences, interactions, and mediation pathways can be assessed concurrently - which is where we now turn.</w:t>
       </w:r>
     </w:p>
     <w:bookmarkEnd w:id="27"/>
     <w:bookmarkEnd w:id="28"/>
-    <w:bookmarkStart w:id="37" w:name="data-and-methods"/>
+    <w:bookmarkStart w:id="34" w:name="data-and-methods"/>
     <w:p>
       <w:pPr>
         <w:pStyle w:val="Heading1"/>
@@ -705,7 +705,7 @@
         <w:t xml:space="preserve">3. Data and methods</w:t>
       </w:r>
     </w:p>
-    <w:bookmarkStart w:id="33" w:name="data"/>
+    <w:bookmarkStart w:id="31" w:name="data"/>
     <w:p>
       <w:pPr>
         <w:pStyle w:val="Heading2"/>
@@ -749,14 +749,14 @@
         <w:rPr>
           <w:rStyle w:val="FootnoteReference"/>
         </w:rPr>
-        <w:footnoteReference w:id="31"/>
+        <w:footnoteReference w:id="30"/>
       </w:r>
       <w:r>
         <w:t xml:space="preserve">), the analysis sample used in the models is approximately 12,200 observations. All data are school-level aggregates; interpretations relate to this level of aggregation.</w:t>
       </w:r>
     </w:p>
-    <w:bookmarkEnd w:id="33"/>
-    <w:bookmarkStart w:id="36" w:name="model-specification"/>
+    <w:bookmarkEnd w:id="31"/>
+    <w:bookmarkStart w:id="33" w:name="model-specification"/>
     <w:p>
       <w:pPr>
         <w:pStyle w:val="Heading2"/>
@@ -807,7 +807,7 @@
         <w:t xml:space="preserve"> </w:t>
       </w:r>
       <w:r>
-        <w:t xml:space="preserve">applied uniformly to every predictor: only the four skewed, strictly-positive count-and-rate variables — the disadvantage, absence and EAL percentages and teacher sickness days — enter in logged form, chosen on the basis of fit and the interpretability of elasticities. The remaining predictors, including the low-prior-attainment percentage, the segregation index and the workforce proportions, enter linearly. This variable-by-variable choice, together with supporting diagnostics (component-plus-residual plots and a comparison of logged, linear and spline treatments), is documented in the supplementary material; the log form is retained where it both improves fit and yields a policy-legible elasticity, and a linear form is used otherwise.</w:t>
+        <w:t xml:space="preserve">applied uniformly to every predictor: only the four skewed, strictly-positive count-and-rate variables - the disadvantage, absence and EAL percentages and teacher sickness days - enter in logged form, chosen on the basis of fit and the interpretability of elasticities. The remaining predictors, including the low-prior-attainment percentage, the segregation index and the workforce proportions, enter linearly. This variable-by-variable choice, together with supporting diagnostics (component-plus-residual plots and a comparison of logged, linear and spline treatments), is documented in the supplementary material; the log form is retained where it both improves fit and yields a policy-legible elasticity, and a linear form is used otherwise.</w:t>
       </w:r>
     </w:p>
     <w:p>
@@ -1059,6 +1059,243 @@
           </m:sSub>
         </m:oMath>
       </m:oMathPara>
+      <m:oMathPara>
+        <m:oMathParaPr>
+          <m:jc m:val="center"/>
+        </m:oMathParaPr>
+        <m:oMath>
+          <m:r>
+            <m:rPr>
+              <m:sty m:val="p"/>
+            </m:rPr>
+            <m:t>log</m:t>
+          </m:r>
+          <m:d>
+            <m:dPr>
+              <m:begChr m:val="("/>
+              <m:sepChr m:val=""/>
+              <m:endChr m:val=")"/>
+              <m:grow/>
+            </m:dPr>
+            <m:e>
+              <m:sSub>
+                <m:e>
+                  <m:r>
+                    <m:rPr>
+                      <m:nor/>
+                      <m:sty m:val="p"/>
+                    </m:rPr>
+                    <m:t>ATT8</m:t>
+                  </m:r>
+                </m:e>
+                <m:sub>
+                  <m:r>
+                    <m:t>i</m:t>
+                  </m:r>
+                  <m:r>
+                    <m:t>j</m:t>
+                  </m:r>
+                </m:sub>
+              </m:sSub>
+            </m:e>
+          </m:d>
+          <m:r>
+            <m:rPr>
+              <m:sty m:val="p"/>
+            </m:rPr>
+            <m:t>=</m:t>
+          </m:r>
+          <m:sSub>
+            <m:e>
+              <m:r>
+                <m:t>β</m:t>
+              </m:r>
+            </m:e>
+            <m:sub>
+              <m:r>
+                <m:t>0</m:t>
+              </m:r>
+            </m:sub>
+          </m:sSub>
+          <m:r>
+            <m:rPr>
+              <m:sty m:val="p"/>
+            </m:rPr>
+            <m:t>+</m:t>
+          </m:r>
+          <m:nary>
+            <m:naryPr>
+              <m:chr m:val="∑"/>
+              <m:limLoc m:val="undOvr"/>
+              <m:subHide m:val="off"/>
+              <m:supHide m:val="off"/>
+            </m:naryPr>
+            <m:sub>
+              <m:r>
+                <m:t>k</m:t>
+              </m:r>
+              <m:r>
+                <m:rPr>
+                  <m:sty m:val="p"/>
+                </m:rPr>
+                <m:t>=</m:t>
+              </m:r>
+              <m:r>
+                <m:t>1</m:t>
+              </m:r>
+            </m:sub>
+            <m:sup>
+              <m:r>
+                <m:t>9</m:t>
+              </m:r>
+            </m:sup>
+            <m:e>
+              <m:sSub>
+                <m:e>
+                  <m:r>
+                    <m:t>β</m:t>
+                  </m:r>
+                </m:e>
+                <m:sub>
+                  <m:r>
+                    <m:t>k</m:t>
+                  </m:r>
+                </m:sub>
+              </m:sSub>
+            </m:e>
+          </m:nary>
+          <m:r>
+            <m:t> </m:t>
+          </m:r>
+          <m:sSub>
+            <m:e>
+              <m:r>
+                <m:t>x</m:t>
+              </m:r>
+            </m:e>
+            <m:sub>
+              <m:r>
+                <m:t>k</m:t>
+              </m:r>
+              <m:r>
+                <m:t>i</m:t>
+              </m:r>
+              <m:r>
+                <m:t>j</m:t>
+              </m:r>
+            </m:sub>
+          </m:sSub>
+          <m:r>
+            <m:rPr>
+              <m:sty m:val="p"/>
+            </m:rPr>
+            <m:t>+</m:t>
+          </m:r>
+          <m:sSub>
+            <m:e>
+              <m:r>
+                <m:t>u</m:t>
+              </m:r>
+            </m:e>
+            <m:sub>
+              <m:r>
+                <m:rPr>
+                  <m:nor/>
+                  <m:sty m:val="p"/>
+                </m:rPr>
+                <m:t>year</m:t>
+              </m:r>
+            </m:sub>
+          </m:sSub>
+          <m:r>
+            <m:rPr>
+              <m:sty m:val="p"/>
+            </m:rPr>
+            <m:t>+</m:t>
+          </m:r>
+          <m:sSub>
+            <m:e>
+              <m:r>
+                <m:t>u</m:t>
+              </m:r>
+            </m:e>
+            <m:sub>
+              <m:r>
+                <m:rPr>
+                  <m:nor/>
+                  <m:sty m:val="p"/>
+                </m:rPr>
+                <m:t>Ofsted</m:t>
+              </m:r>
+            </m:sub>
+          </m:sSub>
+          <m:r>
+            <m:rPr>
+              <m:sty m:val="p"/>
+            </m:rPr>
+            <m:t>+</m:t>
+          </m:r>
+          <m:sSub>
+            <m:e>
+              <m:r>
+                <m:t>u</m:t>
+              </m:r>
+            </m:e>
+            <m:sub>
+              <m:r>
+                <m:rPr>
+                  <m:nor/>
+                  <m:sty m:val="p"/>
+                </m:rPr>
+                <m:t>region</m:t>
+              </m:r>
+            </m:sub>
+          </m:sSub>
+          <m:r>
+            <m:rPr>
+              <m:sty m:val="p"/>
+            </m:rPr>
+            <m:t>+</m:t>
+          </m:r>
+          <m:sSub>
+            <m:e>
+              <m:r>
+                <m:t>u</m:t>
+              </m:r>
+            </m:e>
+            <m:sub>
+              <m:r>
+                <m:rPr>
+                  <m:nor/>
+                  <m:sty m:val="p"/>
+                </m:rPr>
+                <m:t>LA|region</m:t>
+              </m:r>
+            </m:sub>
+          </m:sSub>
+          <m:r>
+            <m:rPr>
+              <m:sty m:val="p"/>
+            </m:rPr>
+            <m:t>+</m:t>
+          </m:r>
+          <m:sSub>
+            <m:e>
+              <m:r>
+                <m:t>ε</m:t>
+              </m:r>
+            </m:e>
+            <m:sub>
+              <m:r>
+                <m:t>i</m:t>
+              </m:r>
+              <m:r>
+                <m:t>j</m:t>
+              </m:r>
+            </m:sub>
+          </m:sSub>
+        </m:oMath>
+      </m:oMathPara>
     </w:p>
     <w:p>
       <w:pPr>
@@ -1147,7 +1384,7 @@
         <w:rPr>
           <w:rStyle w:val="FootnoteReference"/>
         </w:rPr>
-        <w:footnoteReference w:id="34"/>
+        <w:footnoteReference w:id="32"/>
       </w:r>
       <w:r>
         <w:t xml:space="preserve">.</w:t>
@@ -1223,7 +1460,7 @@
         <w:t xml:space="preserve">percentage of KS4 pupils with low KS2 prior attainment</w:t>
       </w:r>
       <w:r>
-        <w:t xml:space="preserve">, rather than the mean KS2 scaled score. This is a data-availability constraint, not a preference: the DfE publishes school-level mean KS2 score (and the middle and high prior-attainment bands) for only three of our four years — it is not released for 2024-25 — so the low-prior-attainment share is the only prior-attainment measure spanning the full panel, and we use it to preserve the most recent and policy-relevant cohort. As a robustness check, we refit the models on the three-year sub-sample where the richer measures exist, adding mean KS2 scaled score; the absence coefficient — the paper’s central quantity — is essentially unchanged (a shift of under 3%), while the FSM coefficient attenuates by around a third, reinforcing rather than weakening our finding that concentration of disadvantage is a comparatively weak lever (supplementary material). Second, because we lack pupil-level data, prior attainment is corrected only at the school level; this is a coarser adjustment than a pupil-and-school-level correction would provide, and some residual confounding of the intake coefficients cannot be ruled out. We return to this limitation in §6.7.</w:t>
+        <w:t xml:space="preserve">, rather than the mean KS2 scaled score. This is a data-availability constraint, not a preference: the DfE publishes school-level mean KS2 score (and the middle and high prior-attainment bands) for only three of our four years - it is not released for 2024-25 - so the low-prior-attainment share is the only prior-attainment measure spanning the full panel, and we use it to preserve the most recent and policy-relevant cohort. As a robustness check, we refit the models on the three-year sub-sample where the richer measures exist, adding mean KS2 scaled score; the absence coefficient - the paper’s central quantity - is essentially unchanged (a shift of under 3%), while the FSM coefficient attenuates by around a third, reinforcing rather than weakening our finding that concentration of disadvantage is a comparatively weak lever (supplementary material). Second, because we lack pupil-level data, prior attainment is corrected only at the school level; this is a coarser adjustment than a pupil-and-school-level correction would provide, and some residual confounding of the intake coefficients cannot be ruled out. We return to this limitation later in the paper.</w:t>
       </w:r>
     </w:p>
     <w:p>
@@ -1249,9 +1486,9 @@
         <w:t xml:space="preserve">package in R with Restricted Maximum Likelihood estimation.</w:t>
       </w:r>
     </w:p>
-    <w:bookmarkEnd w:id="36"/>
-    <w:bookmarkEnd w:id="37"/>
-    <w:bookmarkStart w:id="51" w:name="results"/>
+    <w:bookmarkEnd w:id="33"/>
+    <w:bookmarkEnd w:id="34"/>
+    <w:bookmarkStart w:id="46" w:name="results"/>
     <w:p>
       <w:pPr>
         <w:pStyle w:val="Heading1"/>
@@ -1260,7 +1497,7 @@
         <w:t xml:space="preserve">4. Results</w:t>
       </w:r>
     </w:p>
-    <w:bookmarkStart w:id="38" w:name="model-fit"/>
+    <w:bookmarkStart w:id="35" w:name="model-fit"/>
     <w:p>
       <w:pPr>
         <w:pStyle w:val="Heading2"/>
@@ -1295,13 +1532,7 @@
         <w:t xml:space="preserve">Nakagawa et al. (2017)</w:t>
       </w:r>
       <w:r>
-        <w:t xml:space="preserve">Nakagawa et al. (2017)</w:t>
-      </w:r>
-      <w:r>
-        <w:t xml:space="preserve"> </w:t>
-      </w:r>
-      <w:r>
-        <w:t xml:space="preserve">to calculate indicative</w:t>
+        <w:t xml:space="preserve">@nakagawa_coefficient_2017 to calculate indicative</w:t>
       </w:r>
       <w:r>
         <w:t xml:space="preserve"> </w:t>
@@ -1396,8 +1627,8 @@
         <w:t xml:space="preserve">is 0.73; for non-disadvantaged pupils, 0.79. School-level attainment is remarkably predictable from these structural factors, which makes them very useful for exploring the effectiveness of local policy levers.</w:t>
       </w:r>
     </w:p>
-    <w:bookmarkEnd w:id="38"/>
-    <w:bookmarkStart w:id="40" w:name="stepwise-decomposition"/>
+    <w:bookmarkEnd w:id="35"/>
+    <w:bookmarkStart w:id="37" w:name="stepwise-decomposition"/>
     <w:p>
       <w:pPr>
         <w:pStyle w:val="Heading2"/>
@@ -1419,7 +1650,7 @@
       <w:tr>
         <w:tc>
           <w:tcPr/>
-          <w:bookmarkStart w:id="39" w:name="tbl-stepwise"/>
+          <w:bookmarkStart w:id="36" w:name="tbl-stepwise"/>
           <w:p>
             <w:pPr>
               <w:jc w:val="center"/>
@@ -4017,7 +4248,7 @@
               </w:tc>
             </w:tr>
           </w:tbl>
-          <w:bookmarkEnd w:id="39"/>
+          <w:bookmarkEnd w:id="36"/>
           <w:p/>
         </w:tc>
       </w:tr>
@@ -4075,7 +4306,7 @@
         <w:t xml:space="preserve"> </w:t>
       </w:r>
       <w:r>
-        <w:t xml:space="preserve">from 0.63 (marginal) to approximately 0.77, indicating that 14% of attainment variance is tied to these grouping factors — capturing unmeasured factors such as school culture, leadership quality, local authority support services, and community characteristics.</w:t>
+        <w:t xml:space="preserve">from 0.63 (marginal) to approximately 0.77, indicating that 14% of attainment variance is tied to these grouping factors - capturing unmeasured factors such as school culture, leadership quality, local authority support services, and community characteristics.</w:t>
       </w:r>
     </w:p>
     <w:p>
@@ -4131,7 +4362,7 @@
         <w:t xml:space="preserve"> </w:t>
       </w:r>
       <w:r>
-        <w:t xml:space="preserve">with 4.7 fewer — a scale that flattens markedly at the bottom, so that the gap between the two lowest ratings is small. We treat Ofsted as a contextual control rather than a causal factor throughout, since inspection judgements are formed with sight of a school’s results and are therefore partly an expression of attainment rather than an independent driver of it; consistent with this, omitting Ofsted entirely</w:t>
+        <w:t xml:space="preserve">with 4.7 fewer - a scale that flattens markedly at the bottom, so that the gap between the two lowest ratings is small. We treat Ofsted as a contextual control rather than a causal factor throughout, since inspection judgements are formed with sight of a school’s results and are therefore partly an expression of attainment rather than an independent driver of it; consistent with this, omitting Ofsted entirely</w:t>
       </w:r>
       <w:r>
         <w:t xml:space="preserve"> </w:t>
@@ -4163,7 +4394,7 @@
         <w:pStyle w:val="BodyText"/>
       </w:pPr>
       <w:r>
-        <w:t xml:space="preserve">A crucial feature of these models is that the log-transformed variables encode non-linear relationships. The same percentage-point change produces different effects depending on where a school starts. For concentrations of disadvantage, the relationship between FSM and attainment flattens above about 20% FSM — further increases in disadvantage do not correlate with noticeable further declines. Most of the strong effect appears below 15%, where further reductions are correlated with much steeper attainment increases. This non-linearity has direct policy consequences: individual LEAs need to consider carefully where each school sits on the distribution to appreciate what changes might realistically achieve. We make the practical magnitude concrete in §5.3 (</w:t>
+        <w:t xml:space="preserve">A crucial feature of these models is that the log-transformed variables encode non-linear relationships. The same percentage-point change produces different effects depending on where a school starts. For concentrations of disadvantage, the relationship between FSM and attainment flattens above about 20% FSM - further increases in disadvantage do not correlate with noticeable further declines. Most of the strong effect appears below 15%, where further reductions are correlated with much steeper attainment increases. This non-linearity has direct policy consequences: individual LEAs need to consider carefully where each school sits on the distribution to appreciate what changes might realistically achieve. We make the practical magnitude concrete in §5.3 (</w:t>
       </w:r>
       <w:hyperlink w:anchor="fig-accelerating-returns">
         <w:r>
@@ -4177,8 +4408,8 @@
         <w:t xml:space="preserve">), which translates the coefficients into the expected Attainment 8 gain from a one-percentage-point change at each point along the absence and disadvantage distributions.</w:t>
       </w:r>
     </w:p>
-    <w:bookmarkEnd w:id="40"/>
-    <w:bookmarkStart w:id="50" w:name="relative-variable-importance"/>
+    <w:bookmarkEnd w:id="37"/>
+    <w:bookmarkStart w:id="45" w:name="relative-variable-importance"/>
     <w:p>
       <w:pPr>
         <w:pStyle w:val="Heading2"/>
@@ -4200,7 +4431,7 @@
       <w:tr>
         <w:tc>
           <w:tcPr/>
-          <w:bookmarkStart w:id="44" w:name="fig-standardised-coefficients"/>
+          <w:bookmarkStart w:id="41" w:name="fig-standardised-coefficients"/>
           <w:p>
             <w:pPr>
               <w:pStyle w:val="Compact"/>
@@ -4211,18 +4442,18 @@
                 <wp:inline>
                   <wp:extent cx="5943600" cy="4245428"/>
                   <wp:effectExtent b="0" l="0" r="0" t="0"/>
-                  <wp:docPr descr="" title="" id="42" name="Picture"/>
+                  <wp:docPr descr="" title="" id="39" name="Picture"/>
                   <a:graphic>
                     <a:graphicData uri="http://schemas.openxmlformats.org/drawingml/2006/picture">
                       <pic:pic>
                         <pic:nvPicPr>
-                          <pic:cNvPr descr="RPE_Paper_files/figure-docx/fig-standardised-coefficients-1.png" id="43" name="Picture"/>
+                          <pic:cNvPr descr="RPE_Paper_files/figure-docx/fig-standardised-coefficients-1.png" id="40" name="Picture"/>
                           <pic:cNvPicPr>
                             <a:picLocks noChangeArrowheads="1" noChangeAspect="1"/>
                           </pic:cNvPicPr>
                         </pic:nvPicPr>
                         <pic:blipFill>
-                          <a:blip r:embed="rId41"/>
+                          <a:blip r:embed="rId38"/>
                           <a:stretch>
                             <a:fillRect/>
                           </a:stretch>
@@ -4262,7 +4493,7 @@
               <w:t xml:space="preserve">Figure 1: Standardised coefficients showing relative variable importance across pupil groups. Bars show the change in log(ATT8) associated with a one-SD shift in each predictor.</w:t>
             </w:r>
           </w:p>
-          <w:bookmarkEnd w:id="44"/>
+          <w:bookmarkEnd w:id="41"/>
         </w:tc>
       </w:tr>
     </w:tbl>
@@ -4288,7 +4519,7 @@
         <w:rPr>
           <w:rStyle w:val="FootnoteReference"/>
         </w:rPr>
-        <w:footnoteReference w:id="45"/>
+        <w:footnoteReference w:id="42"/>
       </w:r>
       <w:r>
         <w:t xml:space="preserve"> </w:t>
@@ -4300,7 +4531,7 @@
         <w:rPr>
           <w:rStyle w:val="FootnoteReference"/>
         </w:rPr>
-        <w:footnoteReference w:id="46"/>
+        <w:footnoteReference w:id="43"/>
       </w:r>
       <w:r>
         <w:t xml:space="preserve">). Absence is the dominant predictor across all groups, but it is</w:t>
@@ -4319,7 +4550,7 @@
         <w:t xml:space="preserve"> </w:t>
       </w:r>
       <w:r>
-        <w:t xml:space="preserve">important for disadvantaged pupils — nearly half of the variation in school-level performance for this group is explained by attendance alone.</w:t>
+        <w:t xml:space="preserve">important for disadvantaged pupils - nearly half of the variation in school-level performance for this group is explained by attendance alone.</w:t>
       </w:r>
     </w:p>
     <w:p>
@@ -4338,7 +4569,7 @@
         <w:t xml:space="preserve"> </w:t>
       </w:r>
       <w:r>
-        <w:t xml:space="preserve">makes the relative importance of the predictors explicit, and the ordering is the central empirical message of the paper. School absence is the dominant lever by a clear margin; low prior attainment at KS2 is second; and the concentration of disadvantage — the variable around which the Brighton and Hove policy was built — is a distant contributor whose sign, as we discuss next, actually depends on the pupil group. Recognising this ordering matters, because a policy debate anchored on disadvantage concentration is, on this evidence, anchored on one of the weakest of the levers available.</w:t>
+        <w:t xml:space="preserve">makes the relative importance of the predictors explicit, and the ordering is the central empirical message of the paper. School absence is the dominant lever by a clear margin; low prior attainment at KS2 is second; and the concentration of disadvantage - the variable around which the Brighton and Hove policy was built - is a distant contributor whose sign, as we discuss next, actually depends on the pupil group. Recognising this ordering matters, because a policy debate anchored on disadvantage concentration is, on this evidence, anchored on one of the weakest of the levers available.</w:t>
       </w:r>
     </w:p>
     <w:p>
@@ -4374,13 +4605,13 @@
         <w:t xml:space="preserve"> </w:t>
       </w:r>
       <w:r>
-        <w:t xml:space="preserve">— after controlling for absence and low prior attainment, disadvantaged pupils perform slightly better in schools with higher concentrations of other disadvantaged pupils. This finding is robust across individual year models and alternative specifications of disadvantaged attainment and disadvantage measures.</w:t>
+        <w:t xml:space="preserve">- after controlling for absence and low prior attainment, disadvantaged pupils perform slightly better in schools with higher concentrations of other disadvantaged pupils. This finding is robust across individual year models and alternative specifications of disadvantaged attainment and disadvantage measures.</w:t>
       </w:r>
       <w:r>
         <w:rPr>
           <w:rStyle w:val="FootnoteReference"/>
         </w:rPr>
-        <w:footnoteReference w:id="48"/>
+        <w:footnoteReference w:id="44"/>
       </w:r>
       <w:r>
         <w:t xml:space="preserve"> </w:t>
@@ -4402,7 +4633,7 @@
         <w:t xml:space="preserve"> </w:t>
       </w:r>
       <w:r>
-        <w:t xml:space="preserve">— schools with higher FSM proportions in certain LEAs appear to have developed effective support systems, possibly through targeted use of Pupil Premium funding and other specialisations.</w:t>
+        <w:t xml:space="preserve">- schools with higher FSM proportions in certain LEAs appear to have developed effective support systems, possibly through targeted use of Pupil Premium funding and other specialisations.</w:t>
       </w:r>
     </w:p>
     <w:p>
@@ -4462,7 +4693,7 @@
         <w:pStyle w:val="BodyText"/>
       </w:pPr>
       <w:r>
-        <w:t xml:space="preserve">For non-disadvantaged pupils, the effect of higher disadvantage concentrations is more clearly negative — being in a higher-disadvantage school depresses Attainment 8 for this group, possibly through peer effects or curriculum-resourcing dynamics. Both findings challenge the</w:t>
+        <w:t xml:space="preserve">For non-disadvantaged pupils, the effect of higher disadvantage concentrations is more clearly negative - being in a higher-disadvantage school depresses Attainment 8 for this group, possibly through peer effects or curriculum-resourcing dynamics. Both findings challenge the</w:t>
       </w:r>
       <w:r>
         <w:t xml:space="preserve"> </w:t>
@@ -4494,9 +4725,9 @@
         <w:t xml:space="preserve">, they could be actively counter-productive.</w:t>
       </w:r>
     </w:p>
-    <w:bookmarkEnd w:id="50"/>
-    <w:bookmarkEnd w:id="51"/>
-    <w:bookmarkStart w:id="87" w:name="brighton-and-hove-case-study"/>
+    <w:bookmarkEnd w:id="45"/>
+    <w:bookmarkEnd w:id="46"/>
+    <w:bookmarkStart w:id="81" w:name="brighton-and-hove-case-study"/>
     <w:p>
       <w:pPr>
         <w:pStyle w:val="Heading1"/>
@@ -4505,7 +4736,7 @@
         <w:t xml:space="preserve">5. Brighton and Hove case study</w:t>
       </w:r>
     </w:p>
-    <w:bookmarkStart w:id="63" w:name="local-context"/>
+    <w:bookmarkStart w:id="58" w:name="local-context"/>
     <w:p>
       <w:pPr>
         <w:pStyle w:val="Heading2"/>
@@ -4519,7 +4750,7 @@
         <w:pStyle w:val="FirstParagraph"/>
       </w:pPr>
       <w:r>
-        <w:t xml:space="preserve">Brighton and Hove has ten secondary schools: six community schools run by the LEA, two academies (Brighton Aldridge Community Academy — BACA — and Portslade Aldridge Community Academy — PACA) and two church schools (King’s and Cardinal Newman) that set their own admissions. Following the closure of CoMArt in the east of the city in 2005, large catchment areas were introduced (</w:t>
+        <w:t xml:space="preserve">Brighton and Hove has ten secondary schools: six community schools run by the LEA, two academies (Brighton Aldridge Community Academy - BACA - and Portslade Aldridge Community Academy - PACA) and two church schools (King’s and Cardinal Newman) that set their own admissions. Following the closure of CoMArt in the east of the city in 2005, large catchment areas were introduced (</w:t>
       </w:r>
       <w:hyperlink w:anchor="fig-catchments">
         <w:r>
@@ -4530,7 +4761,7 @@
         </w:r>
       </w:hyperlink>
       <w:r>
-        <w:t xml:space="preserve">) with a lottery tie-break for oversubscribed schools — making admissions very different to most other places in England where distance typically determines priority</w:t>
+        <w:t xml:space="preserve">) with a lottery tie-break for oversubscribed schools - making admissions very different to most other places in England where distance typically determines priority</w:t>
       </w:r>
       <w:r>
         <w:t xml:space="preserve"> </w:t>
@@ -4553,167 +4784,167 @@
         <w:rPr>
           <w:rStyle w:val="FootnoteReference"/>
         </w:rPr>
+        <w:footnoteReference w:id="47"/>
+      </w:r>
+      <w:r>
+        <w:t xml:space="preserve"> </w:t>
+      </w:r>
+      <w:r>
+        <w:t xml:space="preserve">set out three stated objectives:</w:t>
+      </w:r>
+      <w:r>
+        <w:t xml:space="preserve"> </w:t>
+      </w:r>
+      <w:r>
+        <w:rPr>
+          <w:i/>
+          <w:iCs/>
+        </w:rPr>
+        <w:t xml:space="preserve">‘a school system where all pupils get access to a great education’</w:t>
+      </w:r>
+      <w:r>
+        <w:t xml:space="preserve">, improving</w:t>
+      </w:r>
+      <w:r>
+        <w:t xml:space="preserve"> </w:t>
+      </w:r>
+      <w:r>
+        <w:rPr>
+          <w:i/>
+          <w:iCs/>
+        </w:rPr>
+        <w:t xml:space="preserve">‘the education offer for disadvantaged pupils by reducing some schools’</w:t>
+      </w:r>
+      <w:r>
+        <w:rPr>
+          <w:i/>
+          <w:iCs/>
+        </w:rPr>
+        <w:t xml:space="preserve"> </w:t>
+      </w:r>
+      <w:r>
+        <w:rPr>
+          <w:i/>
+          <w:iCs/>
+        </w:rPr>
+        <w:t xml:space="preserve">barriers to success’</w:t>
+      </w:r>
+      <w:r>
+        <w:t xml:space="preserve">, and</w:t>
+      </w:r>
+      <w:r>
+        <w:t xml:space="preserve"> </w:t>
+      </w:r>
+      <w:r>
+        <w:rPr>
+          <w:i/>
+          <w:iCs/>
+        </w:rPr>
+        <w:t xml:space="preserve">‘better equality of outcomes - results not driven by economic advantage’</w:t>
+      </w:r>
+      <w:r>
+        <w:t xml:space="preserve">. Alongside ran a School Organisation Strategy commitment to</w:t>
+      </w:r>
+      <w:r>
+        <w:t xml:space="preserve"> </w:t>
+      </w:r>
+      <w:r>
+        <w:rPr>
+          <w:i/>
+          <w:iCs/>
+        </w:rPr>
+        <w:t xml:space="preserve">‘schools which are sustainable and able to thrive’</w:t>
+      </w:r>
+      <w:r>
+        <w:t xml:space="preserve"> </w:t>
+      </w:r>
+      <w:r>
+        <w:t xml:space="preserve">against falling pupil numbers. The specific proposals were to reduce Published Admission Numbers (PANs) at Longhill, Blatchington Mill and Dorothy Stringer by a combined 120 places, redraw the Longhill/Dorothy Stringer/Varndean boundary, and reserve up to 20% of places in single-school catchment areas for out-of-catchment children. Underpinning the case was a reading of</w:t>
+      </w:r>
+      <w:r>
+        <w:t xml:space="preserve"> </w:t>
+      </w:r>
+      <w:r>
+        <w:t xml:space="preserve">Gorard and Siddiqui (2019)</w:t>
+      </w:r>
+      <w:r>
+        <w:t xml:space="preserve"> </w:t>
+      </w:r>
+      <w:r>
+        <w:t xml:space="preserve">in which more mixed intakes produce better outcomes for disadvantaged pupils, plus a premise that attainment in the city was</w:t>
+      </w:r>
+      <w:r>
+        <w:t xml:space="preserve"> </w:t>
+      </w:r>
+      <w:r>
+        <w:rPr>
+          <w:i/>
+          <w:iCs/>
+        </w:rPr>
+        <w:t xml:space="preserve">‘driven by economic advantage’</w:t>
+      </w:r>
+      <w:r>
+        <w:t xml:space="preserve"> </w:t>
+      </w:r>
+      <w:r>
+        <w:t xml:space="preserve">- a framing that implied that those who could afford to do so paid a housing premium to be near better schools in the city, but a characterisation empirically challenged in this context by</w:t>
+      </w:r>
+      <w:r>
+        <w:t xml:space="preserve"> </w:t>
+      </w:r>
+      <w:r>
+        <w:t xml:space="preserve">Tan and Dennett (2025)</w:t>
+      </w:r>
+      <w:r>
+        <w:t xml:space="preserve"> </w:t>
+      </w:r>
+      <w:r>
+        <w:t xml:space="preserve">who found that proximity to good schools in the city had a very small impact on prices. The 2024 proposals built on a 2023 policy giving FSM-eligible pupils priority at schools below the city-average (30%) FSM share, which was already producing flows from peripheral to central catchments.</w:t>
+      </w:r>
+    </w:p>
+    <w:p>
+      <w:pPr>
+        <w:pStyle w:val="BodyText"/>
+      </w:pPr>
+      <w:r>
+        <w:t xml:space="preserve">The public response was overwhelmingly negative, with the council’s pre-consultation feedback summary noting</w:t>
+      </w:r>
+      <w:r>
+        <w:t xml:space="preserve"> </w:t>
+      </w:r>
+      <w:r>
+        <w:rPr>
+          <w:i/>
+          <w:iCs/>
+        </w:rPr>
+        <w:t xml:space="preserve">‘a strong preference for improving existing schools rather than redistributing students, alongside deep concerns about potential impacts on community cohesion and student wellbeing’</w:t>
+      </w:r>
+      <w:r>
+        <w:t xml:space="preserve">. The proposals would, by the council’s own calculations, force significant numbers of children from central catchments to schools at the city’s periphery, potentially requiring over two hours of daily commuting. The council’s transport-implications appendix</w:t>
+      </w:r>
+      <w:r>
+        <w:rPr>
+          <w:rStyle w:val="FootnoteReference"/>
+        </w:rPr>
+        <w:footnoteReference w:id="50"/>
+      </w:r>
+      <w:r>
+        <w:t xml:space="preserve"> </w:t>
+      </w:r>
+      <w:r>
+        <w:t xml:space="preserve">reports approximately £606,000 already spent each year on supported bus routes and bus passes, with further travel-assistance spending likely to support new pupil flows generated by the admissions changes. Notably, the previous administration’s comprehensive strategy for tackling educational disadvantage</w:t>
+      </w:r>
+      <w:r>
+        <w:rPr>
+          <w:rStyle w:val="FootnoteReference"/>
+        </w:rPr>
         <w:footnoteReference w:id="52"/>
       </w:r>
       <w:r>
         <w:t xml:space="preserve"> </w:t>
       </w:r>
       <w:r>
-        <w:t xml:space="preserve">set out three stated objectives:</w:t>
-      </w:r>
-      <w:r>
-        <w:t xml:space="preserve"> </w:t>
-      </w:r>
-      <w:r>
-        <w:rPr>
-          <w:i/>
-          <w:iCs/>
-        </w:rPr>
-        <w:t xml:space="preserve">‘a school system where all pupils get access to a great education’</w:t>
-      </w:r>
-      <w:r>
-        <w:t xml:space="preserve">, improving</w:t>
-      </w:r>
-      <w:r>
-        <w:t xml:space="preserve"> </w:t>
-      </w:r>
-      <w:r>
-        <w:rPr>
-          <w:i/>
-          <w:iCs/>
-        </w:rPr>
-        <w:t xml:space="preserve">‘the education offer for disadvantaged pupils by reducing some schools’</w:t>
-      </w:r>
-      <w:r>
-        <w:rPr>
-          <w:i/>
-          <w:iCs/>
-        </w:rPr>
-        <w:t xml:space="preserve"> </w:t>
-      </w:r>
-      <w:r>
-        <w:rPr>
-          <w:i/>
-          <w:iCs/>
-        </w:rPr>
-        <w:t xml:space="preserve">barriers to success’</w:t>
-      </w:r>
-      <w:r>
-        <w:t xml:space="preserve">, and</w:t>
-      </w:r>
-      <w:r>
-        <w:t xml:space="preserve"> </w:t>
-      </w:r>
-      <w:r>
-        <w:rPr>
-          <w:i/>
-          <w:iCs/>
-        </w:rPr>
-        <w:t xml:space="preserve">‘better equality of outcomes — results not driven by economic advantage’</w:t>
-      </w:r>
-      <w:r>
-        <w:t xml:space="preserve">. Alongside ran a School Organisation Strategy commitment to</w:t>
-      </w:r>
-      <w:r>
-        <w:t xml:space="preserve"> </w:t>
-      </w:r>
-      <w:r>
-        <w:rPr>
-          <w:i/>
-          <w:iCs/>
-        </w:rPr>
-        <w:t xml:space="preserve">‘schools which are sustainable and able to thrive’</w:t>
-      </w:r>
-      <w:r>
-        <w:t xml:space="preserve"> </w:t>
-      </w:r>
-      <w:r>
-        <w:t xml:space="preserve">against falling pupil numbers. The specific proposals were to reduce Published Admission Numbers (PANs) at Longhill, Blatchington Mill and Dorothy Stringer by a combined 120 places, redraw the Longhill/Dorothy Stringer/Varndean boundary, and reserve up to 20% of places in single-school catchment areas for out-of-catchment children. Underpinning the case was a reading of</w:t>
-      </w:r>
-      <w:r>
-        <w:t xml:space="preserve"> </w:t>
-      </w:r>
-      <w:r>
-        <w:t xml:space="preserve">Gorard and Siddiqui (2019)</w:t>
-      </w:r>
-      <w:r>
-        <w:t xml:space="preserve"> </w:t>
-      </w:r>
-      <w:r>
-        <w:t xml:space="preserve">in which more mixed intakes produce better outcomes for disadvantaged pupils, plus a premise that attainment in the city was</w:t>
-      </w:r>
-      <w:r>
-        <w:t xml:space="preserve"> </w:t>
-      </w:r>
-      <w:r>
-        <w:rPr>
-          <w:i/>
-          <w:iCs/>
-        </w:rPr>
-        <w:t xml:space="preserve">‘driven by economic advantage’</w:t>
-      </w:r>
-      <w:r>
-        <w:t xml:space="preserve"> </w:t>
-      </w:r>
-      <w:r>
-        <w:t xml:space="preserve">— a framing that implied that those who could afford to do so paid a housing premium to be near better schools in the city, but a characterisation empirically challenged in this context by</w:t>
-      </w:r>
-      <w:r>
-        <w:t xml:space="preserve"> </w:t>
-      </w:r>
-      <w:r>
-        <w:t xml:space="preserve">Tan and Dennett (2025)</w:t>
-      </w:r>
-      <w:r>
-        <w:t xml:space="preserve"> </w:t>
-      </w:r>
-      <w:r>
-        <w:t xml:space="preserve">who found that proximity to good schools in the city had a very small impact on prices. The 2024 proposals built on a 2023 policy giving FSM-eligible pupils priority at schools below the city-average (30%) FSM share, which was already producing flows from peripheral to central catchments.</w:t>
-      </w:r>
-    </w:p>
-    <w:p>
-      <w:pPr>
-        <w:pStyle w:val="BodyText"/>
-      </w:pPr>
-      <w:r>
-        <w:t xml:space="preserve">The public response was overwhelmingly negative, with the council’s pre-consultation feedback summary noting</w:t>
-      </w:r>
-      <w:r>
-        <w:t xml:space="preserve"> </w:t>
-      </w:r>
-      <w:r>
-        <w:rPr>
-          <w:i/>
-          <w:iCs/>
-        </w:rPr>
-        <w:t xml:space="preserve">‘a strong preference for improving existing schools rather than redistributing students, alongside deep concerns about potential impacts on community cohesion and student wellbeing’</w:t>
-      </w:r>
-      <w:r>
-        <w:t xml:space="preserve">. The proposals would, by the council’s own calculations, force significant numbers of children from central catchments to schools at the city’s periphery, potentially requiring over two hours of daily commuting. The council’s transport-implications appendix</w:t>
-      </w:r>
-      <w:r>
-        <w:rPr>
-          <w:rStyle w:val="FootnoteReference"/>
-        </w:rPr>
-        <w:footnoteReference w:id="55"/>
-      </w:r>
-      <w:r>
-        <w:t xml:space="preserve"> </w:t>
-      </w:r>
-      <w:r>
-        <w:t xml:space="preserve">reports approximately £606,000 already spent each year on supported bus routes and bus passes, with further travel-assistance spending likely to support new pupil flows generated by the admissions changes. Notably, the previous administration’s comprehensive strategy for tackling educational disadvantage</w:t>
-      </w:r>
-      <w:r>
-        <w:rPr>
-          <w:rStyle w:val="FootnoteReference"/>
-        </w:rPr>
-        <w:footnoteReference w:id="57"/>
-      </w:r>
-      <w:r>
-        <w:t xml:space="preserve"> </w:t>
-      </w:r>
-      <w:r>
-        <w:t xml:space="preserve">— which included sections on attendance, leadership, governance and targeted support — was not referenced in the 2024 consultation materials.</w:t>
+        <w:t xml:space="preserve">- which included sections on attendance, leadership, governance and targeted support - was not referenced in the 2024 consultation materials.</w:t>
       </w:r>
     </w:p>
     <w:p>
@@ -4737,7 +4968,96 @@
       <w:tr>
         <w:tc>
           <w:tcPr/>
-          <w:bookmarkStart w:id="62" w:name="fig-catchments"/>
+          <w:bookmarkStart w:id="57" w:name="fig-catchments"/>
+          <w:p>
+            <w:pPr>
+              <w:pStyle w:val="Compact"/>
+              <w:jc w:val="center"/>
+            </w:pPr>
+            <w:r>
+              <w:drawing>
+                <wp:inline>
+                  <wp:extent cx="5943600" cy="5094514"/>
+                  <wp:effectExtent b="0" l="0" r="0" t="0"/>
+                  <wp:docPr descr="" title="" id="55" name="Picture"/>
+                  <a:graphic>
+                    <a:graphicData uri="http://schemas.openxmlformats.org/drawingml/2006/picture">
+                      <pic:pic>
+                        <pic:nvPicPr>
+                          <pic:cNvPr descr="RPE_Paper_files/figure-docx/fig-catchments-1.png" id="56" name="Picture"/>
+                          <pic:cNvPicPr>
+                            <a:picLocks noChangeArrowheads="1" noChangeAspect="1"/>
+                          </pic:cNvPicPr>
+                        </pic:nvPicPr>
+                        <pic:blipFill>
+                          <a:blip r:embed="rId54"/>
+                          <a:stretch>
+                            <a:fillRect/>
+                          </a:stretch>
+                        </pic:blipFill>
+                        <pic:spPr bwMode="auto">
+                          <a:xfrm>
+                            <a:off x="0" y="0"/>
+                            <a:ext cx="5943600" cy="5094514"/>
+                          </a:xfrm>
+                          <a:prstGeom prst="rect">
+                            <a:avLst/>
+                          </a:prstGeom>
+                          <a:noFill/>
+                          <a:ln w="9525">
+                            <a:noFill/>
+                            <a:headEnd/>
+                            <a:tailEnd/>
+                          </a:ln>
+                        </pic:spPr>
+                      </pic:pic>
+                    </a:graphicData>
+                  </a:graphic>
+                </wp:inline>
+              </w:drawing>
+            </w:r>
+          </w:p>
+          <w:p>
+            <w:pPr>
+              <w:jc w:val="center"/>
+            </w:pPr>
+            <w:pPr>
+              <w:jc w:val="left"/>
+              <w:spacing w:before="200"/>
+              <w:pStyle w:val="ImageCaption"/>
+            </w:pPr>
+            <w:r>
+              <w:t xml:space="preserve">Figure 2: Brighton and Hove secondary schools with 2025/26 catchment boundaries.</w:t>
+            </w:r>
+          </w:p>
+          <w:bookmarkEnd w:id="57"/>
+        </w:tc>
+      </w:tr>
+    </w:tbl>
+    <w:bookmarkEnd w:id="58"/>
+    <w:bookmarkStart w:id="64" w:name="local-authority-effects"/>
+    <w:p>
+      <w:pPr>
+        <w:pStyle w:val="Heading2"/>
+      </w:pPr>
+      <w:r>
+        <w:t xml:space="preserve">5.2 Local authority effects</w:t>
+      </w:r>
+    </w:p>
+    <w:tbl>
+      <w:tblPr>
+        <w:tblStyle w:val="Table"/>
+        <w:tblW w:type="pct" w:w="5000"/>
+        <w:tblLayout w:type="fixed"/>
+        <w:tblLook w:firstRow="0" w:lastRow="0" w:firstColumn="0" w:lastColumn="0" w:noHBand="0" w:noVBand="0" w:val="0000"/>
+      </w:tblPr>
+      <w:tblGrid>
+        <w:gridCol w:w="7920"/>
+      </w:tblGrid>
+      <w:tr>
+        <w:tc>
+          <w:tcPr/>
+          <w:bookmarkStart w:id="62" w:name="fig-caterpillar"/>
           <w:p>
             <w:pPr>
               <w:pStyle w:val="Compact"/>
@@ -4753,7 +5073,7 @@
                     <a:graphicData uri="http://schemas.openxmlformats.org/drawingml/2006/picture">
                       <pic:pic>
                         <pic:nvPicPr>
-                          <pic:cNvPr descr="RPE_Paper_files/figure-docx/fig-catchments-1.png" id="61" name="Picture"/>
+                          <pic:cNvPr descr="RPE_Paper_files/figure-docx/fig-caterpillar-1.png" id="61" name="Picture"/>
                           <pic:cNvPicPr>
                             <a:picLocks noChangeArrowheads="1" noChangeAspect="1"/>
                           </pic:cNvPicPr>
@@ -4796,21 +5116,119 @@
               <w:pStyle w:val="ImageCaption"/>
             </w:pPr>
             <w:r>
-              <w:t xml:space="preserve">Figure 2: Brighton and Hove secondary schools with 2025/26 catchment boundaries.</w:t>
+              <w:t xml:space="preserve">Figure 3: LA random intercepts for disadvantaged-pupil attainment (imputed full panel model). Top and bottom 10 LAs labelled; Brighton and Hove highlighted.</w:t>
             </w:r>
           </w:p>
           <w:bookmarkEnd w:id="62"/>
         </w:tc>
       </w:tr>
     </w:tbl>
-    <w:bookmarkEnd w:id="63"/>
-    <w:bookmarkStart w:id="69" w:name="local-authority-effects"/>
-    <w:p>
-      <w:pPr>
-        <w:pStyle w:val="Heading2"/>
-      </w:pPr>
-      <w:r>
-        <w:t xml:space="preserve">5.2 Local authority effects</w:t>
+    <w:p>
+      <w:pPr>
+        <w:pStyle w:val="BodyText"/>
+      </w:pPr>
+      <w:hyperlink w:anchor="fig-caterpillar">
+        <w:r>
+          <w:rPr>
+            <w:rStyle w:val="Hyperlink"/>
+          </w:rPr>
+          <w:t xml:space="preserve">Figure 3</w:t>
+        </w:r>
+      </w:hyperlink>
+      <w:r>
+        <w:t xml:space="preserve"> </w:t>
+      </w:r>
+      <w:r>
+        <w:t xml:space="preserve">shows the local-authority random intercepts for disadvantaged-pupil attainment. Conditional on the structural factors in the model - including school absence - Brighton and Hove ranks</w:t>
+      </w:r>
+      <w:r>
+        <w:t xml:space="preserve"> </w:t>
+      </w:r>
+      <w:r>
+        <w:rPr>
+          <w:b/>
+          <w:bCs/>
+        </w:rPr>
+        <w:t xml:space="preserve">7th of 151</w:t>
+      </w:r>
+      <w:r>
+        <w:t xml:space="preserve"> </w:t>
+      </w:r>
+      <w:r>
+        <w:t xml:space="preserve">local authorities, a positive random intercept equivalent to roughly</w:t>
+      </w:r>
+      <w:r>
+        <w:t xml:space="preserve"> </w:t>
+      </w:r>
+      <w:r>
+        <w:rPr>
+          <w:b/>
+          <w:bCs/>
+        </w:rPr>
+        <w:t xml:space="preserve">+2 Attainment 8 points</w:t>
+      </w:r>
+      <w:r>
+        <w:t xml:space="preserve"> </w:t>
+      </w:r>
+      <w:r>
+        <w:t xml:space="preserve">above what those factors would predict. On the same conditional basis the city ranks 5th for non-disadvantaged pupils and 4th for all pupils. This was unknown at the time of the 2024 consultation and entirely absent from a public narrative framed around the raw attainment gap alone.</w:t>
+      </w:r>
+    </w:p>
+    <w:p>
+      <w:pPr>
+        <w:pStyle w:val="BodyText"/>
+      </w:pPr>
+      <w:r>
+        <w:t xml:space="preserve">That conditional ranking, however, depends on a modelling choice that turns out to carry most of the result. Controlling for absence estimates the city’s performance</w:t>
+      </w:r>
+      <w:r>
+        <w:t xml:space="preserve"> </w:t>
+      </w:r>
+      <w:r>
+        <w:rPr>
+          <w:i/>
+          <w:iCs/>
+        </w:rPr>
+        <w:t xml:space="preserve">given</w:t>
+      </w:r>
+      <w:r>
+        <w:t xml:space="preserve"> </w:t>
+      </w:r>
+      <w:r>
+        <w:t xml:space="preserve">the attendance its pupils actually record - and Brighton and Hove has among the worst attendance of any authority in England.</w:t>
+      </w:r>
+      <w:r>
+        <w:t xml:space="preserve"> </w:t>
+      </w:r>
+      <w:hyperlink w:anchor="tbl-la-absence">
+        <w:r>
+          <w:rPr>
+            <w:rStyle w:val="Hyperlink"/>
+          </w:rPr>
+          <w:t xml:space="preserve">Table 2</w:t>
+        </w:r>
+      </w:hyperlink>
+      <w:r>
+        <w:t xml:space="preserve"> </w:t>
+      </w:r>
+      <w:r>
+        <w:t xml:space="preserve">reports the disadvantaged-attainment effect with and without that control. Without any absence term, the city falls from 7th to</w:t>
+      </w:r>
+      <w:r>
+        <w:t xml:space="preserve"> </w:t>
+      </w:r>
+      <w:r>
+        <w:rPr>
+          <w:b/>
+          <w:bCs/>
+        </w:rPr>
+        <w:t xml:space="preserve">46th of 151</w:t>
+      </w:r>
+      <w:r>
+        <w:t xml:space="preserve"> </w:t>
+      </w:r>
+      <w:r>
+        <w:t xml:space="preserve">and its effect is no longer statistically distinguishable from the national average. The city’s apparent excellence for disadvantaged pupils is, in this precise sense, conditional on setting its attendance problem aside.</w:t>
       </w:r>
     </w:p>
     <w:tbl>
@@ -4826,194 +5244,7 @@
       <w:tr>
         <w:tc>
           <w:tcPr/>
-          <w:bookmarkStart w:id="67" w:name="fig-caterpillar"/>
-          <w:p>
-            <w:pPr>
-              <w:pStyle w:val="Compact"/>
-              <w:jc w:val="center"/>
-            </w:pPr>
-            <w:r>
-              <w:drawing>
-                <wp:inline>
-                  <wp:extent cx="5943600" cy="5094514"/>
-                  <wp:effectExtent b="0" l="0" r="0" t="0"/>
-                  <wp:docPr descr="" title="" id="65" name="Picture"/>
-                  <a:graphic>
-                    <a:graphicData uri="http://schemas.openxmlformats.org/drawingml/2006/picture">
-                      <pic:pic>
-                        <pic:nvPicPr>
-                          <pic:cNvPr descr="RPE_Paper_files/figure-docx/fig-caterpillar-1.png" id="66" name="Picture"/>
-                          <pic:cNvPicPr>
-                            <a:picLocks noChangeArrowheads="1" noChangeAspect="1"/>
-                          </pic:cNvPicPr>
-                        </pic:nvPicPr>
-                        <pic:blipFill>
-                          <a:blip r:embed="rId64"/>
-                          <a:stretch>
-                            <a:fillRect/>
-                          </a:stretch>
-                        </pic:blipFill>
-                        <pic:spPr bwMode="auto">
-                          <a:xfrm>
-                            <a:off x="0" y="0"/>
-                            <a:ext cx="5943600" cy="5094514"/>
-                          </a:xfrm>
-                          <a:prstGeom prst="rect">
-                            <a:avLst/>
-                          </a:prstGeom>
-                          <a:noFill/>
-                          <a:ln w="9525">
-                            <a:noFill/>
-                            <a:headEnd/>
-                            <a:tailEnd/>
-                          </a:ln>
-                        </pic:spPr>
-                      </pic:pic>
-                    </a:graphicData>
-                  </a:graphic>
-                </wp:inline>
-              </w:drawing>
-            </w:r>
-          </w:p>
-          <w:p>
-            <w:pPr>
-              <w:jc w:val="center"/>
-            </w:pPr>
-            <w:pPr>
-              <w:jc w:val="left"/>
-              <w:spacing w:before="200"/>
-              <w:pStyle w:val="ImageCaption"/>
-            </w:pPr>
-            <w:r>
-              <w:t xml:space="preserve">Figure 3: LA random intercepts for disadvantaged-pupil attainment (imputed full panel model). Top and bottom 10 LAs labelled; Brighton and Hove highlighted.</w:t>
-            </w:r>
-          </w:p>
-          <w:bookmarkEnd w:id="67"/>
-        </w:tc>
-      </w:tr>
-    </w:tbl>
-    <w:p>
-      <w:pPr>
-        <w:pStyle w:val="BodyText"/>
-      </w:pPr>
-      <w:hyperlink w:anchor="fig-caterpillar">
-        <w:r>
-          <w:rPr>
-            <w:rStyle w:val="Hyperlink"/>
-          </w:rPr>
-          <w:t xml:space="preserve">Figure 3</w:t>
-        </w:r>
-      </w:hyperlink>
-      <w:r>
-        <w:t xml:space="preserve"> </w:t>
-      </w:r>
-      <w:r>
-        <w:t xml:space="preserve">shows the local-authority random intercepts for disadvantaged-pupil attainment. Conditional on the structural factors in the model — including school absence — Brighton and Hove ranks</w:t>
-      </w:r>
-      <w:r>
-        <w:t xml:space="preserve"> </w:t>
-      </w:r>
-      <w:r>
-        <w:rPr>
-          <w:b/>
-          <w:bCs/>
-        </w:rPr>
-        <w:t xml:space="preserve">7th of 151</w:t>
-      </w:r>
-      <w:r>
-        <w:t xml:space="preserve"> </w:t>
-      </w:r>
-      <w:r>
-        <w:t xml:space="preserve">local authorities, a positive random intercept equivalent to roughly</w:t>
-      </w:r>
-      <w:r>
-        <w:t xml:space="preserve"> </w:t>
-      </w:r>
-      <w:r>
-        <w:rPr>
-          <w:b/>
-          <w:bCs/>
-        </w:rPr>
-        <w:t xml:space="preserve">+2 Attainment 8 points</w:t>
-      </w:r>
-      <w:r>
-        <w:t xml:space="preserve"> </w:t>
-      </w:r>
-      <w:r>
-        <w:t xml:space="preserve">above what those factors would predict. On the same conditional basis the city ranks 5th for non-disadvantaged pupils and 4th for all pupils. This was unknown at the time of the 2024 consultation and entirely absent from a public narrative framed around the raw attainment gap alone.</w:t>
-      </w:r>
-    </w:p>
-    <w:p>
-      <w:pPr>
-        <w:pStyle w:val="BodyText"/>
-      </w:pPr>
-      <w:r>
-        <w:t xml:space="preserve">That conditional ranking, however, depends on a modelling choice that turns out to carry most of the result. Controlling for absence estimates the city’s performance</w:t>
-      </w:r>
-      <w:r>
-        <w:t xml:space="preserve"> </w:t>
-      </w:r>
-      <w:r>
-        <w:rPr>
-          <w:i/>
-          <w:iCs/>
-        </w:rPr>
-        <w:t xml:space="preserve">given</w:t>
-      </w:r>
-      <w:r>
-        <w:t xml:space="preserve"> </w:t>
-      </w:r>
-      <w:r>
-        <w:t xml:space="preserve">the attendance its pupils actually record — and Brighton and Hove has among the worst attendance of any authority in England.</w:t>
-      </w:r>
-      <w:r>
-        <w:t xml:space="preserve"> </w:t>
-      </w:r>
-      <w:hyperlink w:anchor="tbl-la-absence">
-        <w:r>
-          <w:rPr>
-            <w:rStyle w:val="Hyperlink"/>
-          </w:rPr>
-          <w:t xml:space="preserve">Table 2</w:t>
-        </w:r>
-      </w:hyperlink>
-      <w:r>
-        <w:t xml:space="preserve"> </w:t>
-      </w:r>
-      <w:r>
-        <w:t xml:space="preserve">reports the disadvantaged-attainment effect with and without that control. Without any absence term, the city falls from 7th to</w:t>
-      </w:r>
-      <w:r>
-        <w:t xml:space="preserve"> </w:t>
-      </w:r>
-      <w:r>
-        <w:rPr>
-          <w:b/>
-          <w:bCs/>
-        </w:rPr>
-        <w:t xml:space="preserve">46th of 151</w:t>
-      </w:r>
-      <w:r>
-        <w:t xml:space="preserve"> </w:t>
-      </w:r>
-      <w:r>
-        <w:t xml:space="preserve">and its effect is no longer statistically distinguishable from the national average. The city’s apparent excellence for disadvantaged pupils is, in this precise sense, conditional on setting its attendance problem aside.</w:t>
-      </w:r>
-    </w:p>
-    <w:tbl>
-      <w:tblPr>
-        <w:tblStyle w:val="Table"/>
-        <w:tblW w:type="pct" w:w="5000"/>
-        <w:tblLayout w:type="fixed"/>
-        <w:tblLook w:firstRow="0" w:lastRow="0" w:firstColumn="0" w:lastColumn="0" w:noHBand="0" w:noVBand="0" w:val="0000"/>
-      </w:tblPr>
-      <w:tblGrid>
-        <w:gridCol w:w="7920"/>
-      </w:tblGrid>
-      <w:tr>
-        <w:tc>
-          <w:tcPr/>
-          <w:bookmarkStart w:id="68" w:name="tbl-la-absence"/>
+          <w:bookmarkStart w:id="63" w:name="tbl-la-absence"/>
           <w:p>
             <w:pPr>
               <w:jc w:val="center"/>
@@ -5313,7 +5544,7 @@
               </w:tc>
             </w:tr>
           </w:tbl>
-          <w:bookmarkEnd w:id="68"/>
+          <w:bookmarkEnd w:id="63"/>
           <w:p/>
         </w:tc>
       </w:tr>
@@ -5341,7 +5572,7 @@
           <w:b/>
           <w:bCs/>
         </w:rPr>
-        <w:t xml:space="preserve">The gap between the two — about 1.3 Attainment 8 points per disadvantaged pupil — is a direct measure of what the city’s attendance problem costs its most disadvantaged children.</w:t>
+        <w:t xml:space="preserve">The gap between the two - about 1.3 Attainment 8 points per disadvantaged pupil - is a direct measure of what the city’s attendance problem costs its most disadvantaged children.</w:t>
       </w:r>
       <w:r>
         <w:t xml:space="preserve"> </w:t>
@@ -5371,11 +5602,11 @@
         <w:t xml:space="preserve"> </w:t>
       </w:r>
       <w:r>
-        <w:t xml:space="preserve">the national average (27.1%). When we model expected absence from intake alone (§5.5), the city’s schools should record about 8.8% absence; they actually record 10.8%. Almost two percentage points of absence sit above what the intake predicts. Second, the problem has not been improving. Between 2021–22 and 2024–25, absence fell in 94% of English local authorities — the national mean dropping by 0.88 percentage points as attendance recovered from the pandemic — while Brighton and Hove’s barely moved (-0.03 points), leaving it 143th of 152 authorities for improvement. The city did not become an outlier because its absence rose; it became an outlier because, almost alone, its absence did not fall.</w:t>
-      </w:r>
-    </w:p>
-    <w:bookmarkEnd w:id="69"/>
-    <w:bookmarkStart w:id="74" w:name="X2c44da290b91186546cdc06847184f26ab3e331"/>
+        <w:t xml:space="preserve">the national average (27.1%). When we model expected absence from intake alone (§5.5), the city’s schools should record about 8.8% absence; they actually record 10.8%. Almost two percentage points of absence sit above what the intake predicts. Second, the problem has not been improving. Between 2021–22 and 2024–25, absence fell in 94% of English local authorities - the national mean dropping by 0.88 percentage points as attendance recovered from the pandemic - while Brighton and Hove’s barely moved (-0.03 points), leaving it 143th of 152 authorities for improvement. The city did not become an outlier because its absence rose; it became an outlier because, almost alone, its absence did not fall.</w:t>
+      </w:r>
+    </w:p>
+    <w:bookmarkEnd w:id="64"/>
+    <w:bookmarkStart w:id="69" w:name="X2c44da290b91186546cdc06847184f26ab3e331"/>
     <w:p>
       <w:pPr>
         <w:pStyle w:val="Heading2"/>
@@ -5389,7 +5620,7 @@
         <w:pStyle w:val="FirstParagraph"/>
       </w:pPr>
       <w:r>
-        <w:t xml:space="preserve">Because the model uses log-transformed variables, the same percentage-point change produces different effects depending on where a school starts — returns</w:t>
+        <w:t xml:space="preserve">Because the model uses log-transformed variables, the same percentage-point change produces different effects depending on where a school starts - returns</w:t>
       </w:r>
       <w:r>
         <w:t xml:space="preserve"> </w:t>
@@ -5438,7 +5669,7 @@
       <w:tr>
         <w:tc>
           <w:tcPr/>
-          <w:bookmarkStart w:id="73" w:name="fig-accelerating-returns"/>
+          <w:bookmarkStart w:id="68" w:name="fig-accelerating-returns"/>
           <w:p>
             <w:pPr>
               <w:pStyle w:val="Compact"/>
@@ -5449,18 +5680,18 @@
                 <wp:inline>
                   <wp:extent cx="5943600" cy="3820885"/>
                   <wp:effectExtent b="0" l="0" r="0" t="0"/>
-                  <wp:docPr descr="" title="" id="71" name="Picture"/>
+                  <wp:docPr descr="" title="" id="66" name="Picture"/>
                   <a:graphic>
                     <a:graphicData uri="http://schemas.openxmlformats.org/drawingml/2006/picture">
                       <pic:pic>
                         <pic:nvPicPr>
-                          <pic:cNvPr descr="RPE_Paper_files/figure-docx/fig-accelerating-returns-1.png" id="72" name="Picture"/>
+                          <pic:cNvPr descr="RPE_Paper_files/figure-docx/fig-accelerating-returns-1.png" id="67" name="Picture"/>
                           <pic:cNvPicPr>
                             <a:picLocks noChangeArrowheads="1" noChangeAspect="1"/>
                           </pic:cNvPicPr>
                         </pic:nvPicPr>
                         <pic:blipFill>
-                          <a:blip r:embed="rId70"/>
+                          <a:blip r:embed="rId65"/>
                           <a:stretch>
                             <a:fillRect/>
                           </a:stretch>
@@ -5500,7 +5731,7 @@
               <w:t xml:space="preserve">Figure 4: Accelerating returns: each percentage-point reduction buys a progressively larger ATT8 gain (reading right to left). Absence delivers substantially larger gains than FSM at every level. Brighton and Hove schools marked on each curve.</w:t>
             </w:r>
           </w:p>
-          <w:bookmarkEnd w:id="73"/>
+          <w:bookmarkEnd w:id="68"/>
         </w:tc>
       </w:tr>
     </w:tbl>
@@ -5533,7 +5764,7 @@
         <w:pStyle w:val="BodyText"/>
       </w:pPr>
       <w:r>
-        <w:t xml:space="preserve">Brighton and Hove’s mean school FSM rate (28.8%) is close to the national average (28.3%). But the city’s mean absence rate (10.8%) against a national average of 8.2% places it at the 99th percentile — among the very worst in England. When standardised by the city’s spread, the absence coefficient is 2.6 times as important as FSM for predicting attainment.</w:t>
+        <w:t xml:space="preserve">Brighton and Hove’s mean school FSM rate (28.8%) is close to the national average (28.3%). But the city’s mean absence rate (10.8%) against a national average of 8.2% places it at the 99th percentile - among the very worst in England. When standardised by the city’s spread, the absence coefficient is 2.6 times as important as FSM for predicting attainment.</w:t>
       </w:r>
     </w:p>
     <w:p>
@@ -5544,8 +5775,8 @@
         <w:t xml:space="preserve">Bringing schools above the national average for absence down to it would produce predicted gains averaging +2.9 Attainment 8 points per school, with gains for disadvantaged pupils averaging +3.3 points. Even dramatic FSM reductions would yield gains closer to 1 point. On the evidence, attendance is the single most consequential lever the city has available, and admissions changes of the kind proposed in 2024 are very unlikely to produce equivalent gains in disadvantaged attainment.</w:t>
       </w:r>
     </w:p>
-    <w:bookmarkEnd w:id="74"/>
-    <w:bookmarkStart w:id="79" w:name="contextualised-school-performance"/>
+    <w:bookmarkEnd w:id="69"/>
+    <w:bookmarkStart w:id="74" w:name="contextualised-school-performance"/>
     <w:p>
       <w:pPr>
         <w:pStyle w:val="Heading2"/>
@@ -5567,7 +5798,7 @@
       <w:tr>
         <w:tc>
           <w:tcPr/>
-          <w:bookmarkStart w:id="78" w:name="fig-obs-vs-pred"/>
+          <w:bookmarkStart w:id="73" w:name="fig-obs-vs-pred"/>
           <w:p>
             <w:pPr>
               <w:pStyle w:val="Compact"/>
@@ -5578,18 +5809,18 @@
                 <wp:inline>
                   <wp:extent cx="5943600" cy="7641771"/>
                   <wp:effectExtent b="0" l="0" r="0" t="0"/>
-                  <wp:docPr descr="" title="" id="76" name="Picture"/>
+                  <wp:docPr descr="" title="" id="71" name="Picture"/>
                   <a:graphic>
                     <a:graphicData uri="http://schemas.openxmlformats.org/drawingml/2006/picture">
                       <pic:pic>
                         <pic:nvPicPr>
-                          <pic:cNvPr descr="RPE_Paper_files/figure-docx/fig-obs-vs-pred-1.png" id="77" name="Picture"/>
+                          <pic:cNvPr descr="RPE_Paper_files/figure-docx/fig-obs-vs-pred-1.png" id="72" name="Picture"/>
                           <pic:cNvPicPr>
                             <a:picLocks noChangeArrowheads="1" noChangeAspect="1"/>
                           </pic:cNvPicPr>
                         </pic:nvPicPr>
                         <pic:blipFill>
-                          <a:blip r:embed="rId75"/>
+                          <a:blip r:embed="rId70"/>
                           <a:stretch>
                             <a:fillRect/>
                           </a:stretch>
@@ -5629,7 +5860,7 @@
               <w:t xml:space="preserve">Figure 5: Observed versus predicted Attainment 8 for Brighton and Hove schools (highlighted) against all schools nationally, 2024–25.</w:t>
             </w:r>
           </w:p>
-          <w:bookmarkEnd w:id="78"/>
+          <w:bookmarkEnd w:id="73"/>
         </w:tc>
       </w:tr>
     </w:tbl>
@@ -5672,7 +5903,7 @@
         <w:t xml:space="preserve"> </w:t>
       </w:r>
       <w:r>
-        <w:t xml:space="preserve">values show on the plot and in the tabular model outputs shown earlier - observed values for most schools are close to the model predictions. The model residuals — the vertical distance from the diagonal — show whether a school is doing better (above) or worse (below) than the model predicts and provides what we might think of as contextualised</w:t>
+        <w:t xml:space="preserve">values show on the plot and in the tabular model outputs shown earlier - observed values for most schools are close to the model predictions. The model residuals - the vertical distance from the diagonal - show whether a school is doing better (above) or worse (below) than the model predicts and provides what we might think of as contextualised</w:t>
       </w:r>
       <w:r>
         <w:t xml:space="preserve"> </w:t>
@@ -5687,8 +5918,8 @@
         <w:t xml:space="preserve">measures - more nuanced than Progress 8 - as this model-based value added accounts for far more than just prior attainment in its representation.</w:t>
       </w:r>
     </w:p>
-    <w:bookmarkEnd w:id="79"/>
-    <w:bookmarkStart w:id="86" w:name="X8ff19f05081feb947c9bfda17930b607e81aacb"/>
+    <w:bookmarkEnd w:id="74"/>
+    <w:bookmarkStart w:id="80" w:name="X8ff19f05081feb947c9bfda17930b607e81aacb"/>
     <w:p>
       <w:pPr>
         <w:pStyle w:val="Heading2"/>
@@ -5702,7 +5933,7 @@
         <w:pStyle w:val="FirstParagraph"/>
       </w:pPr>
       <w:r>
-        <w:t xml:space="preserve">The contextualised value-added reading above hides a complication. Our headline model treats school-level absence as a single regressor on the same footing as other intake variables, but absence is different to FSM or EAL. Part of it is exogenous to the school — driven by family circumstances, area-level health, deprivation, and SEND profile — while part is produced by the school via pastoral systems, attendance officers, parental engagement and the broader ethos around getting children into class. Controlling for raw absence absorbs both components together, so the residual we have called</w:t>
+        <w:t xml:space="preserve">The contextualised value-added reading above hides a complication. Our headline model treats school-level absence as a single regressor on the same footing as other intake variables, but absence is different to FSM or EAL. Part of it is exogenous to the school - driven by family circumstances, area-level health, deprivation, and SEND profile - while part is produced by the school via pastoral systems, attendance officers, parental engagement and the broader ethos around getting children into class. Controlling for raw absence absorbs both components together, so the residual we have called</w:t>
       </w:r>
       <w:r>
         <w:t xml:space="preserve"> </w:t>
@@ -5760,7 +5991,7 @@
         <w:rPr>
           <w:rStyle w:val="FootnoteReference"/>
         </w:rPr>
-        <w:footnoteReference w:id="80"/>
+        <w:footnoteReference w:id="75"/>
       </w:r>
       <w:r>
         <w:t xml:space="preserve"> </w:t>
@@ -5822,7 +6053,7 @@
         <w:t xml:space="preserve"> </w:t>
       </w:r>
       <w:r>
-        <w:t xml:space="preserve">cross-departmental work — public health, children’s services, area-level deprivation policy — because much of what schools deal with on attendance is inherited rather than generated.</w:t>
+        <w:t xml:space="preserve">cross-departmental work - public health, children’s services, area-level deprivation policy - because much of what schools deal with on attendance is inherited rather than generated.</w:t>
       </w:r>
     </w:p>
     <w:tbl>
@@ -5838,7 +6069,7 @@
       <w:tr>
         <w:tc>
           <w:tcPr/>
-          <w:bookmarkStart w:id="85" w:name="fig-quadrant"/>
+          <w:bookmarkStart w:id="79" w:name="fig-quadrant"/>
           <w:p>
             <w:pPr>
               <w:pStyle w:val="Compact"/>
@@ -5849,18 +6080,18 @@
                 <wp:inline>
                   <wp:extent cx="5943600" cy="4245428"/>
                   <wp:effectExtent b="0" l="0" r="0" t="0"/>
-                  <wp:docPr descr="" title="" id="83" name="Picture"/>
+                  <wp:docPr descr="" title="" id="77" name="Picture"/>
                   <a:graphic>
                     <a:graphicData uri="http://schemas.openxmlformats.org/drawingml/2006/picture">
                       <pic:pic>
                         <pic:nvPicPr>
-                          <pic:cNvPr descr="RPE_Paper_files/figure-docx/fig-quadrant-1.png" id="84" name="Picture"/>
+                          <pic:cNvPr descr="RPE_Paper_files/figure-docx/fig-quadrant-1.png" id="78" name="Picture"/>
                           <pic:cNvPicPr>
                             <a:picLocks noChangeArrowheads="1" noChangeAspect="1"/>
                           </pic:cNvPicPr>
                         </pic:nvPicPr>
                         <pic:blipFill>
-                          <a:blip r:embed="rId82"/>
+                          <a:blip r:embed="rId76"/>
                           <a:stretch>
                             <a:fillRect/>
                           </a:stretch>
@@ -5900,7 +6131,7 @@
               <w:t xml:space="preserve">Figure 6: Brighton and Hove secondaries on the joint-signal plane: contextualised value-added (vertical, in Attainment 8 points) versus the school-controllable absence component (horizontal, in percentage points). The reference lines at zero on each axis split the plane into four narrative quadrants discussed in the text. The full national version with a local-authority filter is available interactively in the project’s HTML report.</w:t>
             </w:r>
           </w:p>
-          <w:bookmarkEnd w:id="85"/>
+          <w:bookmarkEnd w:id="79"/>
         </w:tc>
       </w:tr>
     </w:tbl>
@@ -5951,9 +6182,9 @@
         <w:t xml:space="preserve">We are aware that Progress 8 is an attempt to bring a degree of value added into the reporting of attainment, but we would advocate for a more sophisticated, model-based measure of value added as outlined here. Controlling for many more of the exogenous variables that influence attainment allow us to dig deeper into the impact that schools are having, and as we have shown here, the reporting of measures such as value-added alongside residual absence means we can achieve a more honest framing than the single number that conventional benchmarking produces. This would help align local policy conversations with what the data can support them.</w:t>
       </w:r>
     </w:p>
-    <w:bookmarkEnd w:id="86"/>
-    <w:bookmarkEnd w:id="87"/>
-    <w:bookmarkStart w:id="104" w:name="discussion"/>
+    <w:bookmarkEnd w:id="80"/>
+    <w:bookmarkEnd w:id="81"/>
+    <w:bookmarkStart w:id="98" w:name="discussion"/>
     <w:p>
       <w:pPr>
         <w:pStyle w:val="Heading1"/>
@@ -5962,7 +6193,7 @@
         <w:t xml:space="preserve">6. Discussion</w:t>
       </w:r>
     </w:p>
-    <w:bookmarkStart w:id="89" w:name="Xd3364b35d543c93770b334c5dc736f1edb746ee"/>
+    <w:bookmarkStart w:id="83" w:name="Xd3364b35d543c93770b334c5dc736f1edb746ee"/>
     <w:p>
       <w:pPr>
         <w:pStyle w:val="Heading2"/>
@@ -5982,7 +6213,7 @@
         <w:rPr>
           <w:rStyle w:val="FootnoteReference"/>
         </w:rPr>
-        <w:footnoteReference w:id="88"/>
+        <w:footnoteReference w:id="82"/>
       </w:r>
       <w:r>
         <w:t xml:space="preserve">, it was stated:</w:t>
@@ -6179,7 +6410,7 @@
         <w:t xml:space="preserve"> </w:t>
       </w:r>
       <w:r>
-        <w:t xml:space="preserve">of individual schools, which our modelling shows has, at most, a small effect on attainment — and for disadvantaged pupils, an effect that if anything runs the wrong way. The second is unintended: moving pupils further from home increases</w:t>
+        <w:t xml:space="preserve">of individual schools, which our modelling shows has, at most, a small effect on attainment - and for disadvantaged pupils, an effect that if anything runs the wrong way. The second is unintended: moving pupils further from home increases</w:t>
       </w:r>
       <w:r>
         <w:t xml:space="preserve"> </w:t>
@@ -6202,10 +6433,22 @@
           <w:i/>
           <w:iCs/>
         </w:rPr>
-        <w:t xml:space="preserve">higher absence</w:t>
-      </w:r>
-      <w:r>
-        <w:t xml:space="preserve">, and absence is by a wide margin the strongest predictor of attainment we identify. In other words, the admissions lever operates on attainment mainly through the second, unintended channel, and in the direction opposite to the policy’s aim. This is why we describe it as pulling the wrong lever: not merely a weak instrument, but one whose most probable net effect on disadvantaged attainment is negative. We should be clear that this is a statement about</w:t>
+        <w:t xml:space="preserve">higher absence.</w:t>
+      </w:r>
+      <w:r>
+        <w:t xml:space="preserve"> </w:t>
+      </w:r>
+      <w:r>
+        <w:t xml:space="preserve">Recent research also clearly links attendance with the sense of well-being, life satisfaction and belonging in students</w:t>
+      </w:r>
+      <w:r>
+        <w:t xml:space="preserve"> </w:t>
+      </w:r>
+      <w:r>
+        <w:t xml:space="preserve">(Moore et al. 2026)</w:t>
+      </w:r>
+      <w:r>
+        <w:t xml:space="preserve">. While it may not necessarily follow that this will be diminished in students attending schools far from their home communities and established friendship groups, it is reasonable to hypothesise this as a further risk factor to consider, particularly where absence is by a wide margin the strongest predictor of attainment we identify. In other words, the admissions lever operates on attainment mainly through the second, unintended channel, and in the direction opposite to the policy’s aim. This is why we describe it as pulling the wrong lever: not merely a weak instrument, but one whose most probable net effect on disadvantaged attainment is negative. We should be clear that this is a statement about</w:t>
       </w:r>
       <w:r>
         <w:t xml:space="preserve"> </w:t>
@@ -6224,8 +6467,8 @@
         <w:t xml:space="preserve">effects derived from national associations, not an evaluation of the 2023 free-school-meal-priority policy or the 2026 arrangements, which post-date our outcome data and whose effects the council’s own commissioned follow-up work has yet to report.</w:t>
       </w:r>
     </w:p>
-    <w:bookmarkEnd w:id="89"/>
-    <w:bookmarkStart w:id="92" w:name="X721a00ff84e807512ec4207f4efbd7031d30b61"/>
+    <w:bookmarkEnd w:id="83"/>
+    <w:bookmarkStart w:id="86" w:name="X721a00ff84e807512ec4207f4efbd7031d30b61"/>
     <w:p>
       <w:pPr>
         <w:pStyle w:val="Heading2"/>
@@ -6294,10 +6537,10 @@
         <w:rPr>
           <w:rStyle w:val="FootnoteReference"/>
         </w:rPr>
-        <w:footnoteReference w:id="90"/>
-      </w:r>
-      <w:r>
-        <w:t xml:space="preserve">. Of the school-level barriers our modelling is able to quantify — intake composition, prior attainment, workforce stability, segregation, and absence — none has a larger or better-evidenced effect on disadvantaged attainment than absence. On the council’s own framing, in other words, the most direct route to</w:t>
+        <w:footnoteReference w:id="84"/>
+      </w:r>
+      <w:r>
+        <w:t xml:space="preserve">. Of the school-level barriers our modelling is able to quantify - intake composition, prior attainment, workforce stability, segregation, and absence - none has a larger or better-evidenced effect on disadvantaged attainment than absence. On the council’s own framing, in other words, the most direct route to</w:t>
       </w:r>
       <w:r>
         <w:t xml:space="preserve"> </w:t>
@@ -6313,7 +6556,7 @@
         <w:t xml:space="preserve"> </w:t>
       </w:r>
       <w:r>
-        <w:t xml:space="preserve">for the city’s disadvantaged pupils points at attendance rather than at admissions arrangements. The city has the second-worst absence rate in England in 2024-25 — and, unlike almost every other authority, one that has barely improved since the pandemic — and the wider evidence indicates that closing this gap would yield attainment gains for disadvantaged pupils that comfortably exceed anything achievable through changes to admissions arrangements — and would do so</w:t>
+        <w:t xml:space="preserve">for the city’s disadvantaged pupils points at attendance rather than at admissions arrangements. The city has the second-worst absence rate in England in 2024-25 - and, unlike almost every other authority, one that has barely improved since the pandemic - and the wider evidence indicates that closing this gap would yield attainment gains for disadvantaged pupils that comfortably exceed anything achievable through changes to admissions arrangements - and would do so</w:t>
       </w:r>
       <w:r>
         <w:t xml:space="preserve"> </w:t>
@@ -6337,20 +6580,20 @@
         <w:pStyle w:val="BodyText"/>
       </w:pPr>
       <w:r>
-        <w:t xml:space="preserve">Brighton and Hove’s absence rates are not a necessary consequence of its intake. The city has near-average FSM eligibility but near-worst absence, suggesting the problem reflects local factors — attendance culture, enforcement practices, transport friction or community dynamics — rather than being an unavoidable correlate of disadvantage. If the city is not already running a substantial cross-departmental attendance programme alongside its school-level work, the case for one is strong. There is a budget question too: the £606,000 already spent annually on supported bus routes and passes</w:t>
+        <w:t xml:space="preserve">Brighton and Hove’s absence rates are not a necessary consequence of its intake. The city has near-average FSM eligibility but near-worst absence, suggesting the problem reflects local factors - attendance culture, enforcement practices, transport friction or community dynamics - rather than being an unavoidable correlate of disadvantage. If the city is not already running a substantial cross-departmental attendance programme alongside its school-level work, the case for one is strong. There is a budget question too: the £606,000 already spent annually on supported bus routes and passes</w:t>
       </w:r>
       <w:r>
         <w:rPr>
           <w:rStyle w:val="FootnoteReference"/>
         </w:rPr>
-        <w:footnoteReference w:id="91"/>
+        <w:footnoteReference w:id="85"/>
       </w:r>
       <w:r>
         <w:t xml:space="preserve">, plus any further travel-assistance spending generated by the admissions changes, would arguably have a stronger evidence base for raising disadvantaged attainment if invested directly in attendance support, family liaison and pastoral capacity in the city’s most affected schools.</w:t>
       </w:r>
     </w:p>
-    <w:bookmarkEnd w:id="92"/>
-    <w:bookmarkStart w:id="96" w:name="Xe20933ab3677df6d1953e5d7ada5fd38009a941"/>
+    <w:bookmarkEnd w:id="86"/>
+    <w:bookmarkStart w:id="90" w:name="Xe20933ab3677df6d1953e5d7ada5fd38009a941"/>
     <w:p>
       <w:pPr>
         <w:pStyle w:val="Heading2"/>
@@ -6380,7 +6623,7 @@
         <w:t xml:space="preserve"> </w:t>
       </w:r>
       <w:r>
-        <w:t xml:space="preserve">the structural intake characteristics it inherits — characteristics that the school cannot itself choose. The school-level random intercept, plus the school-level residual from the fitted model, gives us a contextualised value-added view that is fairer than the headline attainment number and more informative than a single (or multi)-word Ofsted rating, both for parents making school choices and for policy makers assessing where local effort is best directed. Brighton and Hove provides a particularly sharp illustration of why this matters: the local school for one of the city’s most disadvantaged catchments is, on this view, doing materially better for its disadvantaged pupils than the schools to which a number of those pupils’ families have been opting to travel.</w:t>
+        <w:t xml:space="preserve">the structural intake characteristics it inherits - characteristics that the school cannot itself choose. The school-level random intercept, plus the school-level residual from the fitted model, gives us a contextualised value-added view that is fairer than the headline attainment number and more informative than a single (or multi)-word Ofsted rating, both for parents making school choices and for policy makers assessing where local effort is best directed. Brighton and Hove provides a particularly sharp illustration of why this matters: the local school for one of the city’s most disadvantaged catchments is, on this view, doing materially better for its disadvantaged pupils than the schools to which a number of those pupils’ families have been opting to travel.</w:t>
       </w:r>
     </w:p>
     <w:tbl>
@@ -6396,7 +6639,7 @@
       <w:tr>
         <w:tc>
           <w:tcPr/>
-          <w:bookmarkStart w:id="93" w:name="tbl-league"/>
+          <w:bookmarkStart w:id="87" w:name="tbl-league"/>
           <w:p>
             <w:pPr>
               <w:jc w:val="center"/>
@@ -8383,7 +8626,7 @@
               </w:tc>
             </w:tr>
           </w:tbl>
-          <w:bookmarkEnd w:id="93"/>
+          <w:bookmarkEnd w:id="87"/>
           <w:p/>
         </w:tc>
       </w:tr>
@@ -8393,7 +8636,7 @@
         <w:pStyle w:val="BodyText"/>
       </w:pPr>
       <w:r>
-        <w:t xml:space="preserve">During the 2024 consultation, the public debate shifted from how the council’s proposals would improve disadvantaged attainment to how they would facilitate parental choice. An activist group (Equity in Education — supported by Class Divide) emerged from within the BACA catchment advocating for alternatives to that school, which then had a</w:t>
+        <w:t xml:space="preserve">During the 2024 consultation, the public debate shifted from how the council’s proposals would improve disadvantaged attainment to how they would facilitate parental choice. An activist group (Equity in Education - supported by Class Divide) emerged from within the BACA catchment advocating for alternatives to that school, which then had a</w:t>
       </w:r>
       <w:r>
         <w:t xml:space="preserve"> </w:t>
@@ -8405,7 +8648,7 @@
         <w:t xml:space="preserve"> </w:t>
       </w:r>
       <w:r>
-        <w:t xml:space="preserve">Ofsted rating and some of the city’s lowest raw attainment scores. A considerable number of BACA-catchment parents subsequently opted for Patcham School —</w:t>
+        <w:t xml:space="preserve">Ofsted rating and some of the city’s lowest raw attainment scores. A considerable number of BACA-catchment parents subsequently opted for Patcham School -</w:t>
       </w:r>
       <w:r>
         <w:t xml:space="preserve"> </w:t>
@@ -8456,7 +8699,7 @@
         </w:r>
       </w:hyperlink>
       <w:r>
-        <w:t xml:space="preserve">) show that in 2024-25 a disadvantaged pupil at BACA left, on average, with GCSE results around 5 points higher than a comparable pupil at a similar school elsewhere in England, with a four-year average around 3 points higher — substantially above the fraction of a point that might be expected from altering schools’ disadvantage mix. BACA out-performs every other school in the city for disadvantaged pupils, including those popularly viewed as the</w:t>
+        <w:t xml:space="preserve">) show that in 2024-25 a disadvantaged pupil at BACA left, on average, with GCSE results around 5 points higher than a comparable pupil at a similar school elsewhere in England, with a four-year average around 3 points higher - substantially above the fraction of a point that might be expected from altering schools’ disadvantage mix. BACA out-performs every other school in the city for disadvantaged pupils, including those popularly viewed as the</w:t>
       </w:r>
       <w:r>
         <w:t xml:space="preserve"> </w:t>
@@ -8483,23 +8726,234 @@
         <w:rPr>
           <w:rStyle w:val="FootnoteReference"/>
         </w:rPr>
+        <w:footnoteReference w:id="88"/>
+      </w:r>
+      <w:r>
+        <w:t xml:space="preserve"> </w:t>
+      </w:r>
+      <w:r>
+        <w:t xml:space="preserve">is unsurprising in the context of this analysis, but would have been surprising to anyone looking only at prior raw attainment and Ofsted ratings. Patcham, by contrast, sits ~2.6 GCSE points below expectation for disadvantaged pupils on a four-year average, with the gap reaching double figures in 2023-24 - differences hidden by its comfortable mid-table raw position. What other schools could learn from Patcham, however, is its attendance: it is one of only two city schools with absence below the national average, and exploring how it achieves this is a constructive city-level policy focus.</w:t>
+      </w:r>
+    </w:p>
+    <w:bookmarkEnd w:id="90"/>
+    <w:bookmarkStart w:id="92" w:name="viability-versus-attainment"/>
+    <w:p>
+      <w:pPr>
+        <w:pStyle w:val="Heading2"/>
+      </w:pPr>
+      <w:r>
+        <w:t xml:space="preserve">6.4 Viability versus attainment</w:t>
+      </w:r>
+    </w:p>
+    <w:p>
+      <w:pPr>
+        <w:pStyle w:val="FirstParagraph"/>
+      </w:pPr>
+      <w:r>
+        <w:t xml:space="preserve">The cabinet papers</w:t>
+      </w:r>
+      <w:r>
+        <w:rPr>
+          <w:rStyle w:val="FootnoteReference"/>
+        </w:rPr>
+        <w:footnoteReference w:id="91"/>
+      </w:r>
+      <w:r>
+        <w:t xml:space="preserve"> </w:t>
+      </w:r>
+      <w:r>
+        <w:t xml:space="preserve">set out the financial-sustainability rationale plainly. Schools in England are funded almost entirely on a per-pupil basis, so falling pupil numbers across the city would, in time, leave some schools struggling to operate efficiently or</w:t>
+      </w:r>
+      <w:r>
+        <w:t xml:space="preserve"> </w:t>
+      </w:r>
+      <w:r>
+        <w:rPr>
+          <w:i/>
+          <w:iCs/>
+        </w:rPr>
+        <w:t xml:space="preserve">‘offer a wide and balanced curriculum’</w:t>
+      </w:r>
+      <w:r>
+        <w:t xml:space="preserve">. The proposed PAN reductions of 120 places in total were framed by the council as a way of distributing that impact across the city’s most over-supplied schools rather than concentrating it on individual under-subscribed ones. The council also noted, importantly for the framing of the policy, that</w:t>
+      </w:r>
+      <w:r>
+        <w:t xml:space="preserve"> </w:t>
+      </w:r>
+      <w:r>
+        <w:rPr>
+          <w:i/>
+          <w:iCs/>
+        </w:rPr>
+        <w:t xml:space="preserve">‘the largest percentage of [disadvantaged] pupils attend the schools with the lowest pupil numbers’</w:t>
+      </w:r>
+      <w:r>
+        <w:t xml:space="preserve"> </w:t>
+      </w:r>
+      <w:r>
+        <w:t xml:space="preserve">— making the viability concern and the disadvantage objective explicitly interlinked in the council’s argument. Financial viability is therefore a legitimate concern, particularly given the historical context of an earlier school closure in a deprived part of the city that left some pupils already travelling long distances to peripheral provision. There is, however, an inherent tension between optimising for financial sustainability and optimising for educational outcomes — and the two cases need to be weighed transparently. The contextualised value-added view introduced above suggests that the city’s pattern of school-level effectiveness does not map cleanly onto raw attainment or popularity: if redistribution moves children from schools adding more value to schools adding less, the aggregate impact on city-wide attainment could be negative even if the financial case for the receiving schools improves.</w:t>
+      </w:r>
+    </w:p>
+    <w:p>
+      <w:pPr>
+        <w:pStyle w:val="BodyText"/>
+      </w:pPr>
+      <w:r>
+        <w:t xml:space="preserve">Following widespread opposition and appeals to the Schools Adjudicator, the proposed PAN reductions were rejected. Parental objections meant that the 20% out-of-catchment priority was reduced to 5%. While displacement was minimised, the policy reverberations continued through choices expressed by parents already influenced by the preceding debate.</w:t>
+      </w:r>
+    </w:p>
+    <w:bookmarkEnd w:id="92"/>
+    <w:bookmarkStart w:id="93" w:name="X66de271a6aca02794f420f50f4d8a324e8e27cc"/>
+    <w:p>
+      <w:pPr>
+        <w:pStyle w:val="Heading2"/>
+      </w:pPr>
+      <w:r>
+        <w:t xml:space="preserve">6.5 Conditional performance and the cost of absence</w:t>
+      </w:r>
+    </w:p>
+    <w:p>
+      <w:pPr>
+        <w:pStyle w:val="FirstParagraph"/>
+      </w:pPr>
+      <w:r>
+        <w:t xml:space="preserve">The LEA random effect for Brighton and Hove is positive and, in the main model, statistically significant across all three attainment groups. As §5.2 set out, however, this result is conditional on how the model treats absence, and the city’s attendance is so extreme that the conditioning does most of the work. Controlling for absence, the city’s schools rank 7th of 151 for disadvantaged attainment; without that control they rank 46th and are statistically ordinary. We take neither number as the whole truth. Together they say something more useful than either alone: Brighton and Hove’s schools appear to be genuinely effective for the pupils who attend them, and the city’s attendance problem is large enough to erase that advantage in the aggregate.</w:t>
+      </w:r>
+    </w:p>
+    <w:p>
+      <w:pPr>
+        <w:pStyle w:val="BodyText"/>
+      </w:pPr>
+      <w:r>
+        <w:t xml:space="preserve">The distance between the two rankings has a concrete interpretation. It is roughly 1.3 Attainment 8 points per disadvantaged pupil - the difference between what the city’s disadvantaged children achieve and what they might achieve if their schools’ underlying effectiveness were not being drained by absence. Read this way, the city’s attendance is not a caveat to a good-news story; it is the story.</w:t>
+      </w:r>
+    </w:p>
+    <w:p>
+      <w:pPr>
+        <w:pStyle w:val="BodyText"/>
+      </w:pPr>
+      <w:r>
+        <w:t xml:space="preserve">This reframes what the 2024 consultation got right and what it got wrong. The council was not wrong that Brighton and Hove has a problem: unconditionally, its disadvantaged pupils do no better than the national average, and the raw attainment gap that motivated the consultation is real. What the consultation got wrong was the diagnosis. Presented with an attainment gap, it reached for the social composition of schools - one of the weakest levers our modelling identifies, and for disadvantaged pupils a lever that may point the wrong way (§4.3, §5.3) - while the factor that actually separates the city’s conditional standing from its unconditional standing, attendance, was absent from the consultation entirely. The more accurate account is not that a high-performing city was mistaken for a failing one, but that a city with one specific, severe, addressable problem was prescribed a treatment for a different problem it did not have.</w:t>
+      </w:r>
+    </w:p>
+    <w:p>
+      <w:pPr>
+        <w:pStyle w:val="BodyText"/>
+      </w:pPr>
+      <w:r>
+        <w:t xml:space="preserve">The honest answer is that we do not yet know what produces this LEA effect. The random effect, by definition, captures variance that the fixed-effect predictors do not explain. It could reflect high levels of parental engagement and aspiration — Brighton and Hove has a well-educated population with a strong civic culture. It could relate to the quality of school leadership and governance across the city, or to effective local authority support services and school improvement programmes. It could be something about the collaborative relationships between schools, or community factors that are difficult to quantify. It could even be that if otherwise disruptive students switch to being absent students at a higher rate in Brighton and Hove, this may even have a positive impact on learning for those who remain in school. But without pupil and class-level longitudinal analysis, this hypothesis would be impossible to test. What all of these hypotheses show, however, is that identifying the sources of this conditional over-performance is an important research question in its own right, and one that could require additional qualitative investigation or access to pupil-level data that goes beyond what is publicly available. But what is clear is that policy interventions which risk disrupting a well-functioning system without understanding what makes it function well carry substantial downside risks.</w:t>
+      </w:r>
+    </w:p>
+    <w:bookmarkEnd w:id="93"/>
+    <w:bookmarkStart w:id="96" w:name="implications-for-national-policy"/>
+    <w:p>
+      <w:pPr>
+        <w:pStyle w:val="Heading2"/>
+      </w:pPr>
+      <w:r>
+        <w:t xml:space="preserve">6.6 Implications for national policy</w:t>
+      </w:r>
+    </w:p>
+    <w:p>
+      <w:pPr>
+        <w:pStyle w:val="FirstParagraph"/>
+      </w:pPr>
+      <w:r>
+        <w:t xml:space="preserve">The</w:t>
+      </w:r>
+      <w:r>
+        <w:t xml:space="preserve"> </w:t>
+      </w:r>
+      <w:r>
+        <w:t xml:space="preserve">DfE (2026)</w:t>
+      </w:r>
+      <w:r>
+        <w:t xml:space="preserve"> </w:t>
+      </w:r>
+      <w:r>
+        <w:t xml:space="preserve">white paper’s ambitions will founder if pursued at the local level without adequate analytical infrastructure. Every LEA occupies different positions along the non-linear curves that relate predictors to outcomes. What works in one context may be counterproductive in another. The DfE’s open data provides most of the raw materials, but there is a crucial gap between raw data availability and the accessible, contextualised intelligence that decision makers need.</w:t>
+      </w:r>
+    </w:p>
+    <w:p>
+      <w:pPr>
+        <w:pStyle w:val="BodyText"/>
+      </w:pPr>
+      <w:r>
+        <w:t xml:space="preserve">We should be candid that this gap is, in part, a structural consequence of policy since 2010. Academisation and sustained real-terms reductions in local authority central-services funding have substantially eroded the analytical capacity that once sat within LEAs, so a recommendation simply to</w:t>
+      </w:r>
+      <w:r>
+        <w:t xml:space="preserve"> </w:t>
+      </w:r>
+      <w:r>
+        <w:t xml:space="preserve">‘invest locally’</w:t>
+      </w:r>
+      <w:r>
+        <w:t xml:space="preserve"> </w:t>
+      </w:r>
+      <w:r>
+        <w:t xml:space="preserve">sits uneasily with the fiscal reality most authorities face. Multi-academy trusts have absorbed some of this function, but only for their own constituent schools; no actor now has both the remit and the capacity for the</w:t>
+      </w:r>
+      <w:r>
+        <w:t xml:space="preserve"> </w:t>
+      </w:r>
+      <w:r>
+        <w:rPr>
+          <w:i/>
+          <w:iCs/>
+        </w:rPr>
+        <w:t xml:space="preserve">locality-wide</w:t>
+      </w:r>
+      <w:r>
+        <w:t xml:space="preserve"> </w:t>
+      </w:r>
+      <w:r>
+        <w:t xml:space="preserve">analysis that spans maintained schools, academies across different trusts, and church schools within a single place. Brighton and Hove illustrates the gap precisely: the council remains the admissions authority for a system it has limited capacity to analyse as a whole, while its two academies - central to the policy question - sit outside its analytical reach. The need, then, is less for every council to rebuild bespoke capacity than for the</w:t>
+      </w:r>
+      <w:r>
+        <w:t xml:space="preserve"> </w:t>
+      </w:r>
+      <w:r>
+        <w:rPr>
+          <w:i/>
+          <w:iCs/>
+        </w:rPr>
+        <w:t xml:space="preserve">system</w:t>
+      </w:r>
+      <w:r>
+        <w:t xml:space="preserve"> </w:t>
+      </w:r>
+      <w:r>
+        <w:t xml:space="preserve">to close a locality-level analytical gap, whether through central funding for local capacity or nationally maintained benchmarking tools that any locality can use.</w:t>
+      </w:r>
+    </w:p>
+    <w:p>
+      <w:pPr>
+        <w:pStyle w:val="BodyText"/>
+      </w:pPr>
+      <w:r>
+        <w:t xml:space="preserve">We have developed an interactive Policy Simulator tool,</w:t>
+      </w:r>
+      <w:r>
+        <w:rPr>
+          <w:rStyle w:val="FootnoteReference"/>
+        </w:rPr>
         <w:footnoteReference w:id="94"/>
       </w:r>
       <w:r>
         <w:t xml:space="preserve"> </w:t>
       </w:r>
       <w:r>
-        <w:t xml:space="preserve">is unsurprising in the context of this analysis, but would have been surprising to anyone looking only at prior raw attainment and Ofsted ratings. Patcham, by contrast, sits ~2.6 GCSE points below expectation for disadvantaged pupils on a four-year average, with the gap reaching double figures in 2023-24 — differences hidden by its comfortable mid-table raw position. What other schools could learn from Patcham, however, is its attendance: it is one of only two city schools with absence below the national average, and exploring how it achieves this is a constructive city-level policy focus.</w:t>
+        <w:t xml:space="preserve">underpinned by the models in this paper, as a prototype of exactly this kind of shared, locality-level infrastructure. The tool allows users to explore any school in England, compare against contextual expectations, and model the indicative impact of changes to key variables.</w:t>
       </w:r>
     </w:p>
     <w:bookmarkEnd w:id="96"/>
-    <w:bookmarkStart w:id="98" w:name="viability-versus-attainment"/>
+    <w:bookmarkStart w:id="97" w:name="limitations"/>
     <w:p>
       <w:pPr>
         <w:pStyle w:val="Heading2"/>
       </w:pPr>
       <w:r>
-        <w:t xml:space="preserve">6.4 Viability versus attainment</w:t>
+        <w:t xml:space="preserve">6.7 Limitations</w:t>
       </w:r>
     </w:p>
     <w:p>
@@ -8507,223 +8961,12 @@
         <w:pStyle w:val="FirstParagraph"/>
       </w:pPr>
       <w:r>
-        <w:t xml:space="preserve">The cabinet papers</w:t>
-      </w:r>
-      <w:r>
-        <w:rPr>
-          <w:rStyle w:val="FootnoteReference"/>
-        </w:rPr>
-        <w:footnoteReference w:id="97"/>
-      </w:r>
-      <w:r>
-        <w:t xml:space="preserve"> </w:t>
-      </w:r>
-      <w:r>
-        <w:t xml:space="preserve">set out the financial-sustainability rationale plainly. Schools in England are funded almost entirely on a per-pupil basis, so falling pupil numbers across the city would, in time, leave some schools struggling to operate efficiently or</w:t>
-      </w:r>
-      <w:r>
-        <w:t xml:space="preserve"> </w:t>
-      </w:r>
-      <w:r>
-        <w:rPr>
-          <w:i/>
-          <w:iCs/>
-        </w:rPr>
-        <w:t xml:space="preserve">‘offer a wide and balanced curriculum’</w:t>
-      </w:r>
-      <w:r>
-        <w:t xml:space="preserve">. The proposed PAN reductions of 120 places in total were framed by the council as a way of distributing that impact across the city’s most over-supplied schools rather than concentrating it on individual under-subscribed ones. The council also noted, importantly for the framing of the policy, that</w:t>
-      </w:r>
-      <w:r>
-        <w:t xml:space="preserve"> </w:t>
-      </w:r>
-      <w:r>
-        <w:rPr>
-          <w:i/>
-          <w:iCs/>
-        </w:rPr>
-        <w:t xml:space="preserve">‘the largest percentage of [disadvantaged] pupils attend the schools with the lowest pupil numbers’</w:t>
-      </w:r>
-      <w:r>
-        <w:t xml:space="preserve"> </w:t>
-      </w:r>
-      <w:r>
-        <w:t xml:space="preserve">— making the viability concern and the disadvantage objective explicitly interlinked in the council’s argument. Financial viability is therefore a legitimate concern, particularly given the historical context of an earlier school closure in a deprived part of the city that left some pupils already travelling long distances to peripheral provision. There is, however, an inherent tension between optimising for financial sustainability and optimising for educational outcomes — and the two cases need to be weighed transparently. The contextualised value-added view introduced above suggests that the city’s pattern of school-level effectiveness does not map cleanly onto raw attainment or popularity: if redistribution moves children from schools adding more value to schools adding less, the aggregate impact on city-wide attainment could be negative even if the financial case for the receiving schools improves.</w:t>
-      </w:r>
-    </w:p>
-    <w:p>
-      <w:pPr>
-        <w:pStyle w:val="BodyText"/>
-      </w:pPr>
-      <w:r>
-        <w:t xml:space="preserve">Following widespread opposition and appeals to the Schools Adjudicator, the proposed PAN reductions were rejected. Parental objections meant that the 20% out-of-catchment priority was reduced to 5%. While displacement was minimised, the policy reverberations continued through choices expressed by parents already influenced by the preceding debate.</w:t>
-      </w:r>
-    </w:p>
+        <w:t xml:space="preserve">These are school-level models built from aggregate published data, not pupil-level analyses. The associations identified are not experimental causal estimates but the best approximations available from observational data. The models cannot capture unmeasured factors such as school culture, parental engagement, or individual pupil resilience. The Policy Simulator translates associations into indicative, not definitive, projections. We do not claim that reducing absence by a given amount will mechanically produce the predicted gain - the real world is more complex than any model captures. What we do claim is that these models are accurate enough, and the patterns consistent enough across years and specifications, to substantially improve the quality of the conversation around what matters most.</w:t>
+      </w:r>
+    </w:p>
+    <w:bookmarkEnd w:id="97"/>
     <w:bookmarkEnd w:id="98"/>
-    <w:bookmarkStart w:id="99" w:name="X66de271a6aca02794f420f50f4d8a324e8e27cc"/>
-    <w:p>
-      <w:pPr>
-        <w:pStyle w:val="Heading2"/>
-      </w:pPr>
-      <w:r>
-        <w:t xml:space="preserve">6.5 Conditional performance and the cost of absence</w:t>
-      </w:r>
-    </w:p>
-    <w:p>
-      <w:pPr>
-        <w:pStyle w:val="FirstParagraph"/>
-      </w:pPr>
-      <w:r>
-        <w:t xml:space="preserve">The LEA random effect for Brighton and Hove is positive and, in the main model, statistically significant across all three attainment groups. As §5.2 set out, however, this result is conditional on how the model treats absence, and the city’s attendance is so extreme that the conditioning does most of the work. Controlling for absence, the city’s schools rank 7th of 151 for disadvantaged attainment; without that control they rank 46th and are statistically ordinary. We take neither number as the whole truth. Together they say something more useful than either alone: Brighton and Hove’s schools appear to be genuinely effective for the pupils who attend them, and the city’s attendance problem is large enough to erase that advantage in the aggregate.</w:t>
-      </w:r>
-    </w:p>
-    <w:p>
-      <w:pPr>
-        <w:pStyle w:val="BodyText"/>
-      </w:pPr>
-      <w:r>
-        <w:t xml:space="preserve">The distance between the two rankings has a concrete interpretation. It is roughly 1.3 Attainment 8 points per disadvantaged pupil — the difference between what the city’s disadvantaged children achieve and what they might achieve if their schools’ underlying effectiveness were not being drained by absence. Read this way, the city’s attendance is not a caveat to a good-news story; it is the story.</w:t>
-      </w:r>
-    </w:p>
-    <w:p>
-      <w:pPr>
-        <w:pStyle w:val="BodyText"/>
-      </w:pPr>
-      <w:r>
-        <w:t xml:space="preserve">This reframes what the 2024 consultation got right and what it got wrong. The council was not wrong that Brighton and Hove has a problem: unconditionally, its disadvantaged pupils do no better than the national average, and the raw attainment gap that motivated the consultation is real. What the consultation got wrong was the diagnosis. Presented with an attainment gap, it reached for the social composition of schools — one of the weakest levers our modelling identifies, and for disadvantaged pupils a lever that may point the wrong way (§4.3, §5.3) — while the factor that actually separates the city’s conditional standing from its unconditional standing, attendance, was absent from the consultation entirely. The more accurate account is not that a high-performing city was mistaken for a failing one, but that a city with one specific, severe, addressable problem was prescribed a treatment for a different problem it did not have.</w:t>
-      </w:r>
-    </w:p>
-    <w:p>
-      <w:pPr>
-        <w:pStyle w:val="BodyText"/>
-      </w:pPr>
-      <w:r>
-        <w:t xml:space="preserve">The honest answer is that we do not yet know what produces this LEA effect. The random effect, by definition, captures variance that the fixed-effect predictors do not explain. It could reflect high levels of parental engagement and aspiration — Brighton and Hove has a well-educated population with a strong civic culture. It could relate to the quality of school leadership and governance across the city, or to effective local authority support services and school improvement programmes. It could be something about the collaborative relationships between schools, or community factors that are difficult to quantify. It could even be that if otherwise disruptive students switch to being absent students at a higher rate in Brighton and Hove, this may even have a positive impact on learning for those who remain in school. But without pupil and class-level longitudinal analysis, this hypothesis would be impossible to test. What all of these hypotheses show, however, is that identifying the sources of this conditional over-performance is an important research question in its own right, and one that could require additional qualitative investigation or access to pupil-level data that goes beyond what is publicly available. But what is clear is that policy interventions which risk disrupting a well-functioning system without understanding what makes it function well carry substantial downside risks.</w:t>
-      </w:r>
-    </w:p>
-    <w:bookmarkEnd w:id="99"/>
-    <w:bookmarkStart w:id="102" w:name="implications-for-national-policy"/>
-    <w:p>
-      <w:pPr>
-        <w:pStyle w:val="Heading2"/>
-      </w:pPr>
-      <w:r>
-        <w:t xml:space="preserve">6.6 Implications for national policy</w:t>
-      </w:r>
-    </w:p>
-    <w:p>
-      <w:pPr>
-        <w:pStyle w:val="FirstParagraph"/>
-      </w:pPr>
-      <w:r>
-        <w:t xml:space="preserve">The</w:t>
-      </w:r>
-      <w:r>
-        <w:t xml:space="preserve"> </w:t>
-      </w:r>
-      <w:r>
-        <w:t xml:space="preserve">DfE (2026)</w:t>
-      </w:r>
-      <w:r>
-        <w:t xml:space="preserve"> </w:t>
-      </w:r>
-      <w:r>
-        <w:t xml:space="preserve">white paper’s ambitions will founder if pursued at the local level without adequate analytical infrastructure. Every LEA occupies different positions along the non-linear curves that relate predictors to outcomes. What works in one context may be counterproductive in another. The DfE’s open data provides most of the raw materials, but there is a crucial gap between raw data availability and the accessible, contextualised intelligence that decision makers need.</w:t>
-      </w:r>
-    </w:p>
-    <w:p>
-      <w:pPr>
-        <w:pStyle w:val="BodyText"/>
-      </w:pPr>
-      <w:r>
-        <w:t xml:space="preserve">We should be candid that this gap is, in part, a structural consequence of policy since 2010. Academisation and sustained real-terms reductions in local authority central-services funding have substantially eroded the analytical capacity that once sat within LEAs, so a recommendation simply to</w:t>
-      </w:r>
-      <w:r>
-        <w:t xml:space="preserve"> </w:t>
-      </w:r>
-      <w:r>
-        <w:t xml:space="preserve">‘invest locally’</w:t>
-      </w:r>
-      <w:r>
-        <w:t xml:space="preserve"> </w:t>
-      </w:r>
-      <w:r>
-        <w:t xml:space="preserve">sits uneasily with the fiscal reality most authorities face. Multi-academy trusts have absorbed some of this function, but only for their own constituent schools; no actor now has both the remit and the capacity for the</w:t>
-      </w:r>
-      <w:r>
-        <w:t xml:space="preserve"> </w:t>
-      </w:r>
-      <w:r>
-        <w:rPr>
-          <w:i/>
-          <w:iCs/>
-        </w:rPr>
-        <w:t xml:space="preserve">locality-wide</w:t>
-      </w:r>
-      <w:r>
-        <w:t xml:space="preserve"> </w:t>
-      </w:r>
-      <w:r>
-        <w:t xml:space="preserve">analysis that spans maintained schools, academies across different trusts, and church schools within a single place. Brighton and Hove illustrates the gap precisely: the council remains the admissions authority for a system it has limited capacity to analyse as a whole, while its two academies — central to the policy question — sit outside its analytical reach. The need, then, is less for every council to rebuild bespoke capacity than for the</w:t>
-      </w:r>
-      <w:r>
-        <w:t xml:space="preserve"> </w:t>
-      </w:r>
-      <w:r>
-        <w:rPr>
-          <w:i/>
-          <w:iCs/>
-        </w:rPr>
-        <w:t xml:space="preserve">system</w:t>
-      </w:r>
-      <w:r>
-        <w:t xml:space="preserve"> </w:t>
-      </w:r>
-      <w:r>
-        <w:t xml:space="preserve">to close a locality-level analytical gap, whether through central funding for local capacity or nationally maintained benchmarking tools that any locality can use.</w:t>
-      </w:r>
-    </w:p>
-    <w:p>
-      <w:pPr>
-        <w:pStyle w:val="BodyText"/>
-      </w:pPr>
-      <w:r>
-        <w:t xml:space="preserve">We have developed an interactive Policy Simulator tool,</w:t>
-      </w:r>
-      <w:r>
-        <w:rPr>
-          <w:rStyle w:val="FootnoteReference"/>
-        </w:rPr>
-        <w:footnoteReference w:id="100"/>
-      </w:r>
-      <w:r>
-        <w:t xml:space="preserve"> </w:t>
-      </w:r>
-      <w:r>
-        <w:t xml:space="preserve">underpinned by the models in this paper, as a prototype of exactly this kind of shared, locality-level infrastructure. The tool allows users to explore any school in England, compare against contextual expectations, and model the indicative impact of changes to key variables.</w:t>
-      </w:r>
-    </w:p>
-    <w:bookmarkEnd w:id="102"/>
-    <w:bookmarkStart w:id="103" w:name="limitations"/>
-    <w:p>
-      <w:pPr>
-        <w:pStyle w:val="Heading2"/>
-      </w:pPr>
-      <w:r>
-        <w:t xml:space="preserve">6.7 Limitations</w:t>
-      </w:r>
-    </w:p>
-    <w:p>
-      <w:pPr>
-        <w:pStyle w:val="FirstParagraph"/>
-      </w:pPr>
-      <w:r>
-        <w:t xml:space="preserve">These are school-level models built from aggregate published data, not pupil-level analyses. The associations identified are not experimental causal estimates but the best approximations available from observational data. The models cannot capture unmeasured factors such as school culture, parental engagement, or individual pupil resilience. The Policy Simulator translates associations into indicative, not definitive, projections. We do not claim that reducing absence by a given amount will mechanically produce the predicted gain — the real world is more complex than any model captures. What we do claim is that these models are accurate enough, and the patterns consistent enough across years and specifications, to substantially improve the quality of the conversation around what matters most.</w:t>
-      </w:r>
-    </w:p>
-    <w:bookmarkEnd w:id="103"/>
-    <w:bookmarkEnd w:id="104"/>
-    <w:bookmarkStart w:id="105" w:name="conclusion"/>
+    <w:bookmarkStart w:id="99" w:name="conclusion"/>
     <w:p>
       <w:pPr>
         <w:pStyle w:val="Heading1"/>
@@ -8775,7 +9018,7 @@
         <w:t xml:space="preserve">attendance</w:t>
       </w:r>
       <w:r>
-        <w:t xml:space="preserve">. The city had the second-worst absence rate in England in 2024-25 — and its absence has failed to fall while it fell almost everywhere else — and the modelling suggests that moving the city’s worst-affected schools toward the national absence average would yield gains for disadvantaged pupils that comfortably exceed anything achievable through admissions reform. The two-stage decomposition we develop here also shows that this lever has two parts to it: a</w:t>
+        <w:t xml:space="preserve">. The city had the second-worst absence rate in England in 2024-25 - and its absence has failed to fall while it fell almost everywhere else - and the modelling suggests that moving the city’s worst-affected schools toward the national absence average would yield gains for disadvantaged pupils that comfortably exceed anything achievable through admissions reform. The two-stage decomposition we develop here also shows that this lever has two parts to it: a</w:t>
       </w:r>
       <w:r>
         <w:t xml:space="preserve"> </w:t>
@@ -8791,7 +9034,7 @@
         <w:t xml:space="preserve"> </w:t>
       </w:r>
       <w:r>
-        <w:t xml:space="preserve">component of school-level absence inherited from intake, area health, deprivation and family circumstances — which schools cannot themselves change — and a smaller</w:t>
+        <w:t xml:space="preserve">component of school-level absence inherited from intake, area health, deprivation and family circumstances - which schools cannot themselves change - and a smaller</w:t>
       </w:r>
       <w:r>
         <w:t xml:space="preserve"> </w:t>
@@ -8842,8 +9085,8 @@
         <w:t xml:space="preserve">Our recommendations follow. For the DfE: invest in analytical infrastructure at the local level and consider how contextualised benchmarking tools might be developed at scale. For LEAs: contextualised benchmarking and a focus on the most impactful levers should be at the centre of local policy on attainment. The factors affecting attainment are multiple, interacting, non-linear and context-dependent, and a single-narrative approach risks pulling the wrong lever. For schools, governors and parents: a contextualised value-added view offers a fairer basis for understanding school quality than raw scores or Ofsted ratings, and can support better choices that do not come at the cost of community-anchored schooling, while helping point to where improvement efforts might be most usefully targeted.</w:t>
       </w:r>
     </w:p>
-    <w:bookmarkEnd w:id="105"/>
-    <w:bookmarkStart w:id="106" w:name="declaration-of-generative-ai-use"/>
+    <w:bookmarkEnd w:id="99"/>
+    <w:bookmarkStart w:id="100" w:name="declaration-of-generative-ai-use"/>
     <w:p>
       <w:pPr>
         <w:pStyle w:val="Heading1"/>
@@ -8860,8 +9103,8 @@
         <w:t xml:space="preserve">The authors used Anthropic’s Claude Code (Claude Opus 4.6) to assist with the development of R data-processing pipelines, the implementation of multilevel model fitting and visualisation code, the formatting of tables and bibliography entries, and the rendering and deployment of Quarto outputs. Any analytical decisions and interpretations during the iterative analytical process were reviewed, verified and approved by the authors, who take full responsibility for the work.</w:t>
       </w:r>
     </w:p>
-    <w:bookmarkEnd w:id="106"/>
-    <w:bookmarkStart w:id="107" w:name="disclosure-statement"/>
+    <w:bookmarkEnd w:id="100"/>
+    <w:bookmarkStart w:id="101" w:name="disclosure-statement"/>
     <w:p>
       <w:pPr>
         <w:pStyle w:val="Heading1"/>
@@ -8878,8 +9121,8 @@
         <w:t xml:space="preserve">Some of the authors are residents of Brighton and Hove with school aged children and lived experience of the effects of the admissions policy process described. No financial conflicts of interest exist.</w:t>
       </w:r>
     </w:p>
-    <w:bookmarkEnd w:id="107"/>
-    <w:bookmarkStart w:id="204" w:name="references"/>
+    <w:bookmarkEnd w:id="101"/>
+    <w:bookmarkStart w:id="200" w:name="references"/>
     <w:p>
       <w:pPr>
         <w:pStyle w:val="Heading1"/>
@@ -8888,8 +9131,8 @@
         <w:t xml:space="preserve">References</w:t>
       </w:r>
     </w:p>
-    <w:bookmarkStart w:id="203" w:name="refs"/>
-    <w:bookmarkStart w:id="109" w:name="ref-Allen2018"/>
+    <w:bookmarkStart w:id="199" w:name="refs"/>
+    <w:bookmarkStart w:id="103" w:name="ref-Allen2018"/>
     <w:p>
       <w:pPr>
         <w:pStyle w:val="Bibliography"/>
@@ -8931,7 +9174,7 @@
       <w:r>
         <w:t xml:space="preserve"> </w:t>
       </w:r>
-      <w:hyperlink r:id="rId108">
+      <w:hyperlink r:id="rId102">
         <w:r>
           <w:rPr>
             <w:rStyle w:val="Hyperlink"/>
@@ -8943,8 +9186,8 @@
         <w:t xml:space="preserve">.</w:t>
       </w:r>
     </w:p>
-    <w:bookmarkEnd w:id="109"/>
-    <w:bookmarkStart w:id="111" w:name="ref-Allen2013"/>
+    <w:bookmarkEnd w:id="103"/>
+    <w:bookmarkStart w:id="105" w:name="ref-Allen2013"/>
     <w:p>
       <w:pPr>
         <w:pStyle w:val="Bibliography"/>
@@ -8998,7 +9241,7 @@
       <w:r>
         <w:t xml:space="preserve"> </w:t>
       </w:r>
-      <w:hyperlink r:id="rId110">
+      <w:hyperlink r:id="rId104">
         <w:r>
           <w:rPr>
             <w:rStyle w:val="Hyperlink"/>
@@ -9010,8 +9253,8 @@
         <w:t xml:space="preserve">.</w:t>
       </w:r>
     </w:p>
-    <w:bookmarkEnd w:id="111"/>
-    <w:bookmarkStart w:id="113" w:name="ref-Anders2024"/>
+    <w:bookmarkEnd w:id="105"/>
+    <w:bookmarkStart w:id="107" w:name="ref-Anders2024"/>
     <w:p>
       <w:pPr>
         <w:pStyle w:val="Bibliography"/>
@@ -9065,7 +9308,7 @@
       <w:r>
         <w:t xml:space="preserve"> </w:t>
       </w:r>
-      <w:hyperlink r:id="rId112">
+      <w:hyperlink r:id="rId106">
         <w:r>
           <w:rPr>
             <w:rStyle w:val="Hyperlink"/>
@@ -9077,8 +9320,8 @@
         <w:t xml:space="preserve">.</w:t>
       </w:r>
     </w:p>
-    <w:bookmarkEnd w:id="113"/>
-    <w:bookmarkStart w:id="115" w:name="ref-Blagg2018"/>
+    <w:bookmarkEnd w:id="107"/>
+    <w:bookmarkStart w:id="109" w:name="ref-Blagg2018"/>
     <w:p>
       <w:pPr>
         <w:pStyle w:val="Bibliography"/>
@@ -9270,7 +9513,7 @@
       <w:r>
         <w:t xml:space="preserve"> </w:t>
       </w:r>
-      <w:hyperlink r:id="rId114">
+      <w:hyperlink r:id="rId108">
         <w:r>
           <w:rPr>
             <w:rStyle w:val="Hyperlink"/>
@@ -9282,8 +9525,8 @@
         <w:t xml:space="preserve">.</w:t>
       </w:r>
     </w:p>
-    <w:bookmarkEnd w:id="115"/>
-    <w:bookmarkStart w:id="117" w:name="ref-Burgess2018"/>
+    <w:bookmarkEnd w:id="109"/>
+    <w:bookmarkStart w:id="111" w:name="ref-Burgess2018"/>
     <w:p>
       <w:pPr>
         <w:pStyle w:val="Bibliography"/>
@@ -9316,7 +9559,7 @@
       <w:r>
         <w:t xml:space="preserve"> </w:t>
       </w:r>
-      <w:hyperlink r:id="rId116">
+      <w:hyperlink r:id="rId110">
         <w:r>
           <w:rPr>
             <w:rStyle w:val="Hyperlink"/>
@@ -9328,8 +9571,8 @@
         <w:t xml:space="preserve">.</w:t>
       </w:r>
     </w:p>
-    <w:bookmarkEnd w:id="117"/>
-    <w:bookmarkStart w:id="119" w:name="ref-Burgess2023"/>
+    <w:bookmarkEnd w:id="111"/>
+    <w:bookmarkStart w:id="113" w:name="ref-Burgess2023"/>
     <w:p>
       <w:pPr>
         <w:pStyle w:val="Bibliography"/>
@@ -9362,7 +9605,7 @@
       <w:r>
         <w:t xml:space="preserve"> </w:t>
       </w:r>
-      <w:hyperlink r:id="rId118">
+      <w:hyperlink r:id="rId112">
         <w:r>
           <w:rPr>
             <w:rStyle w:val="Hyperlink"/>
@@ -9374,8 +9617,8 @@
         <w:t xml:space="preserve">.</w:t>
       </w:r>
     </w:p>
-    <w:bookmarkEnd w:id="119"/>
-    <w:bookmarkStart w:id="121" w:name="ref-Chairassamee2024"/>
+    <w:bookmarkEnd w:id="113"/>
+    <w:bookmarkStart w:id="115" w:name="ref-Chairassamee2024"/>
     <w:p>
       <w:pPr>
         <w:pStyle w:val="Bibliography"/>
@@ -9408,7 +9651,7 @@
       <w:r>
         <w:t xml:space="preserve"> </w:t>
       </w:r>
-      <w:hyperlink r:id="rId120">
+      <w:hyperlink r:id="rId114">
         <w:r>
           <w:rPr>
             <w:rStyle w:val="Hyperlink"/>
@@ -9420,8 +9663,8 @@
         <w:t xml:space="preserve">.</w:t>
       </w:r>
     </w:p>
-    <w:bookmarkEnd w:id="121"/>
-    <w:bookmarkStart w:id="123" w:name="ref-HouseofCommons2021"/>
+    <w:bookmarkEnd w:id="115"/>
+    <w:bookmarkStart w:id="117" w:name="ref-HouseofCommons2021"/>
     <w:p>
       <w:pPr>
         <w:pStyle w:val="Bibliography"/>
@@ -9571,7 +9814,7 @@
       <w:r>
         <w:t xml:space="preserve"> </w:t>
       </w:r>
-      <w:hyperlink r:id="rId122">
+      <w:hyperlink r:id="rId116">
         <w:r>
           <w:rPr>
             <w:rStyle w:val="Hyperlink"/>
@@ -9583,8 +9826,8 @@
         <w:t xml:space="preserve">.</w:t>
       </w:r>
     </w:p>
-    <w:bookmarkEnd w:id="123"/>
-    <w:bookmarkStart w:id="125" w:name="ref-Cordes2022"/>
+    <w:bookmarkEnd w:id="117"/>
+    <w:bookmarkStart w:id="119" w:name="ref-Cordes2022"/>
     <w:p>
       <w:pPr>
         <w:pStyle w:val="Bibliography"/>
@@ -9617,7 +9860,7 @@
       <w:r>
         <w:t xml:space="preserve"> </w:t>
       </w:r>
-      <w:hyperlink r:id="rId124">
+      <w:hyperlink r:id="rId118">
         <w:r>
           <w:rPr>
             <w:rStyle w:val="Hyperlink"/>
@@ -9629,8 +9872,8 @@
         <w:t xml:space="preserve">.</w:t>
       </w:r>
     </w:p>
-    <w:bookmarkEnd w:id="125"/>
-    <w:bookmarkStart w:id="127" w:name="ref-DfE2022"/>
+    <w:bookmarkEnd w:id="119"/>
+    <w:bookmarkStart w:id="121" w:name="ref-DfE2022"/>
     <w:p>
       <w:pPr>
         <w:pStyle w:val="Bibliography"/>
@@ -9731,7 +9974,7 @@
       <w:r>
         <w:t xml:space="preserve"> </w:t>
       </w:r>
-      <w:hyperlink r:id="rId126">
+      <w:hyperlink r:id="rId120">
         <w:r>
           <w:rPr>
             <w:rStyle w:val="Hyperlink"/>
@@ -9743,8 +9986,8 @@
         <w:t xml:space="preserve">.</w:t>
       </w:r>
     </w:p>
-    <w:bookmarkEnd w:id="127"/>
-    <w:bookmarkStart w:id="129" w:name="ref-DfE2025a"/>
+    <w:bookmarkEnd w:id="121"/>
+    <w:bookmarkStart w:id="123" w:name="ref-DfE2025a"/>
     <w:p>
       <w:pPr>
         <w:pStyle w:val="Bibliography"/>
@@ -9768,7 +10011,7 @@
       <w:r>
         <w:t xml:space="preserve"> </w:t>
       </w:r>
-      <w:hyperlink r:id="rId128">
+      <w:hyperlink r:id="rId122">
         <w:r>
           <w:rPr>
             <w:rStyle w:val="Hyperlink"/>
@@ -9780,8 +10023,8 @@
         <w:t xml:space="preserve">.</w:t>
       </w:r>
     </w:p>
-    <w:bookmarkEnd w:id="129"/>
-    <w:bookmarkStart w:id="131" w:name="ref-DfE2025b"/>
+    <w:bookmarkEnd w:id="123"/>
+    <w:bookmarkStart w:id="125" w:name="ref-DfE2025b"/>
     <w:p>
       <w:pPr>
         <w:pStyle w:val="Bibliography"/>
@@ -9854,7 +10097,7 @@
       <w:r>
         <w:t xml:space="preserve"> </w:t>
       </w:r>
-      <w:hyperlink r:id="rId130">
+      <w:hyperlink r:id="rId124">
         <w:r>
           <w:rPr>
             <w:rStyle w:val="Hyperlink"/>
@@ -9866,8 +10109,8 @@
         <w:t xml:space="preserve">.</w:t>
       </w:r>
     </w:p>
-    <w:bookmarkEnd w:id="131"/>
-    <w:bookmarkStart w:id="133" w:name="ref-dfe_every_2026"/>
+    <w:bookmarkEnd w:id="125"/>
+    <w:bookmarkStart w:id="127" w:name="ref-dfe_every_2026"/>
     <w:p>
       <w:pPr>
         <w:pStyle w:val="Bibliography"/>
@@ -9891,7 +10134,7 @@
       <w:r>
         <w:t xml:space="preserve"> </w:t>
       </w:r>
-      <w:hyperlink r:id="rId132">
+      <w:hyperlink r:id="rId126">
         <w:r>
           <w:rPr>
             <w:rStyle w:val="Hyperlink"/>
@@ -9903,8 +10146,8 @@
         <w:t xml:space="preserve">.</w:t>
       </w:r>
     </w:p>
-    <w:bookmarkEnd w:id="133"/>
-    <w:bookmarkStart w:id="135" w:name="ref-Ding2023"/>
+    <w:bookmarkEnd w:id="127"/>
+    <w:bookmarkStart w:id="129" w:name="ref-Ding2023"/>
     <w:p>
       <w:pPr>
         <w:pStyle w:val="Bibliography"/>
@@ -9958,7 +10201,7 @@
       <w:r>
         <w:t xml:space="preserve"> </w:t>
       </w:r>
-      <w:hyperlink r:id="rId134">
+      <w:hyperlink r:id="rId128">
         <w:r>
           <w:rPr>
             <w:rStyle w:val="Hyperlink"/>
@@ -9970,8 +10213,8 @@
         <w:t xml:space="preserve">.</w:t>
       </w:r>
     </w:p>
-    <w:bookmarkEnd w:id="135"/>
-    <w:bookmarkStart w:id="137" w:name="ref-Drager2024"/>
+    <w:bookmarkEnd w:id="129"/>
+    <w:bookmarkStart w:id="131" w:name="ref-Drager2024"/>
     <w:p>
       <w:pPr>
         <w:pStyle w:val="Bibliography"/>
@@ -10004,7 +10247,7 @@
       <w:r>
         <w:t xml:space="preserve"> </w:t>
       </w:r>
-      <w:hyperlink r:id="rId136">
+      <w:hyperlink r:id="rId130">
         <w:r>
           <w:rPr>
             <w:rStyle w:val="Hyperlink"/>
@@ -10016,8 +10259,8 @@
         <w:t xml:space="preserve">.</w:t>
       </w:r>
     </w:p>
-    <w:bookmarkEnd w:id="137"/>
-    <w:bookmarkStart w:id="139" w:name="ref-Farquharson2024"/>
+    <w:bookmarkEnd w:id="131"/>
+    <w:bookmarkStart w:id="133" w:name="ref-Farquharson2024"/>
     <w:p>
       <w:pPr>
         <w:pStyle w:val="Bibliography"/>
@@ -10050,7 +10293,7 @@
       <w:r>
         <w:t xml:space="preserve"> </w:t>
       </w:r>
-      <w:hyperlink r:id="rId138">
+      <w:hyperlink r:id="rId132">
         <w:r>
           <w:rPr>
             <w:rStyle w:val="Hyperlink"/>
@@ -10062,8 +10305,8 @@
         <w:t xml:space="preserve">.</w:t>
       </w:r>
     </w:p>
-    <w:bookmarkEnd w:id="139"/>
-    <w:bookmarkStart w:id="141" w:name="ref-Faulkner2013"/>
+    <w:bookmarkEnd w:id="133"/>
+    <w:bookmarkStart w:id="135" w:name="ref-Faulkner2013"/>
     <w:p>
       <w:pPr>
         <w:pStyle w:val="Bibliography"/>
@@ -10096,7 +10339,7 @@
       <w:r>
         <w:t xml:space="preserve"> </w:t>
       </w:r>
-      <w:hyperlink r:id="rId140">
+      <w:hyperlink r:id="rId134">
         <w:r>
           <w:rPr>
             <w:rStyle w:val="Hyperlink"/>
@@ -10108,8 +10351,8 @@
         <w:t xml:space="preserve">.</w:t>
       </w:r>
     </w:p>
-    <w:bookmarkEnd w:id="141"/>
-    <w:bookmarkStart w:id="143" w:name="ref-Fredriksen2004"/>
+    <w:bookmarkEnd w:id="135"/>
+    <w:bookmarkStart w:id="137" w:name="ref-Fredriksen2004"/>
     <w:p>
       <w:pPr>
         <w:pStyle w:val="Bibliography"/>
@@ -10139,7 +10382,7 @@
       <w:r>
         <w:t xml:space="preserve">75 (1): 84–95. https://doi.org/</w:t>
       </w:r>
-      <w:hyperlink r:id="rId142">
+      <w:hyperlink r:id="rId136">
         <w:r>
           <w:rPr>
             <w:rStyle w:val="Hyperlink"/>
@@ -10151,8 +10394,8 @@
         <w:t xml:space="preserve">.</w:t>
       </w:r>
     </w:p>
-    <w:bookmarkEnd w:id="143"/>
-    <w:bookmarkStart w:id="145" w:name="ref-Gibbons2018"/>
+    <w:bookmarkEnd w:id="137"/>
+    <w:bookmarkStart w:id="139" w:name="ref-Gibbons2018"/>
     <w:p>
       <w:pPr>
         <w:pStyle w:val="Bibliography"/>
@@ -10176,7 +10419,7 @@
       <w:r>
         <w:t xml:space="preserve"> </w:t>
       </w:r>
-      <w:hyperlink r:id="rId144">
+      <w:hyperlink r:id="rId138">
         <w:r>
           <w:rPr>
             <w:rStyle w:val="Hyperlink"/>
@@ -10188,8 +10431,8 @@
         <w:t xml:space="preserve">.</w:t>
       </w:r>
     </w:p>
-    <w:bookmarkEnd w:id="145"/>
-    <w:bookmarkStart w:id="147" w:name="ref-Gillborn2017"/>
+    <w:bookmarkEnd w:id="139"/>
+    <w:bookmarkStart w:id="141" w:name="ref-Gillborn2017"/>
     <w:p>
       <w:pPr>
         <w:pStyle w:val="Bibliography"/>
@@ -10252,7 +10495,7 @@
       <w:r>
         <w:t xml:space="preserve"> </w:t>
       </w:r>
-      <w:hyperlink r:id="rId146">
+      <w:hyperlink r:id="rId140">
         <w:r>
           <w:rPr>
             <w:rStyle w:val="Hyperlink"/>
@@ -10264,8 +10507,8 @@
         <w:t xml:space="preserve">.</w:t>
       </w:r>
     </w:p>
-    <w:bookmarkEnd w:id="147"/>
-    <w:bookmarkStart w:id="149" w:name="ref-gorard_how_2019"/>
+    <w:bookmarkEnd w:id="141"/>
+    <w:bookmarkStart w:id="143" w:name="ref-gorard_how_2019"/>
     <w:p>
       <w:pPr>
         <w:pStyle w:val="Bibliography"/>
@@ -10343,7 +10586,7 @@
       <w:r>
         <w:t xml:space="preserve"> </w:t>
       </w:r>
-      <w:hyperlink r:id="rId148">
+      <w:hyperlink r:id="rId142">
         <w:r>
           <w:rPr>
             <w:rStyle w:val="Hyperlink"/>
@@ -10355,8 +10598,8 @@
         <w:t xml:space="preserve">.</w:t>
       </w:r>
     </w:p>
-    <w:bookmarkEnd w:id="149"/>
-    <w:bookmarkStart w:id="151" w:name="ref-gorard_school_2025"/>
+    <w:bookmarkEnd w:id="143"/>
+    <w:bookmarkStart w:id="145" w:name="ref-gorard_school_2025"/>
     <w:p>
       <w:pPr>
         <w:pStyle w:val="Bibliography"/>
@@ -10509,7 +10752,7 @@
       <w:r>
         <w:t xml:space="preserve"> </w:t>
       </w:r>
-      <w:hyperlink r:id="rId150">
+      <w:hyperlink r:id="rId144">
         <w:r>
           <w:rPr>
             <w:rStyle w:val="Hyperlink"/>
@@ -10521,8 +10764,8 @@
         <w:t xml:space="preserve">.</w:t>
       </w:r>
     </w:p>
-    <w:bookmarkEnd w:id="151"/>
-    <w:bookmarkStart w:id="153" w:name="ref-Grant2017"/>
+    <w:bookmarkEnd w:id="145"/>
+    <w:bookmarkStart w:id="147" w:name="ref-Grant2017"/>
     <w:p>
       <w:pPr>
         <w:pStyle w:val="Bibliography"/>
@@ -10630,7 +10873,7 @@
       <w:r>
         <w:t xml:space="preserve"> </w:t>
       </w:r>
-      <w:hyperlink r:id="rId152">
+      <w:hyperlink r:id="rId146">
         <w:r>
           <w:rPr>
             <w:rStyle w:val="Hyperlink"/>
@@ -10642,8 +10885,8 @@
         <w:t xml:space="preserve">.</w:t>
       </w:r>
     </w:p>
-    <w:bookmarkEnd w:id="153"/>
-    <w:bookmarkStart w:id="155" w:name="ref-Guan2025"/>
+    <w:bookmarkEnd w:id="147"/>
+    <w:bookmarkStart w:id="149" w:name="ref-Guan2025"/>
     <w:p>
       <w:pPr>
         <w:pStyle w:val="Bibliography"/>
@@ -10685,7 +10928,7 @@
       <w:r>
         <w:t xml:space="preserve"> </w:t>
       </w:r>
-      <w:hyperlink r:id="rId154">
+      <w:hyperlink r:id="rId148">
         <w:r>
           <w:rPr>
             <w:rStyle w:val="Hyperlink"/>
@@ -10697,8 +10940,8 @@
         <w:t xml:space="preserve">.</w:t>
       </w:r>
     </w:p>
-    <w:bookmarkEnd w:id="155"/>
-    <w:bookmarkStart w:id="157" w:name="ref-houtepen_associations_2020"/>
+    <w:bookmarkEnd w:id="149"/>
+    <w:bookmarkStart w:id="151" w:name="ref-houtepen_associations_2020"/>
     <w:p>
       <w:pPr>
         <w:pStyle w:val="Bibliography"/>
@@ -10752,7 +10995,7 @@
       <w:r>
         <w:t xml:space="preserve"> </w:t>
       </w:r>
-      <w:hyperlink r:id="rId156">
+      <w:hyperlink r:id="rId150">
         <w:r>
           <w:rPr>
             <w:rStyle w:val="Hyperlink"/>
@@ -10764,8 +11007,8 @@
         <w:t xml:space="preserve">.</w:t>
       </w:r>
     </w:p>
-    <w:bookmarkEnd w:id="157"/>
-    <w:bookmarkStart w:id="159" w:name="ref-Karan2021"/>
+    <w:bookmarkEnd w:id="151"/>
+    <w:bookmarkStart w:id="153" w:name="ref-Karan2021"/>
     <w:p>
       <w:pPr>
         <w:pStyle w:val="Bibliography"/>
@@ -10810,7 +11053,7 @@
       <w:r>
         <w:t xml:space="preserve"> </w:t>
       </w:r>
-      <w:hyperlink r:id="rId158">
+      <w:hyperlink r:id="rId152">
         <w:r>
           <w:rPr>
             <w:rStyle w:val="Hyperlink"/>
@@ -10822,8 +11065,8 @@
         <w:t xml:space="preserve">.</w:t>
       </w:r>
     </w:p>
-    <w:bookmarkEnd w:id="159"/>
-    <w:bookmarkStart w:id="161" w:name="ref-macleod_supporting_2015"/>
+    <w:bookmarkEnd w:id="153"/>
+    <w:bookmarkStart w:id="155" w:name="ref-macleod_supporting_2015"/>
     <w:p>
       <w:pPr>
         <w:pStyle w:val="Bibliography"/>
@@ -10980,7 +11223,7 @@
       <w:r>
         <w:t xml:space="preserve"> </w:t>
       </w:r>
-      <w:hyperlink r:id="rId160">
+      <w:hyperlink r:id="rId154">
         <w:r>
           <w:rPr>
             <w:rStyle w:val="Hyperlink"/>
@@ -10992,8 +11235,8 @@
         <w:t xml:space="preserve">.</w:t>
       </w:r>
     </w:p>
-    <w:bookmarkEnd w:id="161"/>
-    <w:bookmarkStart w:id="163" w:name="ref-Menzies2023"/>
+    <w:bookmarkEnd w:id="155"/>
+    <w:bookmarkStart w:id="157" w:name="ref-Menzies2023"/>
     <w:p>
       <w:pPr>
         <w:pStyle w:val="Bibliography"/>
@@ -11026,7 +11269,7 @@
       <w:r>
         <w:t xml:space="preserve"> </w:t>
       </w:r>
-      <w:hyperlink r:id="rId162">
+      <w:hyperlink r:id="rId156">
         <w:r>
           <w:rPr>
             <w:rStyle w:val="Hyperlink"/>
@@ -11038,13 +11281,50 @@
         <w:t xml:space="preserve">.</w:t>
       </w:r>
     </w:p>
-    <w:bookmarkEnd w:id="163"/>
-    <w:bookmarkStart w:id="165" w:name="ref-nakagawa_coefficient_2017"/>
+    <w:bookmarkEnd w:id="157"/>
+    <w:bookmarkStart w:id="159" w:name="ref-Moore2026"/>
     <w:p>
       <w:pPr>
         <w:pStyle w:val="Bibliography"/>
       </w:pPr>
       <w:r>
+        <w:t xml:space="preserve">Moore, Emma, Juan Manuel Del Pozo Segura, and Jenna Julius. 2026.</w:t>
+      </w:r>
+      <w:r>
+        <w:t xml:space="preserve"> </w:t>
+      </w:r>
+      <w:r>
+        <w:rPr>
+          <w:i/>
+          <w:iCs/>
+        </w:rPr>
+        <w:t xml:space="preserve">Understanding the Relationship Between Attendance, Wellbeing and Sense of Belonging</w:t>
+      </w:r>
+      <w:r>
+        <w:t xml:space="preserve">. National Foundation for Educational Research.</w:t>
+      </w:r>
+      <w:r>
+        <w:t xml:space="preserve"> </w:t>
+      </w:r>
+      <w:hyperlink r:id="rId158">
+        <w:r>
+          <w:rPr>
+            <w:rStyle w:val="Hyperlink"/>
+          </w:rPr>
+          <w:t xml:space="preserve">https://www.nfer.ac.uk/publications/understanding-the-relationship-between-attendance-wellbeing-and-sense-of-belonging/</w:t>
+        </w:r>
+      </w:hyperlink>
+      <w:r>
+        <w:t xml:space="preserve">.</w:t>
+      </w:r>
+    </w:p>
+    <w:bookmarkEnd w:id="159"/>
+    <w:bookmarkStart w:id="161" w:name="ref-nakagawa_coefficient_2017"/>
+    <w:p>
+      <w:pPr>
+        <w:pStyle w:val="Bibliography"/>
+      </w:pPr>
+      <w:r>
         <w:t xml:space="preserve">Nakagawa, Shinichi, Paul C. D. Johnson, and Holger Schielzeth. 2017.</w:t>
       </w:r>
       <w:r>
@@ -11084,7 +11364,7 @@
       <w:r>
         <w:t xml:space="preserve"> </w:t>
       </w:r>
-      <w:hyperlink r:id="rId164">
+      <w:hyperlink r:id="rId160">
         <w:r>
           <w:rPr>
             <w:rStyle w:val="Hyperlink"/>
@@ -11096,8 +11376,8 @@
         <w:t xml:space="preserve">.</w:t>
       </w:r>
     </w:p>
-    <w:bookmarkEnd w:id="165"/>
-    <w:bookmarkStart w:id="167" w:name="ref-nakagawa_general_2013"/>
+    <w:bookmarkEnd w:id="161"/>
+    <w:bookmarkStart w:id="163" w:name="ref-nakagawa_general_2013"/>
     <w:p>
       <w:pPr>
         <w:pStyle w:val="Bibliography"/>
@@ -11142,7 +11422,7 @@
       <w:r>
         <w:t xml:space="preserve"> </w:t>
       </w:r>
-      <w:hyperlink r:id="rId166">
+      <w:hyperlink r:id="rId162">
         <w:r>
           <w:rPr>
             <w:rStyle w:val="Hyperlink"/>
@@ -11154,8 +11434,8 @@
         <w:t xml:space="preserve">.</w:t>
       </w:r>
     </w:p>
-    <w:bookmarkEnd w:id="167"/>
-    <w:bookmarkStart w:id="169" w:name="ref-Nakajima2024"/>
+    <w:bookmarkEnd w:id="163"/>
+    <w:bookmarkStart w:id="165" w:name="ref-Nakajima2024"/>
     <w:p>
       <w:pPr>
         <w:pStyle w:val="Bibliography"/>
@@ -11200,7 +11480,7 @@
       <w:r>
         <w:t xml:space="preserve"> </w:t>
       </w:r>
-      <w:hyperlink r:id="rId168">
+      <w:hyperlink r:id="rId164">
         <w:r>
           <w:rPr>
             <w:rStyle w:val="Hyperlink"/>
@@ -11212,8 +11492,8 @@
         <w:t xml:space="preserve">.</w:t>
       </w:r>
     </w:p>
-    <w:bookmarkEnd w:id="169"/>
-    <w:bookmarkStart w:id="171" w:name="ref-Otsuka2025"/>
+    <w:bookmarkEnd w:id="165"/>
+    <w:bookmarkStart w:id="167" w:name="ref-Otsuka2025"/>
     <w:p>
       <w:pPr>
         <w:pStyle w:val="Bibliography"/>
@@ -11258,7 +11538,7 @@
       <w:r>
         <w:t xml:space="preserve"> </w:t>
       </w:r>
-      <w:hyperlink r:id="rId170">
+      <w:hyperlink r:id="rId166">
         <w:r>
           <w:rPr>
             <w:rStyle w:val="Hyperlink"/>
@@ -11270,8 +11550,8 @@
         <w:t xml:space="preserve">.</w:t>
       </w:r>
     </w:p>
-    <w:bookmarkEnd w:id="171"/>
-    <w:bookmarkStart w:id="173" w:name="ref-Pereira2014"/>
+    <w:bookmarkEnd w:id="167"/>
+    <w:bookmarkStart w:id="169" w:name="ref-Pereira2014"/>
     <w:p>
       <w:pPr>
         <w:pStyle w:val="Bibliography"/>
@@ -11304,7 +11584,7 @@
       <w:r>
         <w:t xml:space="preserve"> </w:t>
       </w:r>
-      <w:hyperlink r:id="rId172">
+      <w:hyperlink r:id="rId168">
         <w:r>
           <w:rPr>
             <w:rStyle w:val="Hyperlink"/>
@@ -11316,8 +11596,8 @@
         <w:t xml:space="preserve">.</w:t>
       </w:r>
     </w:p>
-    <w:bookmarkEnd w:id="173"/>
-    <w:bookmarkStart w:id="175" w:name="ref-Pradhan2017"/>
+    <w:bookmarkEnd w:id="169"/>
+    <w:bookmarkStart w:id="171" w:name="ref-Pradhan2017"/>
     <w:p>
       <w:pPr>
         <w:pStyle w:val="Bibliography"/>
@@ -11350,7 +11630,7 @@
       <w:r>
         <w:t xml:space="preserve"> </w:t>
       </w:r>
-      <w:hyperlink r:id="rId174">
+      <w:hyperlink r:id="rId170">
         <w:r>
           <w:rPr>
             <w:rStyle w:val="Hyperlink"/>
@@ -11362,8 +11642,8 @@
         <w:t xml:space="preserve">.</w:t>
       </w:r>
     </w:p>
-    <w:bookmarkEnd w:id="175"/>
-    <w:bookmarkStart w:id="177" w:name="ref-Rakesh2025"/>
+    <w:bookmarkEnd w:id="171"/>
+    <w:bookmarkStart w:id="173" w:name="ref-Rakesh2025"/>
     <w:p>
       <w:pPr>
         <w:pStyle w:val="Bibliography"/>
@@ -11423,7 +11703,7 @@
       <w:r>
         <w:t xml:space="preserve"> </w:t>
       </w:r>
-      <w:hyperlink r:id="rId176">
+      <w:hyperlink r:id="rId172">
         <w:r>
           <w:rPr>
             <w:rStyle w:val="Hyperlink"/>
@@ -11435,8 +11715,8 @@
         <w:t xml:space="preserve">.</w:t>
       </w:r>
     </w:p>
-    <w:bookmarkEnd w:id="177"/>
-    <w:bookmarkStart w:id="179" w:name="ref-Riordan2021"/>
+    <w:bookmarkEnd w:id="173"/>
+    <w:bookmarkStart w:id="175" w:name="ref-Riordan2021"/>
     <w:p>
       <w:pPr>
         <w:pStyle w:val="Bibliography"/>
@@ -11460,7 +11740,7 @@
       <w:r>
         <w:t xml:space="preserve"> </w:t>
       </w:r>
-      <w:hyperlink r:id="rId178">
+      <w:hyperlink r:id="rId174">
         <w:r>
           <w:rPr>
             <w:rStyle w:val="Hyperlink"/>
@@ -11472,8 +11752,8 @@
         <w:t xml:space="preserve">.</w:t>
       </w:r>
     </w:p>
-    <w:bookmarkEnd w:id="179"/>
-    <w:bookmarkStart w:id="181" w:name="ref-Ross2020"/>
+    <w:bookmarkEnd w:id="175"/>
+    <w:bookmarkStart w:id="177" w:name="ref-Ross2020"/>
     <w:p>
       <w:pPr>
         <w:pStyle w:val="Bibliography"/>
@@ -11539,7 +11819,7 @@
       <w:r>
         <w:t xml:space="preserve"> </w:t>
       </w:r>
-      <w:hyperlink r:id="rId180">
+      <w:hyperlink r:id="rId176">
         <w:r>
           <w:rPr>
             <w:rStyle w:val="Hyperlink"/>
@@ -11551,8 +11831,8 @@
         <w:t xml:space="preserve">.</w:t>
       </w:r>
     </w:p>
-    <w:bookmarkEnd w:id="181"/>
-    <w:bookmarkStart w:id="183" w:name="ref-Shah2023"/>
+    <w:bookmarkEnd w:id="177"/>
+    <w:bookmarkStart w:id="179" w:name="ref-Shah2023"/>
     <w:p>
       <w:pPr>
         <w:pStyle w:val="Bibliography"/>
@@ -11677,7 +11957,7 @@
       <w:r>
         <w:t xml:space="preserve"> </w:t>
       </w:r>
-      <w:hyperlink r:id="rId182">
+      <w:hyperlink r:id="rId178">
         <w:r>
           <w:rPr>
             <w:rStyle w:val="Hyperlink"/>
@@ -11689,8 +11969,8 @@
         <w:t xml:space="preserve">.</w:t>
       </w:r>
     </w:p>
-    <w:bookmarkEnd w:id="183"/>
-    <w:bookmarkStart w:id="184" w:name="ref-Snijders2012"/>
+    <w:bookmarkEnd w:id="179"/>
+    <w:bookmarkStart w:id="180" w:name="ref-Snijders2012"/>
     <w:p>
       <w:pPr>
         <w:pStyle w:val="Bibliography"/>
@@ -11712,8 +11992,8 @@
         <w:t xml:space="preserve">. 2nd ed. SAGE.</w:t>
       </w:r>
     </w:p>
-    <w:bookmarkEnd w:id="184"/>
-    <w:bookmarkStart w:id="186" w:name="ref-Stein2021"/>
+    <w:bookmarkEnd w:id="180"/>
+    <w:bookmarkStart w:id="182" w:name="ref-Stein2021"/>
     <w:p>
       <w:pPr>
         <w:pStyle w:val="Bibliography"/>
@@ -11746,7 +12026,7 @@
       <w:r>
         <w:t xml:space="preserve"> </w:t>
       </w:r>
-      <w:hyperlink r:id="rId185">
+      <w:hyperlink r:id="rId181">
         <w:r>
           <w:rPr>
             <w:rStyle w:val="Hyperlink"/>
@@ -11758,8 +12038,8 @@
         <w:t xml:space="preserve">.</w:t>
       </w:r>
     </w:p>
-    <w:bookmarkEnd w:id="186"/>
-    <w:bookmarkStart w:id="188" w:name="ref-StopforthGayle2025"/>
+    <w:bookmarkEnd w:id="182"/>
+    <w:bookmarkStart w:id="184" w:name="ref-StopforthGayle2025"/>
     <w:p>
       <w:pPr>
         <w:pStyle w:val="Bibliography"/>
@@ -11792,7 +12072,7 @@
       <w:r>
         <w:t xml:space="preserve"> </w:t>
       </w:r>
-      <w:hyperlink r:id="rId187">
+      <w:hyperlink r:id="rId183">
         <w:r>
           <w:rPr>
             <w:rStyle w:val="Hyperlink"/>
@@ -11804,8 +12084,8 @@
         <w:t xml:space="preserve">.</w:t>
       </w:r>
     </w:p>
-    <w:bookmarkEnd w:id="188"/>
-    <w:bookmarkStart w:id="190" w:name="ref-Strand2021"/>
+    <w:bookmarkEnd w:id="184"/>
+    <w:bookmarkStart w:id="186" w:name="ref-Strand2021"/>
     <w:p>
       <w:pPr>
         <w:pStyle w:val="Bibliography"/>
@@ -11871,7 +12151,7 @@
       <w:r>
         <w:t xml:space="preserve"> </w:t>
       </w:r>
-      <w:hyperlink r:id="rId189">
+      <w:hyperlink r:id="rId185">
         <w:r>
           <w:rPr>
             <w:rStyle w:val="Hyperlink"/>
@@ -11883,8 +12163,8 @@
         <w:t xml:space="preserve">.</w:t>
       </w:r>
     </w:p>
-    <w:bookmarkEnd w:id="190"/>
-    <w:bookmarkStart w:id="192" w:name="ref-tan_good_2025"/>
+    <w:bookmarkEnd w:id="186"/>
+    <w:bookmarkStart w:id="188" w:name="ref-tan_good_2025"/>
     <w:p>
       <w:pPr>
         <w:pStyle w:val="Bibliography"/>
@@ -12051,7 +12331,7 @@
       <w:r>
         <w:t xml:space="preserve"> </w:t>
       </w:r>
-      <w:hyperlink r:id="rId191">
+      <w:hyperlink r:id="rId187">
         <w:r>
           <w:rPr>
             <w:rStyle w:val="Hyperlink"/>
@@ -12063,8 +12343,8 @@
         <w:t xml:space="preserve">.</w:t>
       </w:r>
     </w:p>
-    <w:bookmarkEnd w:id="192"/>
-    <w:bookmarkStart w:id="194" w:name="ref-Thomson2023"/>
+    <w:bookmarkEnd w:id="188"/>
+    <w:bookmarkStart w:id="190" w:name="ref-Thomson2023"/>
     <w:p>
       <w:pPr>
         <w:pStyle w:val="Bibliography"/>
@@ -12097,7 +12377,7 @@
       <w:r>
         <w:t xml:space="preserve"> </w:t>
       </w:r>
-      <w:hyperlink r:id="rId193">
+      <w:hyperlink r:id="rId189">
         <w:r>
           <w:rPr>
             <w:rStyle w:val="Hyperlink"/>
@@ -12109,8 +12389,8 @@
         <w:t xml:space="preserve">.</w:t>
       </w:r>
     </w:p>
-    <w:bookmarkEnd w:id="194"/>
-    <w:bookmarkStart w:id="196" w:name="ref-Tuckett2023"/>
+    <w:bookmarkEnd w:id="190"/>
+    <w:bookmarkStart w:id="192" w:name="ref-Tuckett2023"/>
     <w:p>
       <w:pPr>
         <w:pStyle w:val="Bibliography"/>
@@ -12176,7 +12456,7 @@
       <w:r>
         <w:t xml:space="preserve"> </w:t>
       </w:r>
-      <w:hyperlink r:id="rId195">
+      <w:hyperlink r:id="rId191">
         <w:r>
           <w:rPr>
             <w:rStyle w:val="Hyperlink"/>
@@ -12188,8 +12468,8 @@
         <w:t xml:space="preserve">.</w:t>
       </w:r>
     </w:p>
-    <w:bookmarkEnd w:id="196"/>
-    <w:bookmarkStart w:id="198" w:name="ref-Voulgaris2019"/>
+    <w:bookmarkEnd w:id="192"/>
+    <w:bookmarkStart w:id="194" w:name="ref-Voulgaris2019"/>
     <w:p>
       <w:pPr>
         <w:pStyle w:val="Bibliography"/>
@@ -12246,7 +12526,7 @@
       <w:r>
         <w:t xml:space="preserve"> </w:t>
       </w:r>
-      <w:hyperlink r:id="rId197">
+      <w:hyperlink r:id="rId193">
         <w:r>
           <w:rPr>
             <w:rStyle w:val="Hyperlink"/>
@@ -12258,8 +12538,8 @@
         <w:t xml:space="preserve">.</w:t>
       </w:r>
     </w:p>
-    <w:bookmarkEnd w:id="198"/>
-    <w:bookmarkStart w:id="200" w:name="ref-Yeo2019"/>
+    <w:bookmarkEnd w:id="194"/>
+    <w:bookmarkStart w:id="196" w:name="ref-Yeo2019"/>
     <w:p>
       <w:pPr>
         <w:pStyle w:val="Bibliography"/>
@@ -12292,7 +12572,7 @@
       <w:r>
         <w:t xml:space="preserve"> </w:t>
       </w:r>
-      <w:hyperlink r:id="rId199">
+      <w:hyperlink r:id="rId195">
         <w:r>
           <w:rPr>
             <w:rStyle w:val="Hyperlink"/>
@@ -12304,8 +12584,8 @@
         <w:t xml:space="preserve">.</w:t>
       </w:r>
     </w:p>
-    <w:bookmarkEnd w:id="200"/>
-    <w:bookmarkStart w:id="202" w:name="ref-Zuccollo2023"/>
+    <w:bookmarkEnd w:id="196"/>
+    <w:bookmarkStart w:id="198" w:name="ref-Zuccollo2023"/>
     <w:p>
       <w:pPr>
         <w:pStyle w:val="Bibliography"/>
@@ -12329,7 +12609,7 @@
       <w:r>
         <w:t xml:space="preserve"> </w:t>
       </w:r>
-      <w:hyperlink r:id="rId201">
+      <w:hyperlink r:id="rId197">
         <w:r>
           <w:rPr>
             <w:rStyle w:val="Hyperlink"/>
@@ -12341,9 +12621,9 @@
         <w:t xml:space="preserve">.</w:t>
       </w:r>
     </w:p>
-    <w:bookmarkEnd w:id="202"/>
-    <w:bookmarkEnd w:id="203"/>
-    <w:bookmarkEnd w:id="204"/>
+    <w:bookmarkEnd w:id="198"/>
+    <w:bookmarkEnd w:id="199"/>
+    <w:bookmarkEnd w:id="200"/>
     <w:sectPr>
       <w:footnotePr>
         <w:numRestart w:val="eachSect"/>
@@ -12395,9 +12675,15 @@
           <w:rPr>
             <w:rStyle w:val="Hyperlink"/>
           </w:rPr>
-          <w:t xml:space="preserve">https://adamdennett.github.io/BH_Schools_Consultation/about.html</w:t>
+          <w:t xml:space="preserve">https://osf.io/x82j3/overview</w:t>
         </w:r>
       </w:hyperlink>
+      <w:r>
+        <w:t xml:space="preserve"> </w:t>
+      </w:r>
+      <w:r>
+        <w:t xml:space="preserve">(see `about.html` in `supplementary.zip`)</w:t>
+      </w:r>
     </w:p>
   </w:footnote>
   <w:footnote w:id="23">
@@ -12450,12 +12736,12 @@
       <w:r>
         <w:t xml:space="preserve"> </w:t>
       </w:r>
-      <w:hyperlink r:id="rId30">
+      <w:hyperlink r:id="rId21">
         <w:r>
           <w:rPr>
             <w:rStyle w:val="Hyperlink"/>
           </w:rPr>
-          <w:t xml:space="preserve">https://adamdennett.github.io/school_attainment_tool/</w:t>
+          <w:t xml:space="preserve">https://osf.io/x82j3/overview (see `index.html` in `supplementary.zip`)</w:t>
         </w:r>
       </w:hyperlink>
       <w:r>
@@ -12466,7 +12752,7 @@
       </w:r>
     </w:p>
   </w:footnote>
-  <w:footnote w:id="31">
+  <w:footnote w:id="30">
     <w:p>
       <w:pPr>
         <w:pStyle w:val="FootnoteText"/>
@@ -12486,17 +12772,17 @@
       <w:r>
         <w:t xml:space="preserve"> </w:t>
       </w:r>
-      <w:hyperlink r:id="rId32">
+      <w:hyperlink r:id="rId21">
         <w:r>
           <w:rPr>
             <w:rStyle w:val="Hyperlink"/>
           </w:rPr>
-          <w:t xml:space="preserve">https://adamdennett.github.io/school_attainment_tool/data_overview.html#missing-data</w:t>
+          <w:t xml:space="preserve">https://osf.io/x82j3/overview (see `data_overview.html#missing-data` in `supplementary.zip`)</w:t>
         </w:r>
       </w:hyperlink>
     </w:p>
   </w:footnote>
-  <w:footnote w:id="34">
+  <w:footnote w:id="32">
     <w:p>
       <w:pPr>
         <w:pStyle w:val="FootnoteText"/>
@@ -12516,17 +12802,17 @@
       <w:r>
         <w:t xml:space="preserve"> </w:t>
       </w:r>
-      <w:hyperlink r:id="rId35">
+      <w:hyperlink r:id="rId21">
         <w:r>
           <w:rPr>
             <w:rStyle w:val="Hyperlink"/>
           </w:rPr>
-          <w:t xml:space="preserve">https://osf.io/x82j3/overview</w:t>
+          <w:t xml:space="preserve">https://osf.io/x82j3/overview (see `data_overview.html` in `supplementary.zip`)</w:t>
         </w:r>
       </w:hyperlink>
     </w:p>
   </w:footnote>
-  <w:footnote w:id="45">
+  <w:footnote w:id="42">
     <w:p>
       <w:pPr>
         <w:pStyle w:val="FootnoteText"/>
@@ -12709,7 +12995,7 @@
       </w:r>
     </w:p>
   </w:footnote>
-  <w:footnote w:id="46">
+  <w:footnote w:id="43">
     <w:p>
       <w:pPr>
         <w:pStyle w:val="FootnoteText"/>
@@ -12729,17 +13015,17 @@
       <w:r>
         <w:t xml:space="preserve"> </w:t>
       </w:r>
-      <w:hyperlink r:id="rId47">
+      <w:hyperlink r:id="rId21">
         <w:r>
           <w:rPr>
             <w:rStyle w:val="Hyperlink"/>
           </w:rPr>
-          <w:t xml:space="preserve">https://adamdennett.github.io/school_attainment_tool/model_results.html#stepwise-model-building</w:t>
+          <w:t xml:space="preserve">https://osf.io/x82j3/overview (see `model_results.html#stepwise-model-building` in `supplementary.zip`)</w:t>
         </w:r>
       </w:hyperlink>
     </w:p>
   </w:footnote>
-  <w:footnote w:id="48">
+  <w:footnote w:id="44">
     <w:p>
       <w:pPr>
         <w:pStyle w:val="FootnoteText"/>
@@ -12759,17 +13045,17 @@
       <w:r>
         <w:t xml:space="preserve"> </w:t>
       </w:r>
-      <w:hyperlink r:id="rId49">
+      <w:hyperlink r:id="rId21">
         <w:r>
           <w:rPr>
             <w:rStyle w:val="Hyperlink"/>
           </w:rPr>
-          <w:t xml:space="preserve">https://adamdennett.github.io/school_attainment_tool/model_experiments.html</w:t>
+          <w:t xml:space="preserve">https://osf.io/x82j3/overview (see `model_experiments.html` in `supplementary.zip`)</w:t>
         </w:r>
       </w:hyperlink>
     </w:p>
   </w:footnote>
-  <w:footnote w:id="52">
+  <w:footnote w:id="47">
     <w:p>
       <w:pPr>
         <w:pStyle w:val="FootnoteText"/>
@@ -12800,12 +13086,12 @@
         <w:t xml:space="preserve"> </w:t>
       </w:r>
       <w:r>
-        <w:t xml:space="preserve">— Cabinet Report, 5 December 2024 (decision to consult):</w:t>
-      </w:r>
-      <w:r>
-        <w:t xml:space="preserve"> </w:t>
-      </w:r>
-      <w:hyperlink r:id="rId53">
+        <w:t xml:space="preserve">- Cabinet Report, 5 December 2024 (decision to consult):</w:t>
+      </w:r>
+      <w:r>
+        <w:t xml:space="preserve"> </w:t>
+      </w:r>
+      <w:hyperlink r:id="rId48">
         <w:r>
           <w:rPr>
             <w:rStyle w:val="Hyperlink"/>
@@ -12830,12 +13116,12 @@
         <w:t xml:space="preserve"> </w:t>
       </w:r>
       <w:r>
-        <w:t xml:space="preserve">— Full Council Report, 27 February 2025 (determination):</w:t>
-      </w:r>
-      <w:r>
-        <w:t xml:space="preserve"> </w:t>
-      </w:r>
-      <w:hyperlink r:id="rId54">
+        <w:t xml:space="preserve">- Full Council Report, 27 February 2025 (determination):</w:t>
+      </w:r>
+      <w:r>
+        <w:t xml:space="preserve"> </w:t>
+      </w:r>
+      <w:hyperlink r:id="rId49">
         <w:r>
           <w:rPr>
             <w:rStyle w:val="Hyperlink"/>
@@ -12848,7 +13134,7 @@
       </w:r>
     </w:p>
   </w:footnote>
-  <w:footnote w:id="55">
+  <w:footnote w:id="50">
     <w:p>
       <w:pPr>
         <w:pStyle w:val="FootnoteText"/>
@@ -12873,7 +13159,7 @@
           <w:i/>
           <w:iCs/>
         </w:rPr>
-        <w:t xml:space="preserve">School Admission Arrangements 2026/27 — Appendix 9: Transport Implications and Considerations</w:t>
+        <w:t xml:space="preserve">School Admission Arrangements 2026/27 - Appendix 9: Transport Implications and Considerations</w:t>
       </w:r>
       <w:r>
         <w:t xml:space="preserve">. Cabinet papers accompanying the secondary school admissions consultation, available via the consultation portal:</w:t>
@@ -12881,7 +13167,7 @@
       <w:r>
         <w:t xml:space="preserve"> </w:t>
       </w:r>
-      <w:hyperlink r:id="rId56">
+      <w:hyperlink r:id="rId51">
         <w:r>
           <w:rPr>
             <w:rStyle w:val="Hyperlink"/>
@@ -12894,7 +13180,7 @@
       </w:r>
     </w:p>
   </w:footnote>
-  <w:footnote w:id="57">
+  <w:footnote w:id="52">
     <w:p>
       <w:pPr>
         <w:pStyle w:val="FootnoteText"/>
@@ -12908,7 +13194,7 @@
       <w:r>
         <w:t xml:space="preserve"> </w:t>
       </w:r>
-      <w:hyperlink r:id="rId58">
+      <w:hyperlink r:id="rId53">
         <w:r>
           <w:rPr>
             <w:rStyle w:val="Hyperlink"/>
@@ -12918,7 +13204,7 @@
       </w:hyperlink>
     </w:p>
   </w:footnote>
-  <w:footnote w:id="80">
+  <w:footnote w:id="75">
     <w:p>
       <w:pPr>
         <w:pStyle w:val="FootnoteText"/>
@@ -12938,17 +13224,17 @@
       <w:r>
         <w:t xml:space="preserve"> </w:t>
       </w:r>
-      <w:hyperlink r:id="rId81">
+      <w:hyperlink r:id="rId21">
         <w:r>
           <w:rPr>
             <w:rStyle w:val="Hyperlink"/>
           </w:rPr>
-          <w:t xml:space="preserve">https://adamdennett.github.io/school_attainment_tool/model_experiments.html#sec-two-stage-absence</w:t>
+          <w:t xml:space="preserve">https://osf.io/x82j3/overview (see `model_experiments.html#sec-two-stage-absence` in `supplementary.zip`)</w:t>
         </w:r>
       </w:hyperlink>
     </w:p>
   </w:footnote>
-  <w:footnote w:id="88">
+  <w:footnote w:id="82">
     <w:p>
       <w:pPr>
         <w:pStyle w:val="FootnoteText"/>
@@ -12968,7 +13254,7 @@
       <w:r>
         <w:t xml:space="preserve"> </w:t>
       </w:r>
-      <w:hyperlink r:id="rId56">
+      <w:hyperlink r:id="rId51">
         <w:r>
           <w:rPr>
             <w:rStyle w:val="Hyperlink"/>
@@ -12978,7 +13264,7 @@
       </w:hyperlink>
     </w:p>
   </w:footnote>
-  <w:footnote w:id="90">
+  <w:footnote w:id="84">
     <w:p>
       <w:pPr>
         <w:pStyle w:val="FootnoteText"/>
@@ -13009,12 +13295,12 @@
         <w:t xml:space="preserve"> </w:t>
       </w:r>
       <w:r>
-        <w:t xml:space="preserve">— Cabinet Report, 5 December 2024 (decision to consult):</w:t>
-      </w:r>
-      <w:r>
-        <w:t xml:space="preserve"> </w:t>
-      </w:r>
-      <w:hyperlink r:id="rId53">
+        <w:t xml:space="preserve">- Cabinet Report, 5 December 2024 (decision to consult):</w:t>
+      </w:r>
+      <w:r>
+        <w:t xml:space="preserve"> </w:t>
+      </w:r>
+      <w:hyperlink r:id="rId48">
         <w:r>
           <w:rPr>
             <w:rStyle w:val="Hyperlink"/>
@@ -13039,12 +13325,12 @@
         <w:t xml:space="preserve"> </w:t>
       </w:r>
       <w:r>
-        <w:t xml:space="preserve">— Full Council Report, 27 February 2025 (determination):</w:t>
-      </w:r>
-      <w:r>
-        <w:t xml:space="preserve"> </w:t>
-      </w:r>
-      <w:hyperlink r:id="rId54">
+        <w:t xml:space="preserve">- Full Council Report, 27 February 2025 (determination):</w:t>
+      </w:r>
+      <w:r>
+        <w:t xml:space="preserve"> </w:t>
+      </w:r>
+      <w:hyperlink r:id="rId49">
         <w:r>
           <w:rPr>
             <w:rStyle w:val="Hyperlink"/>
@@ -13057,7 +13343,7 @@
       </w:r>
     </w:p>
   </w:footnote>
-  <w:footnote w:id="91">
+  <w:footnote w:id="85">
     <w:p>
       <w:pPr>
         <w:pStyle w:val="FootnoteText"/>
@@ -13082,7 +13368,7 @@
           <w:i/>
           <w:iCs/>
         </w:rPr>
-        <w:t xml:space="preserve">School Admission Arrangements 2026/27 — Appendix 9: Transport Implications and Considerations</w:t>
+        <w:t xml:space="preserve">School Admission Arrangements 2026/27 - Appendix 9: Transport Implications and Considerations</w:t>
       </w:r>
       <w:r>
         <w:t xml:space="preserve">. Cabinet papers accompanying the secondary school admissions consultation, available via the consultation portal:</w:t>
@@ -13090,7 +13376,7 @@
       <w:r>
         <w:t xml:space="preserve"> </w:t>
       </w:r>
-      <w:hyperlink r:id="rId56">
+      <w:hyperlink r:id="rId51">
         <w:r>
           <w:rPr>
             <w:rStyle w:val="Hyperlink"/>
@@ -13103,7 +13389,7 @@
       </w:r>
     </w:p>
   </w:footnote>
-  <w:footnote w:id="94">
+  <w:footnote w:id="88">
     <w:p>
       <w:pPr>
         <w:pStyle w:val="FootnoteText"/>
@@ -13117,7 +13403,7 @@
       <w:r>
         <w:t xml:space="preserve"> </w:t>
       </w:r>
-      <w:hyperlink r:id="rId95">
+      <w:hyperlink r:id="rId89">
         <w:r>
           <w:rPr>
             <w:rStyle w:val="Hyperlink"/>
@@ -13127,7 +13413,7 @@
       </w:hyperlink>
     </w:p>
   </w:footnote>
-  <w:footnote w:id="97">
+  <w:footnote w:id="91">
     <w:p>
       <w:pPr>
         <w:pStyle w:val="FootnoteText"/>
@@ -13158,12 +13444,12 @@
         <w:t xml:space="preserve"> </w:t>
       </w:r>
       <w:r>
-        <w:t xml:space="preserve">— Cabinet Report, 5 December 2024 (decision to consult):</w:t>
-      </w:r>
-      <w:r>
-        <w:t xml:space="preserve"> </w:t>
-      </w:r>
-      <w:hyperlink r:id="rId53">
+        <w:t xml:space="preserve">- Cabinet Report, 5 December 2024 (decision to consult):</w:t>
+      </w:r>
+      <w:r>
+        <w:t xml:space="preserve"> </w:t>
+      </w:r>
+      <w:hyperlink r:id="rId48">
         <w:r>
           <w:rPr>
             <w:rStyle w:val="Hyperlink"/>
@@ -13188,12 +13474,12 @@
         <w:t xml:space="preserve"> </w:t>
       </w:r>
       <w:r>
-        <w:t xml:space="preserve">— Full Council Report, 27 February 2025 (determination):</w:t>
-      </w:r>
-      <w:r>
-        <w:t xml:space="preserve"> </w:t>
-      </w:r>
-      <w:hyperlink r:id="rId54">
+        <w:t xml:space="preserve">- Full Council Report, 27 February 2025 (determination):</w:t>
+      </w:r>
+      <w:r>
+        <w:t xml:space="preserve"> </w:t>
+      </w:r>
+      <w:hyperlink r:id="rId49">
         <w:r>
           <w:rPr>
             <w:rStyle w:val="Hyperlink"/>
@@ -13206,7 +13492,7 @@
       </w:r>
     </w:p>
   </w:footnote>
-  <w:footnote w:id="100">
+  <w:footnote w:id="94">
     <w:p>
       <w:pPr>
         <w:pStyle w:val="FootnoteText"/>
@@ -13226,7 +13512,7 @@
       <w:r>
         <w:t xml:space="preserve"> </w:t>
       </w:r>
-      <w:hyperlink r:id="rId101">
+      <w:hyperlink r:id="rId95">
         <w:r>
           <w:rPr>
             <w:rStyle w:val="Hyperlink"/>

</xml_diff>

<commit_message>
Re-render RPE_Paper after manual edits
Picks up section-symbol replacements (§ -> "section") for cleaner Word
rendering, and a "We should reiterate that" addition in the attendance
lever discussion. PDF and DOCX regenerated to match.

Co-Authored-By: Claude Opus 5 <noreply@anthropic.com>
</commit_message>
<xml_diff>
--- a/RPE_Paper.docx
+++ b/RPE_Paper.docx
@@ -532,7 +532,7 @@
         <w:t xml:space="preserve">(Houtepen et al. 2020; Rakesh et al. 2025)</w:t>
       </w:r>
       <w:r>
-        <w:t xml:space="preserve">. The steep, largely exogenous rise in absence since the pandemic underlines how much of the recent problem sits outside any individual school’s control. This distinction - between the intake-driven component of absence and the smaller portion a school can itself move - is central to how absence should be interpreted as a policy lever, and we make it explicit in our modelling in §5.5. It also implies that authority-wide improvement is unlikely to come from school-led practice-sharing alone, and more probably requires cross-departmental action spanning health, children’s services and family support alongside schools.</w:t>
+        <w:t xml:space="preserve">. The steep, largely exogenous rise in absence since the pandemic underlines how much of the recent problem sits outside any individual school’s control. This distinction - between the intake-driven component of absence and the smaller portion a school can itself move - is central to how absence should be interpreted as a policy lever, and we make it explicit in our modelling in section 5.5. It also implies that authority-wide improvement is unlikely to come from school-led practice-sharing alone, and more probably requires cross-departmental action spanning health, children’s services and family support alongside schools.</w:t>
       </w:r>
     </w:p>
     <w:bookmarkEnd w:id="26"/>
@@ -4394,7 +4394,7 @@
         <w:pStyle w:val="BodyText"/>
       </w:pPr>
       <w:r>
-        <w:t xml:space="preserve">A crucial feature of these models is that the log-transformed variables encode non-linear relationships. The same percentage-point change produces different effects depending on where a school starts. For concentrations of disadvantage, the relationship between FSM and attainment flattens above about 20% FSM - further increases in disadvantage do not correlate with noticeable further declines. Most of the strong effect appears below 15%, where further reductions are correlated with much steeper attainment increases. This non-linearity has direct policy consequences: individual LEAs need to consider carefully where each school sits on the distribution to appreciate what changes might realistically achieve. We make the practical magnitude concrete in §5.3 (</w:t>
+        <w:t xml:space="preserve">A crucial feature of these models is that the log-transformed variables encode non-linear relationships. The same percentage-point change produces different effects depending on where a school starts. For concentrations of disadvantage, the relationship between FSM and attainment flattens above about 20% FSM - further increases in disadvantage do not correlate with noticeable further declines. Most of the strong effect appears below 15%, where further reductions are correlated with much steeper attainment increases. This non-linearity has direct policy consequences: individual LEAs need to consider carefully where each school sits on the distribution to appreciate what changes might realistically achieve. We make the practical magnitude concrete in section 5.3 (</w:t>
       </w:r>
       <w:hyperlink w:anchor="fig-accelerating-returns">
         <w:r>
@@ -5578,7 +5578,7 @@
         <w:t xml:space="preserve"> </w:t>
       </w:r>
       <w:r>
-        <w:t xml:space="preserve">It is not a reason to discount the schools’ underlying effectiveness; it is a reason to treat attendance as the single most valuable lever available to the city, a point we develop in §5.5 and quantify through the accelerating-returns analysis below. (For all pupils the city’s advantage is more robust to this choice, remaining significantly positive without an absence control at 46th; it is specifically the disadvantaged-pupil result that rests on it.)</w:t>
+        <w:t xml:space="preserve">It is not a reason to discount the schools’ underlying effectiveness; it is a reason to treat attendance as the single most valuable lever available to the city, a point we develop in section 5.5 and quantify through the accelerating-returns analysis below. (For all pupils the city’s advantage is more robust to this choice, remaining significantly positive without an absence control at 46th; it is specifically the disadvantaged-pupil result that rests on it.)</w:t>
       </w:r>
     </w:p>
     <w:p>
@@ -5602,7 +5602,7 @@
         <w:t xml:space="preserve"> </w:t>
       </w:r>
       <w:r>
-        <w:t xml:space="preserve">the national average (27.1%). When we model expected absence from intake alone (§5.5), the city’s schools should record about 8.8% absence; they actually record 10.8%. Almost two percentage points of absence sit above what the intake predicts. Second, the problem has not been improving. Between 2021–22 and 2024–25, absence fell in 94% of English local authorities - the national mean dropping by 0.88 percentage points as attendance recovered from the pandemic - while Brighton and Hove’s barely moved (-0.03 points), leaving it 143th of 152 authorities for improvement. The city did not become an outlier because its absence rose; it became an outlier because, almost alone, its absence did not fall.</w:t>
+        <w:t xml:space="preserve">the national average (27.1%). When we model expected absence from intake alone (section 5.5), the city’s schools should record about 8.8% absence; they actually record 10.8%. Almost two percentage points of absence sit above what the intake predicts. Second, the problem has not been improving. Between 2021–22 and 2024–25, absence fell in 94% of English local authorities - the national mean dropping by 0.88 percentage points as attendance recovered from the pandemic - while Brighton and Hove’s barely moved (-0.03 points), leaving it 143th of 152 authorities for improvement. The city did not become an outlier because its absence rose; it became an outlier because, almost alone, its absence did not fall.</w:t>
       </w:r>
     </w:p>
     <w:bookmarkEnd w:id="64"/>
@@ -6580,7 +6580,7 @@
         <w:pStyle w:val="BodyText"/>
       </w:pPr>
       <w:r>
-        <w:t xml:space="preserve">Brighton and Hove’s absence rates are not a necessary consequence of its intake. The city has near-average FSM eligibility but near-worst absence, suggesting the problem reflects local factors - attendance culture, enforcement practices, transport friction or community dynamics - rather than being an unavoidable correlate of disadvantage. If the city is not already running a substantial cross-departmental attendance programme alongside its school-level work, the case for one is strong. There is a budget question too: the £606,000 already spent annually on supported bus routes and passes</w:t>
+        <w:t xml:space="preserve">We should reiterate that Brighton and Hove’s absence rates are not a necessary consequence of its intake. The city has near-average FSM eligibility but near-worst absence, suggesting the problem reflects local factors - attendance culture, enforcement practices, transport friction or community dynamics - rather than being an unavoidable correlate of disadvantage. If the city is not already running a substantial cross-departmental attendance programme alongside its school-level work, the case for one is strong. There is a budget question too: the £606,000 already spent annually on supported bus routes and passes</w:t>
       </w:r>
       <w:r>
         <w:rPr>
@@ -8817,7 +8817,7 @@
         <w:pStyle w:val="FirstParagraph"/>
       </w:pPr>
       <w:r>
-        <w:t xml:space="preserve">The LEA random effect for Brighton and Hove is positive and, in the main model, statistically significant across all three attainment groups. As §5.2 set out, however, this result is conditional on how the model treats absence, and the city’s attendance is so extreme that the conditioning does most of the work. Controlling for absence, the city’s schools rank 7th of 151 for disadvantaged attainment; without that control they rank 46th and are statistically ordinary. We take neither number as the whole truth. Together they say something more useful than either alone: Brighton and Hove’s schools appear to be genuinely effective for the pupils who attend them, and the city’s attendance problem is large enough to erase that advantage in the aggregate.</w:t>
+        <w:t xml:space="preserve">The LEA random effect for Brighton and Hove is positive and, in the main model, statistically significant across all three attainment groups. As section 5.2 set out, however, this result is conditional on how the model treats absence, and the city’s attendance is so extreme that the conditioning does most of the work. Controlling for absence, the city’s schools rank 7th of 151 for disadvantaged attainment; without that control they rank 46th and are statistically ordinary. We take neither number as the whole truth. Together they say something more useful than either alone: Brighton and Hove’s schools appear to be genuinely effective for the pupils who attend them, and the city’s attendance problem is large enough to erase that advantage in the aggregate.</w:t>
       </w:r>
     </w:p>
     <w:p>
@@ -8833,7 +8833,7 @@
         <w:pStyle w:val="BodyText"/>
       </w:pPr>
       <w:r>
-        <w:t xml:space="preserve">This reframes what the 2024 consultation got right and what it got wrong. The council was not wrong that Brighton and Hove has a problem: unconditionally, its disadvantaged pupils do no better than the national average, and the raw attainment gap that motivated the consultation is real. What the consultation got wrong was the diagnosis. Presented with an attainment gap, it reached for the social composition of schools - one of the weakest levers our modelling identifies, and for disadvantaged pupils a lever that may point the wrong way (§4.3, §5.3) - while the factor that actually separates the city’s conditional standing from its unconditional standing, attendance, was absent from the consultation entirely. The more accurate account is not that a high-performing city was mistaken for a failing one, but that a city with one specific, severe, addressable problem was prescribed a treatment for a different problem it did not have.</w:t>
+        <w:t xml:space="preserve">This reframes what the 2024 consultation got right and what it got wrong. The council was not wrong that Brighton and Hove has a problem: unconditionally, its disadvantaged pupils do no better than the national average, and the raw attainment gap that motivated the consultation is real. What the consultation got wrong was the diagnosis. Presented with an attainment gap, it reached for the social composition of schools - one of the weakest levers our modelling identifies, and for disadvantaged pupils a lever that may point the wrong way (section 4.3, section 5.3) - while the factor that actually separates the city’s conditional standing from its unconditional standing, attendance, was absent from the consultation entirely. The more accurate account is not that a high-performing city was mistaken for a failing one, but that a city with one specific, severe, addressable problem was prescribed a treatment for a different problem it did not have.</w:t>
       </w:r>
     </w:p>
     <w:p>

</xml_diff>